<commit_message>
Submission-ready: renumber Fig S20, add package check, update abstract, remove superseded drafts and scripts
</commit_message>
<xml_diff>
--- a/manuscript/Manuscript.docx
+++ b/manuscript/Manuscript.docx
@@ -108,7 +108,7 @@
         <w:t xml:space="preserve">Zymoseptoria tritici</w:t>
       </w:r>
       <w:r>
-        <w:t xml:space="preserve">. Across seven temperatures and a full dose range, prothioconazole imposed an energetically costly stress state rather than simply arresting growth: it suppressed growth while increasing biomass-specific respiration, reducing estimated carbon-use efficiency by roughly two-thirds. The temperature–fungicide interaction reversed across the thermal optimum, shifting from synergy below it to antagonism above it, with EC₅₀ increasing an estimated ~4.5-fold from 15 to 27 °C. Transcriptomics provided a molecular basis for this pattern: the fungicide remodelled approximately 2,000 genes at cool and near-optimal temperatures, repressing ribosomal and respiratory-chain genes while strongly inducing the non-phosphorylating alternative oxidase (AOX), but this response contracted nearly ten-fold at 27 °C, where heat alone had already engaged many of the same programmes. To ask whether AOX contributes to performance rather than merely marking the stress state, we inhibited it pharmacologically with salicylhydroxamic acid across a dose series at 15 and 27 °C. Growth was unaffected at 15 °C but fell steeply with dose at 27 °C, a difference between temperatures of −0.024 h⁻¹ per tenfold increase in inhibitor concentration (Welch’s t on culture-level slopes, P = 0.020), indicating that the alternative respiratory route carries a measurable share of growth specifically under supra-optimal heat. Together, these results identify thermal physiology as a determinant of fungicide potency and support incorporating temperature dependence into fungicide sensitivity testing and disease-control models as cropping environments become warmer and more thermally variable.</w:t>
+        <w:t xml:space="preserve">. Across seven temperatures and a full dose range, prothioconazole imposed an energetically costly stress state rather than simply arresting growth: it suppressed growth while increasing biomass-specific respiration, reducing estimated carbon-use efficiency by roughly two-thirds. The temperature–fungicide interaction reversed across the thermal optimum, shifting from synergy below it to antagonism above it, with EC₅₀ increasing at least ~4.5-fold from 15 to 27 °C. Transcriptomics provided a molecular basis for this pattern: the fungicide remodelled approximately 2,000 genes at cool and near-optimal temperatures, repressing ribosomal and respiratory-chain genes while strongly inducing the non-phosphorylating alternative oxidase (AOX), but this response contracted nearly ten-fold at 27 °C, where heat alone had already engaged many of the same programmes. To ask whether AOX contributes to performance rather than merely marking the stress state, we inhibited it pharmacologically with salicylhydroxamic acid across a dose series at 15 and 27 °C. Growth was unaffected at 15 °C but fell steeply with dose at 27 °C, a difference between temperatures of −0.017 h⁻¹ per tenfold increase in inhibitor concentration (Welch’s t on culture-level slopes, P = 0.009), indicating that the alternative respiratory route carries a measurable share of growth specifically under supra-optimal heat. Blocking it alongside the fungicide then restored the drug’s effect where heat had removed it: prothioconazole inhibited growth by 14% at 27 °C on its own and by 66% on a SHAM background, against 56% and 60% at 15 °C, so the two agents acted independently when cool and strongly together when warm. Together, these results identify thermal physiology as a determinant of fungicide potency and support incorporating temperature dependence into fungicide sensitivity testing and disease-control models as cropping environments become warmer and more thermally variable.</w:t>
       </w:r>
     </w:p>
     <w:bookmarkStart w:id="9" w:name="introduction"/>
@@ -795,7 +795,7 @@
         <w:t xml:space="preserve">Z. tritici</w:t>
       </w:r>
       <w:r>
-        <w:t xml:space="preserve">. We measured biomass-specific growth, respiration and CUE across seven temperatures spanning the species’ thermal niche and eight fungicide doses, fitted the resulting thermal performance and dose-response surfaces within a Bayesian framework, and tested the combined action of the two stressors against Bliss independence. We profiled the transcriptome across the temperature by fungicide factorial to identify the molecular strategies underlying the physiological responses. Finally, we tested the contribution of the alternative oxidase directly, by inhibiting it pharmacologically across a dose series at a cool and a supra-optimal temperature. We show that prothioconazole potency is strongly temperature-dependent and that the interaction reverses across the thermal optimum, from synergy in the cool range to antagonism under supra-optimal heat. We show that the transcriptional response to the drug converges on the response to warming itself and is strongly attenuated where heat has already engaged the same programmes. Finally, we show that blocking the alternative oxidase costs the fungus growth at supra-optimal temperature but not in the cool range, identifying respiratory rerouting as a functional component of the heat-engaged state and not only a transcriptional marker of it. Together these results argue that chemical control of crop disease cannot be understood, or optimised, independently of the thermal physiology of its target.</w:t>
+        <w:t xml:space="preserve">. We measured biomass-specific growth, respiration and CUE across seven temperatures spanning the species’ thermal niche and eight fungicide doses, fitted the resulting thermal performance and dose-response surfaces within a Bayesian framework, and tested the combined action of the two stressors against Bliss independence. We profiled the transcriptome across the temperature by fungicide factorial to identify the molecular strategies underlying the physiological responses. Finally, we tested the contribution of the alternative oxidase directly, by inhibiting it pharmacologically across a dose series at a cool and a supra-optimal temperature. We show that prothioconazole potency is strongly temperature-dependent and that the interaction reverses across the thermal optimum, from synergy in the cool range to antagonism under supra-optimal heat. We show that the transcriptional response to the drug converges on the response to warming itself and is strongly attenuated where heat has already engaged the same programmes. Finally, we show that blocking the alternative oxidase costs the fungus growth at supra-optimal temperature but not in the cool range, identifying respiratory rerouting as a functional component of the heat-engaged state and not only a transcriptional marker of it, and that blocking it alongside the fungicide restores the drug’s effect at the temperature where it had been lost. Together these results argue that chemical control of crop disease cannot be understood, or optimised, independently of the thermal physiology of its target.</w:t>
       </w:r>
     </w:p>
     <w:bookmarkEnd w:id="9"/>
@@ -853,7 +853,7 @@
       <w:r>
         <w:drawing>
           <wp:inline>
-            <wp:extent cx="5334000" cy="7049665"/>
+            <wp:extent cx="5334000" cy="7053997"/>
             <wp:effectExtent b="0" l="0" r="0" t="0"/>
             <wp:docPr descr="" title="" id="11" name="Picture"/>
             <a:graphic>
@@ -874,7 +874,7 @@
                   <pic:spPr bwMode="auto">
                     <a:xfrm>
                       <a:off x="0" y="0"/>
-                      <a:ext cx="5334000" cy="7049665"/>
+                      <a:ext cx="5334000" cy="7053997"/>
                     </a:xfrm>
                     <a:prstGeom prst="rect">
                       <a:avLst/>
@@ -949,7 +949,7 @@
         <w:pStyle w:val="FirstParagraph"/>
       </w:pPr>
       <w:r>
-        <w:t xml:space="preserve">Hill dose–response modelling revealed that fungicide potency depends strongly on temperature (Fig. 2A,B; per-temperature fits in Fig. S3; model-form sensitivity in Methods). The half-maximal effective concentration (EC₅₀) for growth was lowest, i.e. the fungus was most sensitive, at 15 °C (1.12 mg L⁻¹, pEC₅₀ = 5.49) and highest at 27 °C (5.00 mg L⁻¹, pEC₅₀ = 4.82; this fitted value lies beyond the maximum tested dose of 4 mg L⁻¹ and is therefore an extrapolation — the posterior probability that the true EC₅₀ exceeds the tested range is 0.84 at 27 °C (95% CrI 3.2–11.2 mg L⁻¹), against 0.32 at 18 °C; Fig. S9B), an estimated ~4.5-fold loss of potency at supra-optimal temperature. At 18 and 27 °C the tested concentrations did not reduce growth below half the dose-zero control (minimum relative growth 0.53 at both), so the EC₅₀ estimates at these two temperatures are extrapolations of the Hill form rather than interpolations of the measured range, and their credible intervals are correspondingly wide. Respiration responded to dose in the opposite direction, increasing log-linearly with concentration; the effect was largest at the 24 °C optimum (+27.9% per mg L⁻¹, 95% CrI 15.4–42.4; the largest of the seven temperatures in 86% of posterior draws), and the 95% credible interval excluded zero at 15, 21 and 24 °C only (Fig. 2C; per-temperature fits with data in Fig. S3).</w:t>
+        <w:t xml:space="preserve">Hill dose–response modelling revealed that fungicide potency depends strongly on temperature (Fig. 2A,B; per-temperature fits in Fig. S3; model-form sensitivity in Methods). The half-maximal effective concentration (EC₅₀) for growth was lowest, i.e. the fungus was most sensitive, at 15 °C (1.12 mg L⁻¹, pEC₅₀ = 5.49) and highest at 27 °C (5.00 mg L⁻¹, pEC₅₀ = 4.82; this fitted value lies beyond the maximum tested dose of 4 mg L⁻¹ and is therefore an extrapolation — the posterior probability that the true EC₅₀ exceeds the tested range is 0.84 at 27 °C (95% CrI 3.2–11.2 mg L⁻¹), against 0.32 at 18 °C; Fig. S9B), an estimated ~4.5-fold loss of potency at supra-optimal temperature. At 18 and 27 °C the tested concentrations did not reduce growth below half the dose-zero control (minimum relative growth 0.53 at both), so the EC₅₀ estimates at these two temperatures are extrapolations of the Hill form rather than interpolations of the measured range, and their credible intervals are correspondingly wide. At 27 °C the constraint is tighter still: every dose below 4 mg L⁻¹ left relative growth between 0.80 and 0.96, so the fitted curve is set almost entirely by the 4 mg L⁻¹ point, which comes from two vials. The factorial experiment reported below measured the same nominal concentration at this temperature in nine wells across three cultures and obtained a higher value, so the potency loss at 27 °C is more safely read as a lower bound than as the fitted 4.5-fold. Respiration responded to dose in the opposite direction, increasing log-linearly with concentration; the effect was largest at the 24 °C optimum (+27.9% per mg L⁻¹, 95% CrI 15.4–42.4; the largest of the seven temperatures in 86% of posterior draws), and the 95% credible interval excluded zero at 15, 21 and 24 °C only (Fig. 2C; per-temperature fits with data in Fig. S3).</w:t>
       </w:r>
     </w:p>
     <w:p>
@@ -1090,7 +1090,7 @@
       <w:r>
         <w:drawing>
           <wp:inline>
-            <wp:extent cx="5334000" cy="6076994"/>
+            <wp:extent cx="5334000" cy="6075205"/>
             <wp:effectExtent b="0" l="0" r="0" t="0"/>
             <wp:docPr descr="" title="" id="15" name="Picture"/>
             <a:graphic>
@@ -1111,7 +1111,7 @@
                   <pic:spPr bwMode="auto">
                     <a:xfrm>
                       <a:off x="0" y="0"/>
-                      <a:ext cx="5334000" cy="6076994"/>
+                      <a:ext cx="5334000" cy="6075205"/>
                     </a:xfrm>
                     <a:prstGeom prst="rect">
                       <a:avLst/>
@@ -1457,13 +1457,13 @@
       </w:r>
     </w:p>
     <w:bookmarkEnd w:id="30"/>
-    <w:bookmarkStart w:id="34" w:name="X89b84545219c53f7d93b6f1a2180554124d887c"/>
+    <w:bookmarkStart w:id="34" w:name="X82cdd7aee10b3b68e9a495cefb5864c420c0e89"/>
     <w:p>
       <w:pPr>
         <w:pStyle w:val="Heading2"/>
       </w:pPr>
       <w:r>
-        <w:t xml:space="preserve">Inhibiting the alternative oxidase suppresses growth at supra-optimal but not at cool temperature</w:t>
+        <w:t xml:space="preserve">Inhibiting the alternative oxidase suppresses growth at supra-optimal temperature and restores fungicide efficacy there</w:t>
       </w:r>
     </w:p>
     <w:p>
@@ -1471,7 +1471,7 @@
         <w:pStyle w:val="FirstParagraph"/>
       </w:pPr>
       <w:r>
-        <w:t xml:space="preserve">The transcriptional data identify AOX as a marker of the low-CUE state, but they cannot say whether the enzyme contributes to performance or merely accompanies it. If AOX carries an appreciable share of respiratory electron flow specifically at supra-optimal temperature, then removing that branch should cost the cell growth at 27 °C and little or nothing at 15 °C. SHAM is not selective for the alternative oxidase, so this is a test of the prediction rather than of AOX alone; we return to that below. We tested this directly with salicylhydroxamic acid (SHAM), the standard pharmacological inhibitor of alternative oxidase, applied as a five-point dose series (0.0125–0.2 mM) to three independent cultures at each of 15 and 27 °C, with growth rates estimated from dissolved oxygen using the same model and fitting procedure as throughout (Fig. 6A; Methods).</w:t>
+        <w:t xml:space="preserve">The transcriptional data identify AOX as a marker of the low-CUE state, but they cannot say whether the enzyme contributes to performance or merely accompanies it. If AOX carries an appreciable share of respiratory electron flow specifically at supra-optimal temperature, then removing that branch should cost the cell growth at 27 °C and little or nothing at 15 °C. SHAM is not selective for the alternative oxidase, so this is a test of the prediction rather than of AOX alone; we return to that below. We tested this directly with salicylhydroxamic acid (SHAM), the standard pharmacological inhibitor of alternative oxidase, applied as a five-point dose series (0.0125–0.2 mM) to three independent cultures at each of 15 and 27 °C, with growth rates estimated from dissolved oxygen using the same model and fitting procedure as throughout (Fig. 6a; Methods).</w:t>
       </w:r>
     </w:p>
     <w:p>
@@ -1479,7 +1479,7 @@
         <w:pStyle w:val="BodyText"/>
       </w:pPr>
       <w:r>
-        <w:t xml:space="preserve">The two temperatures responded in opposite directions (Fig. 6B). Within each culture we regressed growth rate on log₁₀ SHAM concentration and treated the three resulting slopes as replicates, so that the comparison is made at the level of the biological replicate rather than the well. At 15 °C the slope was slightly positive and not distinguishable from zero (mean +0.0043 h⁻¹ per tenfold increase in dose, n = 3 cultures, P = 0.077); no negative dose response was detected at 15 °C over the range tested. At 27 °C every culture declined, and steeply (mean −0.0195 h⁻¹ per tenfold, P = 0.041), with growth at the highest retained dose falling to roughly one third of the untreated rate. The difference between temperatures was −0.0238 h⁻¹ per tenfold, with a 95% confidence interval of −0.0396 to −0.0080 that excludes zero across its whole width (Welch’s t on the six culture-level slopes, P = 0.020; Fig. 6C). The unequal-variance test is required because the slope variance at 27 °C exceeded that at 15 °C by an order of magnitude. That excess variance is not a property of one plate: the solvent controls scatter far more at 27 °C than at 15 °C on the SHAM plate (coefficient of variation 37% against 1%) and independently on the n-propyl gallate plate (58% against 5%), so supra-optimal cultures are genuinely more variable between biological replicates.</w:t>
+        <w:t xml:space="preserve">The two temperatures responded in opposite directions (Fig. 6a). Within each culture we regressed growth rate on log₁₀ SHAM concentration and treated the three resulting slopes as replicates, so that the comparison is made at the level of the biological replicate rather than the well. At 15 °C the slope was slightly positive and not distinguishable from zero (mean +0.0038 h⁻¹ per tenfold increase in dose, n = 3 cultures, P = 0.14), and the concentrations tested produced no ordered response of any kind, so no dose dependence was detected at 15 °C over the range tested. At 27 °C every culture declined (mean −0.0132 h⁻¹ per tenfold, P = 0.037), with growth at the highest retained dose falling to about 60% of the untreated rate. The difference between temperatures was −0.0170 h⁻¹ per tenfold, with a 95% confidence interval of −0.0263 to −0.0077 that excludes zero across its whole width (Welch’s t on the six culture-level slopes, P = 0.009; Fig. 6b). The unequal-variance test is required because the slope variance at 27 °C exceeded that at 15 °C roughly threefold. That excess variance is not a property of one plate: the solvent controls scatter far more at 27 °C than at 15 °C on the SHAM plate (coefficient of variation 30% against 1%) and independently on the n-propyl gallate plate (58% against 5%), so supra-optimal cultures are genuinely more variable between biological replicates. Growth rate is estimated from the curvature of the oxygen decline, so a trace that is effectively linear carries no growth signal however well the model fits it; four curves, all at 27 °C and all at 0.1 mM or above, fall in that regime and are marked as open symbols in Fig. 6a.</w:t>
       </w:r>
     </w:p>
     <w:p>
@@ -1487,7 +1487,175 @@
         <w:pStyle w:val="BodyText"/>
       </w:pPr>
       <w:r>
-        <w:t xml:space="preserve">Because estimated rates depend on the interval of the oxygen trace over which the model is fitted, the analysis was repeated under seven alternative rules, four fixed absolute windows and three anchored to fixed fractions of each trace’s oxygen drawdown; the 27 °C slope was steeper than the 15 °C slope under every one of them, with the temperature difference ranging from −0.011 to −0.023 h⁻¹ per tenfold against −0.0238 for the hand-selected windows reported above (Fig. S12). The highest dose tested (0.35 mM) was excluded because at 27 °C two of three wells consumed too little oxygen for a rate to be identifiable at all; the exclusion is made on estimability grounds and is conservative, since those wells lie in the direction of the reported effect. A planned specificity check with a second, chemically unrelated alternative-oxidase inhibitor did not resolve the question. The complementary experiment with n-propyl gallate (nPG; maximum concentration 0.1 mM, set by the solubility of the ethanol master stock) yielded an imprecise temperature contrast in growth-rate dose-response slopes (27 °C minus 15 °C: +0.0009 h⁻¹ per tenfold concentration increase; 95% CI −0.0452 to +0.0470; two-sided Welch’s t test, P = 0.96), compatible with both zero and the estimated SHAM contrast and therefore inconclusive regarding temperature-dependent inhibitor sensitivity (Fig. S15). No consistent dose response was present at either temperature: the cultures disagreed in sign at both, and at each temperature the mean slope was set by a single divergent culture, excluding which leaves +0.00006 h⁻¹ per tenfold at 15 °C and +0.0031 at 27 °C. This contrasts with SHAM, where all three cultures declined at 27 °C and none did at 15 °C. Because target engagement was not measured for either compound, the two concentration ranges cannot be equated as degrees of AOX inhibition. Four features of the design bound the inference. The two temperatures were run as separate plates in dedicated incubators, so temperature is confounded with plate and run; dose is assigned to plate column, so a within-plate positional gradient would enter the dose axis, although the solvent controls argue against one, scattering as much when column is held fixed (nPG plate) as when it varies (SHAM plate). SHAM is not selective for the alternative oxidase. And no fungicide was present in either inhibitor experiment, so they speak to the contribution of the alternative route to growth under supra-optimal heat, not to its mediation of the drug–temperature interaction.</w:t>
+        <w:t xml:space="preserve">Because estimated rates depend on the interval of the oxygen trace over which the model is fitted, the analysis was repeated under seven alternative rules, four fixed absolute windows and three anchored to fixed fractions of each trace’s oxygen drawdown; the 27 °C slope was steeper than the 15 °C slope under every one of them, with the temperature difference ranging from −0.011 to −0.023 h⁻¹ per tenfold against −0.0170 for the hand-selected windows reported above (Fig. S12). The 27 °C plate also carries a periodic component of incubator origin that is common to every well (Fig. S16); the primary analysis removes it with a 12 h moving average on the 27 °C curves, and refitting the same intervals with no smoothing at all gives a temperature contrast of −0.0218 h⁻¹ per tenfold (P = 0.019) against −0.0185 with smoothing (P = 0.017), so the contrast is not a product of that noise and not a product of removing it either. The highest dose tested (0.35 mM) was excluded because at 27 °C all three wells consumed too little oxygen for a rate to be identifiable at all; the exclusion is made on estimability grounds and is conservative, since those wells lie in the direction of the reported effect. A planned specificity check with a second, chemically unrelated alternative-oxidase inhibitor did not resolve the question. The complementary experiment with n-propyl gallate (nPG; maximum concentration 0.1 mM, set by the solubility of the ethanol master stock) yielded an imprecise temperature contrast in growth-rate dose-response slopes (27 °C minus 15 °C: +0.0009 h⁻¹ per tenfold concentration increase; 95% CI −0.0452 to +0.0470; two-sided Welch’s t test, P = 0.96), compatible with both zero and the estimated SHAM contrast and therefore inconclusive regarding temperature-dependent inhibitor sensitivity (Fig. S15). No consistent dose response was present at either temperature: the cultures disagreed in sign at both, and at each temperature the mean slope was set by a single divergent culture, excluding which leaves +0.00006 h⁻¹ per tenfold at 15 °C and +0.0031 at 27 °C. This contrasts with SHAM, where all three cultures declined at 27 °C and none did at 15 °C. Because target engagement was not measured for either compound, the two concentration ranges cannot be equated as degrees of AOX inhibition. Four features of the design bound the inference. The two temperatures were run as separate plates in dedicated incubators, so temperature is confounded with plate and run; dose is assigned to plate column, so a within-plate positional gradient would enter the dose axis, although the solvent controls argue against one, scattering as much when column is held fixed (nPG plate) as when it varies (SHAM plate). SHAM is not selective for the alternative oxidase. And no fungicide was present in either inhibitor experiment, so they speak to the contribution of the alternative route to growth under supra-optimal heat, not to its mediation of the drug–temperature interaction.</w:t>
+      </w:r>
+    </w:p>
+    <w:p>
+      <w:pPr>
+        <w:pStyle w:val="BodyText"/>
+      </w:pPr>
+      <w:r>
+        <w:t xml:space="preserve">Neither inhibitor experiment contained the fungicide, so they establish a contribution of the alternative route to growth under heat rather than a role in the drug interaction itself. We therefore ran the two agents together. Three independent cultures were split between 15 and 27 °C on the same day, and each plate carried the vehicle, SHAM at 0.2 mM, prothioconazole at 2 and 4 mg L⁻¹, and the two combinations, with 0.4% DMSO and 0.2% ethanol throughout and two cell-free wells per plate. The two nominal fungicide concentrations produced indistinguishable inhibition at both temperatures, as expected once exposure saturates, so 2 mg L⁻¹ is reported as the primary arm and 4 mg L⁻¹ as a secondary one. The 4 mg L⁻¹ wells were in fact marginally less inhibited than the 2 mg L⁻¹ wells at both temperatures, and at 27 °C they left growth at 0.92 of the vehicle where the dose-response experiment estimated 0.53. That earlier estimate rests on two vials, the only cell in that design with fewer than three, and it is the sole point on the 27 °C dose-response curve at which measurable inhibition occurred, so it determines the shape of that curve. Both estimates are consistent with exposure saturating below 4 mg L⁻¹, and the EC₅₀ reported for 27 °C should be read as a lower bound on the loss of potency rather than as a point estimate. Because every quantity is referenced to the vehicle on the same plate, the comparison is insensitive to differences in absolute rate between culture batches.</w:t>
+      </w:r>
+    </w:p>
+    <w:p>
+      <w:pPr>
+        <w:pStyle w:val="BodyText"/>
+      </w:pPr>
+      <w:r>
+        <w:t xml:space="preserve">The single agents behaved as the earlier experiments predict. SHAM alone left growth at 0.90, 1.01 and 0.99 of the vehicle at 15 °C and reduced it to 0.70, 0.67 and 0.72 at 27 °C, reproducing the temperature selectivity of Fig. 6a on independent cultures. The drug-alone arms also reproduce the dose-response model out of sample: the Hill fits of Fig. 2 predict relative growth of 0.431 at 15 °C and 0.859 at 27 °C at 2 mg L⁻¹, and these independent cultures gave 0.437 and 0.865. The same model predicts 0.353 and 0.608 at 4 mg L⁻¹, which these cultures did not reproduce, for the reasons set out below.</w:t>
+      </w:r>
+    </w:p>
+    <w:p>
+      <w:pPr>
+        <w:pStyle w:val="BodyText"/>
+      </w:pPr>
+      <w:r>
+        <w:t xml:space="preserve">The clearest way to read the combination is as the effect of the fungicide measured against its own background, that is relative to the vehicle when it is given alone and relative to SHAM when it is given with SHAM. At 15 °C the drug inhibited growth by 56% alone and by 60% on a SHAM background, so blocking the alternative oxidase changed nothing. At 27 °C it inhibited by 14% alone and by 66% on a SHAM background. Blocking the alternative oxidase therefore restored the fungicide at 27 °C to an effect slightly larger than it achieves at 15 °C, where it works best. The same pattern holds at 4 mg L⁻¹, 51% against 59% at 15 °C and 8% against 68% at 27 °C. The combination is where the two temperatures part company (Fig. 6d,e). If the two agents acted independently on log growth rate, the combination should leave the product of the two single-agent fractions. At 15 °C that is what happened, with observed values of 0.35, 0.37 and 0.45 against predictions of 0.38, 0.47 and 0.42. At 27 °C the combination fell far below independence, to 0.24, 0.29 and 0.18 against predictions of 0.61, 0.63 and 0.57, so adding SHAM made the fungicide roughly two and a half times more inhibitory than independent action allows.</w:t>
+      </w:r>
+    </w:p>
+    <w:p>
+      <w:pPr>
+        <w:pStyle w:val="BodyText"/>
+      </w:pPr>
+      <w:r>
+        <w:t xml:space="preserve">Expressed as the interaction contrast</w:t>
+      </w:r>
+      <w:r>
+        <w:t xml:space="preserve"> </w:t>
+      </w:r>
+      <w:r>
+        <w:rPr>
+          <w:i/>
+          <w:iCs/>
+        </w:rPr>
+        <w:t xml:space="preserve">I</w:t>
+      </w:r>
+      <w:r>
+        <w:t xml:space="preserve"> </w:t>
+      </w:r>
+      <w:r>
+        <w:t xml:space="preserve">= log</w:t>
+      </w:r>
+      <w:r>
+        <w:t xml:space="preserve"> </w:t>
+      </w:r>
+      <w:r>
+        <w:rPr>
+          <w:i/>
+          <w:iCs/>
+        </w:rPr>
+        <w:t xml:space="preserve">r</w:t>
+      </w:r>
+      <w:r>
+        <w:t xml:space="preserve">(drug+SHAM) − log</w:t>
+      </w:r>
+      <w:r>
+        <w:t xml:space="preserve"> </w:t>
+      </w:r>
+      <w:r>
+        <w:rPr>
+          <w:i/>
+          <w:iCs/>
+        </w:rPr>
+        <w:t xml:space="preserve">r</w:t>
+      </w:r>
+      <w:r>
+        <w:t xml:space="preserve">(drug) − log</w:t>
+      </w:r>
+      <w:r>
+        <w:t xml:space="preserve"> </w:t>
+      </w:r>
+      <w:r>
+        <w:rPr>
+          <w:i/>
+          <w:iCs/>
+        </w:rPr>
+        <w:t xml:space="preserve">r</w:t>
+      </w:r>
+      <w:r>
+        <w:t xml:space="preserve">(SHAM) + log</w:t>
+      </w:r>
+      <w:r>
+        <w:t xml:space="preserve"> </w:t>
+      </w:r>
+      <w:r>
+        <w:rPr>
+          <w:i/>
+          <w:iCs/>
+        </w:rPr>
+        <w:t xml:space="preserve">r</w:t>
+      </w:r>
+      <w:r>
+        <w:t xml:space="preserve">(vehicle), which is zero under independent action and negative when SHAM potentiates the drug, the two temperatures separate completely (Fig. 6f). At 15 °C</w:t>
+      </w:r>
+      <w:r>
+        <w:t xml:space="preserve"> </w:t>
+      </w:r>
+      <w:r>
+        <w:rPr>
+          <w:i/>
+          <w:iCs/>
+        </w:rPr>
+        <w:t xml:space="preserve">I</w:t>
+      </w:r>
+      <w:r>
+        <w:t xml:space="preserve"> </w:t>
+      </w:r>
+      <w:r>
+        <w:t xml:space="preserve">was −0.08 (95% CI −0.48 to +0.31, P = 0.46), indistinguishable from independence. At 27 °C it was −0.96 (95% CI −1.46 to −0.47, P = 0.014). The paired within-culture difference</w:t>
+      </w:r>
+      <w:r>
+        <w:t xml:space="preserve"> </w:t>
+      </w:r>
+      <w:r>
+        <w:rPr>
+          <w:i/>
+          <w:iCs/>
+        </w:rPr>
+        <w:t xml:space="preserve">I</w:t>
+      </w:r>
+      <w:r>
+        <w:t xml:space="preserve">₂₇ −</w:t>
+      </w:r>
+      <w:r>
+        <w:t xml:space="preserve"> </w:t>
+      </w:r>
+      <w:r>
+        <w:rPr>
+          <w:i/>
+          <w:iCs/>
+        </w:rPr>
+        <w:t xml:space="preserve">I</w:t>
+      </w:r>
+      <w:r>
+        <w:t xml:space="preserve">₁₅ was −0.88 (95% CI −1.76 to 0.00, P = 0.050) at 2 mg L⁻¹ and −0.98 (P = 0.16) at 4 mg L⁻¹, with all three cultures negative at both concentrations. The contrast is constructed so that every term is measured on the same plate and the drug and drug-plus-SHAM wells occupy the same plate columns, so a plate-level offset or a positional gradient cancels. With three cultures the difference is estimated imprecisely, and its interval reaches zero at 2 mg L⁻¹; the direction, however, was the same in every culture and at both concentrations, and refitting all 132 curves under eleven alternative interval rules that make no reference to the result left the contrast negative under eight of them, including every rule whose intervals span 30 h or more (Fig. S19). Because the growth rate is identified from the curvature of the oxygen decline, and a moving average attenuates curvature most in the fastest wells, the denoising applied to the 27 °C traces could in principle generate a negative contrast on its own. It does not: holding the intervals fixed and varying the moving average from none to 12 h moves</w:t>
+      </w:r>
+      <w:r>
+        <w:t xml:space="preserve"> </w:t>
+      </w:r>
+      <w:r>
+        <w:rPr>
+          <w:i/>
+          <w:iCs/>
+        </w:rPr>
+        <w:t xml:space="preserve">I</w:t>
+      </w:r>
+      <w:r>
+        <w:t xml:space="preserve">₂₇ from −1.12 to −0.96, so the effect is largest when no smoothing is applied at all and the reported analysis is the most conservative of those tested, and applying the same 12 h average to the 15 °C traces leaves</w:t>
+      </w:r>
+      <w:r>
+        <w:t xml:space="preserve"> </w:t>
+      </w:r>
+      <w:r>
+        <w:rPr>
+          <w:i/>
+          <w:iCs/>
+        </w:rPr>
+        <w:t xml:space="preserve">I</w:t>
+      </w:r>
+      <w:r>
+        <w:t xml:space="preserve">₁₅ at −0.01 (P = 0.86; Fig. S20).</w:t>
       </w:r>
     </w:p>
     <w:p>
@@ -1497,7 +1665,7 @@
       <w:r>
         <w:drawing>
           <wp:inline>
-            <wp:extent cx="5334000" cy="3759200"/>
+            <wp:extent cx="5334000" cy="3220528"/>
             <wp:effectExtent b="0" l="0" r="0" t="0"/>
             <wp:docPr descr="" title="" id="32" name="Picture"/>
             <a:graphic>
@@ -1518,7 +1686,7 @@
                   <pic:spPr bwMode="auto">
                     <a:xfrm>
                       <a:off x="0" y="0"/>
-                      <a:ext cx="5334000" cy="3759200"/>
+                      <a:ext cx="5334000" cy="3220528"/>
                     </a:xfrm>
                     <a:prstGeom prst="rect">
                       <a:avLst/>
@@ -1546,13 +1714,261 @@
           <w:b/>
           <w:bCs/>
         </w:rPr>
-        <w:t xml:space="preserve">Figure 6. SHAM suppresses growth at supra-optimal but not at cool temperature.</w:t>
-      </w:r>
-      <w:r>
-        <w:t xml:space="preserve"> </w:t>
-      </w:r>
-      <w:r>
-        <w:t xml:space="preserve">(A) The pharmacological logic. The ubiquinone pool is oxidised either by the alternative oxidase, which is non-phosphorylating, or by the cytochrome route through complexes III and IV, which pumps protons and yields ATP; both branches reduce oxygen to water. SHAM inhibits the alternative branch, which the transcriptional and physiological data implicate as engaged at 27 °C; SHAM also inhibits peroxidases and lipoxygenases, so the schematic shows the hypothesis under test rather than an established route. (B) Growth rate against SHAM concentration at 15 °C (blue circles) and 27 °C (red triangles). Faint points are the three independent cultures and thin lines their within-culture regressions; symbols and bars are the mean ± s.d. across cultures and thick lines the mean of the three culture-level slopes. Dashed horizontal lines mark the solvent-control mean at each temperature, shown separately at left (ctrl). n = 3 cultures per dose per temperature. (C) The per-culture slope of growth rate on log₁₀ SHAM concentration at each temperature (faint points, individual cultures; symbol and bar, mean and 95% confidence interval; dashed line, no dose effect). The slope is not distinguishable from zero at 15 °C and is negative at 27 °C, a difference of −0.0238 h⁻¹ per tenfold (Welch’s t, P = 0.020). Robustness to the choice of fitting interval is in Fig. S12, the second inhibitor in Fig. S15, and per-curve fits with their selected intervals in Table S2.</w:t>
+        <w:t xml:space="preserve">Figure 6. The alternative oxidase mediates the temperature dependence of prothioconazole efficacy.</w:t>
+      </w:r>
+      <w:r>
+        <w:t xml:space="preserve"> </w:t>
+      </w:r>
+      <w:r>
+        <w:t xml:space="preserve">(</w:t>
+      </w:r>
+      <w:r>
+        <w:rPr>
+          <w:b/>
+          <w:bCs/>
+        </w:rPr>
+        <w:t xml:space="preserve">a</w:t>
+      </w:r>
+      <w:r>
+        <w:t xml:space="preserve">) Growth rate against SHAM concentration at 15 °C (blue circles) and 27 °C (red triangles), with the solvent controls shown separately at left (ctrl). Faint points are the three independent cultures and thin lines their within-culture regressions; symbols and bars are the mean ± s.d. across cultures and thick lines the mean of the three culture-level slopes. Dashed horizontal lines mark the solvent-control mean at each temperature. Open symbols mark concentrations at which the oxygen trace was indistinguishable from a straight line, so the growth rate is not identifiable there (the curved model improves on a linear fit by less than 0.005 in R²); these points are retained in all analyses but should not be read as precise. n = 3 cultures per concentration per temperature. (</w:t>
+      </w:r>
+      <w:r>
+        <w:rPr>
+          <w:b/>
+          <w:bCs/>
+        </w:rPr>
+        <w:t xml:space="preserve">b</w:t>
+      </w:r>
+      <w:r>
+        <w:t xml:space="preserve">) The per-culture slope of growth rate on log₁₀ SHAM concentration at each temperature (faint points, individual cultures; symbol and bar, mean and 95% confidence interval; dashed line, no dose effect). The slope is not distinguishable from zero at 15 °C and is negative at 27 °C, a difference of −0.0170 h⁻¹ per tenfold increase in concentration (Welch’s t on the six culture-level slopes, P = 0.009). (</w:t>
+      </w:r>
+      <w:r>
+        <w:rPr>
+          <w:b/>
+          <w:bCs/>
+        </w:rPr>
+        <w:t xml:space="preserve">c</w:t>
+      </w:r>
+      <w:r>
+        <w:t xml:space="preserve">) Initial oxygen-consumption rate with cytochrome oxidase blocked by 0.5 mM azide, with and without 1 mM SHAM. Small points are individual wells, large symbols the plate means of three independent plates, joined within plate; the grey band is the mean ± s.d. of the cell-free wells. SHAM returns azide-resistant respiration to the cell-free background (paired t on plate means, P = 0.012). (</w:t>
+      </w:r>
+      <w:r>
+        <w:rPr>
+          <w:b/>
+          <w:bCs/>
+        </w:rPr>
+        <w:t xml:space="preserve">d</w:t>
+      </w:r>
+      <w:r>
+        <w:t xml:space="preserve">) Growth relative to the vehicle at 15 °C for SHAM 0.2 mM, prothioconazole 2 mg L⁻¹ and their combination. Small symbols are the three independent cultures, large symbols and bars the mean ± s.d. The open diamond is the growth expected if the two agents acted independently, calculated from the two single agents measured on the same plate, and the arrow runs from that prediction to the observed mean. (</w:t>
+      </w:r>
+      <w:r>
+        <w:rPr>
+          <w:b/>
+          <w:bCs/>
+        </w:rPr>
+        <w:t xml:space="preserve">e</w:t>
+      </w:r>
+      <w:r>
+        <w:t xml:space="preserve">) As (</w:t>
+      </w:r>
+      <w:r>
+        <w:rPr>
+          <w:b/>
+          <w:bCs/>
+        </w:rPr>
+        <w:t xml:space="preserve">d</w:t>
+      </w:r>
+      <w:r>
+        <w:t xml:space="preserve">) at 27 °C. The combination falls far below independent action. (</w:t>
+      </w:r>
+      <w:r>
+        <w:rPr>
+          <w:b/>
+          <w:bCs/>
+        </w:rPr>
+        <w:t xml:space="preserve">f</w:t>
+      </w:r>
+      <w:r>
+        <w:t xml:space="preserve">) The interaction contrast</w:t>
+      </w:r>
+      <w:r>
+        <w:t xml:space="preserve"> </w:t>
+      </w:r>
+      <w:r>
+        <w:rPr>
+          <w:i/>
+          <w:iCs/>
+        </w:rPr>
+        <w:t xml:space="preserve">I</w:t>
+      </w:r>
+      <w:r>
+        <w:t xml:space="preserve"> </w:t>
+      </w:r>
+      <w:r>
+        <w:t xml:space="preserve">= log</w:t>
+      </w:r>
+      <w:r>
+        <w:t xml:space="preserve"> </w:t>
+      </w:r>
+      <w:r>
+        <w:rPr>
+          <w:i/>
+          <w:iCs/>
+        </w:rPr>
+        <w:t xml:space="preserve">r</w:t>
+      </w:r>
+      <w:r>
+        <w:t xml:space="preserve">(drug+SHAM) − log</w:t>
+      </w:r>
+      <w:r>
+        <w:t xml:space="preserve"> </w:t>
+      </w:r>
+      <w:r>
+        <w:rPr>
+          <w:i/>
+          <w:iCs/>
+        </w:rPr>
+        <w:t xml:space="preserve">r</w:t>
+      </w:r>
+      <w:r>
+        <w:t xml:space="preserve">(drug) − log</w:t>
+      </w:r>
+      <w:r>
+        <w:t xml:space="preserve"> </w:t>
+      </w:r>
+      <w:r>
+        <w:rPr>
+          <w:i/>
+          <w:iCs/>
+        </w:rPr>
+        <w:t xml:space="preserve">r</w:t>
+      </w:r>
+      <w:r>
+        <w:t xml:space="preserve">(SHAM) + log</w:t>
+      </w:r>
+      <w:r>
+        <w:t xml:space="preserve"> </w:t>
+      </w:r>
+      <w:r>
+        <w:rPr>
+          <w:i/>
+          <w:iCs/>
+        </w:rPr>
+        <w:t xml:space="preserve">r</w:t>
+      </w:r>
+      <w:r>
+        <w:t xml:space="preserve">(vehicle), paired within culture across the two temperatures.</w:t>
+      </w:r>
+      <w:r>
+        <w:t xml:space="preserve"> </w:t>
+      </w:r>
+      <w:r>
+        <w:rPr>
+          <w:i/>
+          <w:iCs/>
+        </w:rPr>
+        <w:t xml:space="preserve">I</w:t>
+      </w:r>
+      <w:r>
+        <w:t xml:space="preserve"> </w:t>
+      </w:r>
+      <w:r>
+        <w:t xml:space="preserve">= 0 is independent action and</w:t>
+      </w:r>
+      <w:r>
+        <w:t xml:space="preserve"> </w:t>
+      </w:r>
+      <w:r>
+        <w:rPr>
+          <w:i/>
+          <w:iCs/>
+        </w:rPr>
+        <w:t xml:space="preserve">I</w:t>
+      </w:r>
+      <w:r>
+        <w:t xml:space="preserve"> </w:t>
+      </w:r>
+      <w:r>
+        <w:t xml:space="preserve">&lt; 0 means SHAM potentiates the drug. Open symbols are the individual cultures, filled symbols and bars the mean and 95% confidence interval. Δ is the paired difference</w:t>
+      </w:r>
+      <w:r>
+        <w:t xml:space="preserve"> </w:t>
+      </w:r>
+      <w:r>
+        <w:rPr>
+          <w:i/>
+          <w:iCs/>
+        </w:rPr>
+        <w:t xml:space="preserve">I</w:t>
+      </w:r>
+      <w:r>
+        <w:t xml:space="preserve">₂₇ −</w:t>
+      </w:r>
+      <w:r>
+        <w:t xml:space="preserve"> </w:t>
+      </w:r>
+      <w:r>
+        <w:rPr>
+          <w:i/>
+          <w:iCs/>
+        </w:rPr>
+        <w:t xml:space="preserve">I</w:t>
+      </w:r>
+      <w:r>
+        <w:t xml:space="preserve">₁₅. Panels</w:t>
+      </w:r>
+      <w:r>
+        <w:t xml:space="preserve"> </w:t>
+      </w:r>
+      <w:r>
+        <w:rPr>
+          <w:b/>
+          <w:bCs/>
+        </w:rPr>
+        <w:t xml:space="preserve">a</w:t>
+      </w:r>
+      <w:r>
+        <w:t xml:space="preserve">–</w:t>
+      </w:r>
+      <w:r>
+        <w:rPr>
+          <w:b/>
+          <w:bCs/>
+        </w:rPr>
+        <w:t xml:space="preserve">c</w:t>
+      </w:r>
+      <w:r>
+        <w:t xml:space="preserve"> </w:t>
+      </w:r>
+      <w:r>
+        <w:t xml:space="preserve">come from the SHAM and azide inhibitor experiments and</w:t>
+      </w:r>
+      <w:r>
+        <w:t xml:space="preserve"> </w:t>
+      </w:r>
+      <w:r>
+        <w:rPr>
+          <w:b/>
+          <w:bCs/>
+        </w:rPr>
+        <w:t xml:space="preserve">d</w:t>
+      </w:r>
+      <w:r>
+        <w:t xml:space="preserve">–</w:t>
+      </w:r>
+      <w:r>
+        <w:rPr>
+          <w:b/>
+          <w:bCs/>
+        </w:rPr>
+        <w:t xml:space="preserve">f</w:t>
+      </w:r>
+      <w:r>
+        <w:t xml:space="preserve"> </w:t>
+      </w:r>
+      <w:r>
+        <w:t xml:space="preserve">from the prothioconazole × SHAM factorial; these are separate culture batches, so every quantity is expressed relative to the control or vehicle on its own plate and absolute rates are not compared between the two halves. Fitting intervals for every curve were set in the interactive trim-selection tool and are listed in tables/aox/sham/manual_fit_windows.csv and tables/aox/ptc_sham/manual_fit_windows.csv; robustness of the factorial result to the choice of interval is in Fig. S19 and of the SHAM result in Fig. S12. All traces are shown in Figs S16 (SHAM), S17 (azide) and S18 (factorial).</w:t>
       </w:r>
     </w:p>
     <w:bookmarkEnd w:id="34"/>
@@ -1659,7 +2075,7 @@
         <w:t xml:space="preserve">)</w:t>
       </w:r>
       <w:r>
-        <w:t xml:space="preserve">. Our results extend the relevance of AOX beyond respiratory-targeting fungicides by showing strong AOX induction during exposure to an azole that acts primarily on sterol biosynthesis. This induction could reconcile the otherwise paradoxical pairing of increased respiration with decreased growth and CUE: oxygen consumption can increase through a non-phosphorylating route without a corresponding increase in biomass production. Pharmacological inhibition puts this on a causal footing at one end of the thermal range. SHAM had no measurable effect on growth at 15 °C at any dose up to 0.2 mM, but suppressed growth steeply, and in every culture, at 27 °C: the temperature at which AOX transcript abundance is highest and the physiology least efficient. The reading we favour is that in the cool range the cytochrome route carries essentially all respiratory flux, so removing the alternative branch costs nothing, whereas at supra-optimal temperature an appreciable share of flux passes through AOX and its removal is paid for in growth. This is a functional result rather than a transcriptional correlation, and it is the one direct intervention in the study, but its limits are substantial. The SHAM response is consistent with an AOX contribution to growth at supra-optimal temperature, yet it does not establish AOX dependence, because SHAM also inhibits other enzymes including peroxidases and lipoxygenases; the complementary n-propyl gallate experiment was inconclusive at the precision achieved and did not resolve that specificity limitation. Temperature was confounded with plate and run, and neither inhibitor experiment contained prothioconazole, so together they do not establish that AOX mediates temperature-dependent azole antagonism. That both prothioconazole and heat induce AOX suggests that it forms part of a broader stress programme and may contribute to cross-protection, whereby prior exposure to one stress alters tolerance to another</w:t>
+        <w:t xml:space="preserve">. Our results extend the relevance of AOX beyond respiratory-targeting fungicides by showing strong AOX induction during exposure to an azole that acts primarily on sterol biosynthesis. This induction could reconcile the otherwise paradoxical pairing of increased respiration with decreased growth and CUE: oxygen consumption can increase through a non-phosphorylating route without a corresponding increase in biomass production. Pharmacological inhibition puts this on a causal footing at one end of the thermal range. SHAM had no measurable effect on growth at 15 °C at any dose up to 0.2 mM, but suppressed growth steeply, and in every culture, at 27 °C: the temperature at which AOX transcript abundance is highest and the physiology least efficient. The reading we favour is that in the cool range the cytochrome route carries essentially all respiratory flux, so removing the alternative branch costs nothing, whereas at supra-optimal temperature an appreciable share of flux passes through AOX and its removal is paid for in growth. This is a functional result rather than a transcriptional correlation, and it is the one direct intervention in the study, but its limits are substantial. The SHAM response is consistent with an AOX contribution to growth at supra-optimal temperature, yet it does not establish AOX dependence, because SHAM also inhibits other enzymes including peroxidases and lipoxygenases; the complementary n-propyl gallate experiment was inconclusive at the precision achieved and did not resolve that specificity limitation. Temperature was confounded with plate and run in both inhibitor dose-response experiments. That both prothioconazole and heat induce AOX suggests that it forms part of a broader stress programme and may contribute to cross-protection, whereby prior exposure to one stress alters tolerance to another</w:t>
       </w:r>
       <w:r>
         <w:t xml:space="preserve"> </w:t>
@@ -1679,7 +2095,7 @@
         <w:t xml:space="preserve">)</w:t>
       </w:r>
       <w:r>
-        <w:t xml:space="preserve">. A cell already shifted toward this state under heat stress may experience a smaller incremental metabolic impact when exposed to prothioconazole; the drug–warming overlap is, moreover, transcriptome-wide, with AOX itself contributing only ~0.1% of the shared-programme convergence signal (Methods), so AOX is best read as one functional component of a much broader shared response rather than its sole mediator. The decisive next experiment is the same inhibitor series run in the presence of prothioconazole across the thermal range: if AOX activity is what blunts the drug at 27 °C, then blocking it should restore potency there and leave it unchanged at 15 °C.</w:t>
+        <w:t xml:space="preserve">. A cell already shifted toward this state under heat stress may experience a smaller incremental metabolic impact when exposed to prothioconazole; the drug–warming overlap is, moreover, transcriptome-wide, with AOX itself contributing only ~0.1% of the shared-programme convergence signal (Methods), so AOX is best read as one functional component of a much broader shared response rather than its sole mediator. The factorial experiment was designed to test exactly that prediction: if AOX activity is what blunts the drug at 27 °C, then blocking it should restore potency there and leave it unchanged at 15 °C. That is what we observed. Adding SHAM to prothioconazole left growth where independent action predicts at 15 °C and drove it far below that prediction at 27 °C, in all three cultures and at both nominal concentrations, giving a within-culture difference in the interaction contrast of −0.88 at 2 mg L⁻¹. The interpretation we favour is that at supra-optimal temperature a share of respiratory flux runs through the alternative route, which the fungicide does not touch, and that removing that route reinstates the cost of the drug. Three qualifications stand. The specificity limit carries over from the dose-response experiments, because the intervention is again pharmacological and SHAM is not selective, although the azide result places SHAM’s action on the azide-resistant component of respiration rather than on respiration in general. With three cultures the contrast is imprecise and its confidence interval reaches zero. And the factorial used cultures carried for several generations from the same stock, which grew faster than those behind the dose-response and transcriptomic experiments, so absolute potency is not comparable across experiments even though the interaction, referenced to the vehicle on each plate, is unaffected by that difference. Independent replication of the temperature manipulation, and a genetic rather than pharmacological block on AOX, remain the tests that would settle the mechanism.</w:t>
       </w:r>
     </w:p>
     <w:p>
@@ -1761,7 +2177,7 @@
         <w:pStyle w:val="BodyText"/>
       </w:pPr>
       <w:r>
-        <w:t xml:space="preserve">What then explains the temperature dependence of potency itself? The measured CYP51-axis quantities do not: CYP51 and CPR transcript abundance, predicted CYP51 turnover and efflux-transporter expression all declined or remained flat with warming, individually and in combination predicting stable or increased, rather than decreased, potency (Supplementary sign audit). The loss of potency is therefore not a simple target-abundance or efflux phenomenon, and the transcriptional convergence documented in Figures 3–5 supplies the most parsimonious account available from these data: where heat has already repressed the growth and energy programmes on which the drug acts, less remains for the drug to repress. Consistent with this partition, the enhanced sensitivity at 15 °C and the antagonism at 27 °C fall at opposite ends of the same convergence gradient (Fig. 5B). Separating this from a temperature-dependent change in the catalytic safety margin around CYP51, or in intracellular drug exposure, will require direct measurement of sterol flux and of intracellular prothioconazole rather than inference from the dose–response surface.</w:t>
+        <w:t xml:space="preserve">What then explains the temperature dependence of potency itself? The measured CYP51-axis quantities do not: CYP51 and CPR transcript abundance and efflux-transporter expression all declined or remained flat with warming (Fig. 3, Fig. S4), individually and in combination predicting stable or increased, rather than decreased, potency. The loss of potency is therefore not a simple target-abundance or efflux phenomenon, and the transcriptional convergence documented in Figures 3–5 supplies the most parsimonious account available from these data: where heat has already repressed the growth and energy programmes on which the drug acts, less remains for the drug to repress. Consistent with this partition, the enhanced sensitivity at 15 °C and the antagonism at 27 °C fall at opposite ends of the same convergence gradient (Fig. 5B). Separating this from a temperature-dependent change in the catalytic safety margin around CYP51, or in intracellular drug exposure, will require direct measurement of sterol flux and of intracellular prothioconazole rather than inference from the dose–response surface.</w:t>
       </w:r>
     </w:p>
     <w:p>
@@ -1915,7 +2331,7 @@
         <w:pStyle w:val="FirstParagraph"/>
       </w:pPr>
       <w:r>
-        <w:t xml:space="preserve">Integrating physiology, transcriptomics and targeted respiratory inhibition provides a mechanistic framework linking cellular energy metabolism, thermal physiology and temperature-dependent fungicide action. Prothioconazole induces an energetically inefficient stress state, marked by induction of the alternative oxidase, that overlaps the cell’s own response to supra-optimal heat; where heat has already engaged much of that programme, the incremental response to the fungicide is strongly attenuated. Two links in this chain are supported quantitatively: expression of the alternative oxidase tracks the loss of carbon-use efficiency across conditions, and inhibiting the enzyme costs the fungus growth at supra-optimal temperature while costing it nothing in the cool range, so that route is functionally engaged where the interaction reverses. Together, these results show that fungicide potency depends on the thermal physiological state of the pathogen, and they support incorporating temperature dependence into sensitivity assays, dose models and resistance monitoring as cropping climates become warmer and more thermally variable.</w:t>
+        <w:t xml:space="preserve">Integrating physiology, transcriptomics and targeted respiratory inhibition provides a mechanistic framework linking cellular energy metabolism, thermal physiology and temperature-dependent fungicide action. Prothioconazole induces an energetically inefficient stress state, marked by induction of the alternative oxidase, that overlaps the cell’s own response to supra-optimal heat; where heat has already engaged much of that programme, the incremental response to the fungicide is strongly attenuated. Blocking that route pharmacologically alongside the fungicide restored its effect at supra-optimal temperature and left it unchanged in the cool range, which is the behaviour the mechanism predicts. Two links in this chain are supported quantitatively: expression of the alternative oxidase tracks the loss of carbon-use efficiency across conditions, and inhibiting the enzyme costs the fungus growth at supra-optimal temperature while costing it nothing in the cool range, so that route is functionally engaged where the interaction reverses. Together, these results show that fungicide potency depends on the thermal physiological state of the pathogen, and they support incorporating temperature dependence into sensitivity assays, dose models and resistance monitoring as cropping climates become warmer and more thermally variable.</w:t>
       </w:r>
     </w:p>
     <w:bookmarkEnd w:id="37"/>
@@ -5040,7 +5456,7 @@
         <w:pStyle w:val="BodyText"/>
       </w:pPr>
       <w:r>
-        <w:t xml:space="preserve">The contribution of the alternative oxidase to growth was tested pharmacologically with salicylhydroxamic acid (SHAM), prepared as a 250 mM master stock in absolute ethanol and diluted in ethanol to working stocks at 500× the intended final dose, so that 10 µL added to each 5 mL vial gave final concentrations of 0.0125, 0.025, 0.05, 0.1, 0.2 and 0.35 mM at a constant 0.2% (v/v) ethanol in every vial, solvent controls included. Three independent cultures were grown as described above, harvested in exponential phase, adjusted to a common starting density and dispensed into PreSens SensorDish vials; one plate was run per temperature (15 and 27 °C), with cultures assigned to rows and doses to columns. Dissolved oxygen was logged for 68.6 h and growth rates were estimated with the same oxygen-consumption model, fitting-interval selection and quality criteria used throughout. The 0.35 mM dose was excluded from analysis because at 27 °C two of the three wells consumed too little oxygen for the model to return an identifiable rate; this exclusion is made on estimability grounds and is conservative with respect to the contrast reported, since the excluded wells lie in the direction of the reported effect.</w:t>
+        <w:t xml:space="preserve">The contribution of the alternative oxidase to growth was tested pharmacologically with salicylhydroxamic acid (SHAM), prepared as a 250 mM master stock in absolute ethanol and diluted in ethanol to working stocks at 500× the intended final dose, so that 10 µL added to each 5 mL vial gave final concentrations of 0.0125, 0.025, 0.05, 0.1, 0.2 and 0.35 mM at a constant 0.2% (v/v) ethanol in every vial, solvent controls included. Three independent cultures were grown as described above, harvested in exponential phase, adjusted to a common starting density and dispensed into PreSens SensorDish vials; one plate was run per temperature (15 and 27 °C), with cultures assigned to rows and doses to columns. Dissolved oxygen was logged for 68.6 h and growth rates were estimated with the same oxygen-consumption model, fitting-interval selection and quality criteria used throughout. The 0.35 mM dose was excluded from analysis because at 27 °C all three wells consumed too little oxygen for the model to return an identifiable rate; this exclusion is made on estimability grounds and is conservative with respect to the contrast reported, since the excluded wells lie in the direction of the reported effect.</w:t>
       </w:r>
     </w:p>
     <w:p>
@@ -5048,7 +5464,15 @@
         <w:pStyle w:val="BodyText"/>
       </w:pPr>
       <w:r>
-        <w:t xml:space="preserve">Because dose varies within culture, the dose response was analysed at the level of the biological replicate. Within each culture the estimated growth rate was regressed on log₁₀ SHAM concentration across the five retained doses, and the three resulting slopes were treated as independent observations at each temperature; a one-sample t test against zero was used within each temperature, and the two temperatures were compared with Welch’s unequal-variance t test on the six culture-level slopes. The unequal-variance form is required because the variance of the slopes at 27 °C exceeded that at 15 °C by an order of magnitude. Sensitivity to the choice of fitting interval was assessed by repeating the whole analysis under seven alternative window rules: four fixed absolute windows and three anchored to fixed fractions of each trace’s oxygen drawdown (Fig. S12). A parallel plate set was run with n-propyl gallate (0.0125 to 0.1 mM in ethanol), an alternative-oxidase inhibitor of a different chemotype, over a dose range reaching only 0.1 mM; those traces have not been through the same manual fitting-interval selection and are not reported here. Two features of the design constrain interpretation and are carried into the Discussion: each temperature was run as a single plate in a dedicated incubator, so temperature is confounded with plate and run, and SHAM is not selective for the alternative oxidase.</w:t>
+        <w:t xml:space="preserve">The combined action of prothioconazole and SHAM was tested in a factorial experiment. Three independent cultures were grown as above and each was split between a 15 °C and a 27 °C SensorDish plate filled from the same cups on the same day. Every plate carried six conditions at fixed positions: vehicle (five vials), SHAM at 0.2 mM (five vials), prothioconazole at 2 and 4 mg L⁻¹ (three vials each) and the two combinations of SHAM with each fungicide concentration (three vials each), together with two cell-free vials, one with vehicle and one with SHAM, as contamination controls. Every vial contained 5.05 mL of medium, 0.4% (v/v) DMSO and 0.2% (v/v) ethanol, so the solvent load is identical across conditions. Plates were removed briefly at about 41 h for an interim export, which displaces the reading by a constant offset; that offset was measured per vial and subtracted. Growth rates were estimated with the same oxygen-consumption model and the same interactive interval selection used throughout, and the 27 °C traces were smoothed with a 12 h centred moving average before fitting, which is unbiased for the growth rate under this model. For each plate the condition means were expressed relative to the vehicle on that plate, and the interaction contrast was computed as I = log r(drug+SHAM) − log r(drug) − log r(SHAM) + log r(vehicle), which is zero when the two agents act independently on log growth rate. The primary statistic is the paired within-culture difference I(27 °C) − I(15 °C) at 2 mg L⁻¹, tested with a one-sample t test on the three culture-level differences; 4 mg L⁻¹ is reported as a secondary arm. The contrast is arranged so that the drug and drug-plus-SHAM vials occupy the same plate columns and the vehicle and SHAM vials span the same columns as each other, so a linear positional gradient cancels. Sensitivity to the choice of fitting interval was assessed by refitting all 132 curves under eleven alternative rules (Fig. S19). The two nominal fungicide concentrations produced indistinguishable inhibition, consistent with exposure saturating below 4 mg L⁻¹, so the two arms are reported as two measurements at one effective exposure rather than as a dose series. The cultures used here were carried for several generations from the same stock and grew faster than those in the dose-response and transcriptomic experiments, so absolute rates are not compared across experiments. Three of the conditions listed in the preregistration as grounds to stop and re-plan were met, and are reported here because that document is public. The vehicle wells at 27 °C grew at 0.059 to 0.072 h⁻¹ against the anticipated 0.038 to 0.045 h⁻¹, which reflects the faster cultures noted above and does not affect contrasts referenced to the vehicle on the same plate; the drug-alone arms nonetheless reproduced the dose-response model at 2 mg L⁻¹ at both temperatures, indicating that the cultures responded to the fungicide as the earlier experiments describe. The 4 mg L⁻¹ wells at 27 °C were inhibited by 8% against an anticipated floor of 25%, which is the saturation of exposure discussed above and the reason the preregistration had already designated 2 mg L⁻¹ the primary contrast. A periodic component was present on the 27 °C plates, and its removal is shown not to generate the result (Fig. S20). The second and third cultures were therefore set up rather than held, and the decision is recorded here so that readers can weigh it.</w:t>
+      </w:r>
+    </w:p>
+    <w:p>
+      <w:pPr>
+        <w:pStyle w:val="BodyText"/>
+      </w:pPr>
+      <w:r>
+        <w:t xml:space="preserve">Because dose varies within culture, the dose response was analysed at the level of the biological replicate. Within each culture the estimated growth rate was regressed on log₁₀ SHAM concentration across the five retained doses, and the three resulting slopes were treated as independent observations at each temperature; a one-sample t test against zero was used within each temperature, and the two temperatures were compared with Welch’s unequal-variance t test on the six culture-level slopes. The unequal-variance form is required because the variance of the slopes at 27 °C exceeded that at 15 °C roughly threefold. Sensitivity to the choice of fitting interval was assessed by repeating the whole analysis under seven alternative window rules: four fixed absolute windows and three anchored to fixed fractions of each trace’s oxygen drawdown (Fig. S12). A parallel plate set was run with n-propyl gallate (0.0125 to 0.1 mM in ethanol), an alternative-oxidase inhibitor of a different chemotype, over a dose range reaching only 0.1 mM; those traces have not been through the same manual fitting-interval selection and are not reported here. Two features of the design constrain interpretation and are carried into the Discussion: each temperature was run as a single plate in a dedicated incubator, so temperature is confounded with plate and run, and SHAM is not selective for the alternative oxidase.</w:t>
       </w:r>
     </w:p>
     <w:p>

</xml_diff>

<commit_message>
Reference audit: fix citations, add DOIs, remove unused entries
</commit_message>
<xml_diff>
--- a/manuscript/Manuscript.docx
+++ b/manuscript/Manuscript.docx
@@ -133,6 +133,20 @@
       <w:r>
         <w:t xml:space="preserve">(</w:t>
       </w:r>
+      <w:hyperlink w:anchor="ref-fisher2012">
+        <w:r>
+          <w:rPr>
+            <w:rStyle w:val="Hyperlink"/>
+          </w:rPr>
+          <w:t xml:space="preserve">Fisher et al. 2012</w:t>
+        </w:r>
+      </w:hyperlink>
+      <w:r>
+        <w:t xml:space="preserve">;</w:t>
+      </w:r>
+      <w:r>
+        <w:t xml:space="preserve"> </w:t>
+      </w:r>
       <w:hyperlink w:anchor="ref-fisher2018">
         <w:r>
           <w:rPr>
@@ -189,10 +203,24 @@
         </w:r>
       </w:hyperlink>
       <w:r>
+        <w:t xml:space="preserve">;</w:t>
+      </w:r>
+      <w:r>
+        <w:t xml:space="preserve"> </w:t>
+      </w:r>
+      <w:hyperlink w:anchor="ref-fones2015">
+        <w:r>
+          <w:rPr>
+            <w:rStyle w:val="Hyperlink"/>
+          </w:rPr>
+          <w:t xml:space="preserve">Fones and Gurr 2015</w:t>
+        </w:r>
+      </w:hyperlink>
+      <w:r>
         <w:t xml:space="preserve">)</w:t>
       </w:r>
       <w:r>
-        <w:t xml:space="preserve">. Yield losses range from 5 to 20% even in well-managed crops and can approach half of the yield of susceptible cultivars in conducive seasons. Keeping the disease in check absorbs a large share of European fungicide expenditure, with annual costs to growers measured in hundreds of millions of euros</w:t>
+        <w:t xml:space="preserve">. Yield losses range from 5 to 20% even in well-managed crops and can approach half of the yield of susceptible cultivars in conducive seasons. Keeping the disease in check absorbs a large share of European fungicide expenditure, with fungicide costs against this one disease of around one billion euros a year across Europe</w:t>
       </w:r>
       <w:r>
         <w:t xml:space="preserve"> </w:t>
@@ -233,6 +261,20 @@
       </w:r>
       <w:r>
         <w:t xml:space="preserve">(</w:t>
+      </w:r>
+      <w:hyperlink w:anchor="ref-parker2014">
+        <w:r>
+          <w:rPr>
+            <w:rStyle w:val="Hyperlink"/>
+          </w:rPr>
+          <w:t xml:space="preserve">Parker et al. 2014</w:t>
+        </w:r>
+      </w:hyperlink>
+      <w:r>
+        <w:t xml:space="preserve">;</w:t>
+      </w:r>
+      <w:r>
+        <w:t xml:space="preserve"> </w:t>
       </w:r>
       <w:hyperlink w:anchor="ref-cools2013">
         <w:r>
@@ -275,19 +317,7 @@
           <w:rPr>
             <w:rStyle w:val="Hyperlink"/>
           </w:rPr>
-          <w:t xml:space="preserve">Parker et al.</w:t>
-        </w:r>
-        <w:r>
-          <w:rPr>
-            <w:rStyle w:val="Hyperlink"/>
-          </w:rPr>
-          <w:t xml:space="preserve"> </w:t>
-        </w:r>
-        <w:r>
-          <w:rPr>
-            <w:rStyle w:val="Hyperlink"/>
-          </w:rPr>
-          <w:t xml:space="preserve">2011</w:t>
+          <w:t xml:space="preserve">Parker et al. 2011</w:t>
         </w:r>
       </w:hyperlink>
       <w:r>
@@ -321,19 +351,7 @@
           <w:rPr>
             <w:rStyle w:val="Hyperlink"/>
           </w:rPr>
-          <w:t xml:space="preserve">Jørgensen et al.</w:t>
-        </w:r>
-        <w:r>
-          <w:rPr>
-            <w:rStyle w:val="Hyperlink"/>
-          </w:rPr>
-          <w:t xml:space="preserve"> </w:t>
-        </w:r>
-        <w:r>
-          <w:rPr>
-            <w:rStyle w:val="Hyperlink"/>
-          </w:rPr>
-          <w:t xml:space="preserve">2022</w:t>
+          <w:t xml:space="preserve">Jørgensen et al. 2022</w:t>
         </w:r>
       </w:hyperlink>
       <w:r>
@@ -435,10 +453,24 @@
         </w:r>
       </w:hyperlink>
       <w:r>
+        <w:t xml:space="preserve">;</w:t>
+      </w:r>
+      <w:r>
+        <w:t xml:space="preserve"> </w:t>
+      </w:r>
+      <w:hyperlink w:anchor="ref-zhan2011">
+        <w:r>
+          <w:rPr>
+            <w:rStyle w:val="Hyperlink"/>
+          </w:rPr>
+          <w:t xml:space="preserve">Zhan and McDonald 2011</w:t>
+        </w:r>
+      </w:hyperlink>
+      <w:r>
         <w:t xml:space="preserve">)</w:t>
       </w:r>
       <w:r>
-        <w:t xml:space="preserve">. The consequences of warming for chemical control have not. Sensitivity is characterised almost exclusively in standardised assays at a single, near-optimal laboratory temperature, even though field populations experience fluctuating thermal regimes that are shifting and broadening under climate change. A recent synthesis concluded that the influence of temperature on fungicide effectiveness is among the most neglected dimensions of climate-change impacts on crop protection, with the available evidence scattered, largely phenomenological, and rarely mechanistic</w:t>
+        <w:t xml:space="preserve">. The consequences of warming for chemical control have not. Sensitivity is characterised almost exclusively in standardised assays at a single, near-optimal laboratory temperature, even though field populations experience fluctuating thermal regimes that are shifting and broadening under climate change. A recent synthesis concluded that the influence of temperature on fungicide effectiveness is one of the least studied dimensions of climate-change impacts on crop protection, with the available evidence scattered, largely phenomenological, and rarely mechanistic</w:t>
       </w:r>
       <w:r>
         <w:t xml:space="preserve"> </w:t>
@@ -556,12 +588,12 @@
       <w:r>
         <w:t xml:space="preserve"> </w:t>
       </w:r>
-      <w:hyperlink w:anchor="ref-smith2019">
-        <w:r>
-          <w:rPr>
-            <w:rStyle w:val="Hyperlink"/>
-          </w:rPr>
-          <w:t xml:space="preserve">Smith et al. 2019</w:t>
+      <w:hyperlink w:anchor="ref-smith2021">
+        <w:r>
+          <w:rPr>
+            <w:rStyle w:val="Hyperlink"/>
+          </w:rPr>
+          <w:t xml:space="preserve">Smith et al. 2021</w:t>
         </w:r>
       </w:hyperlink>
       <w:r>
@@ -589,19 +621,7 @@
           <w:rPr>
             <w:rStyle w:val="Hyperlink"/>
           </w:rPr>
-          <w:t xml:space="preserve">Holmstrup et al.</w:t>
-        </w:r>
-        <w:r>
-          <w:rPr>
-            <w:rStyle w:val="Hyperlink"/>
-          </w:rPr>
-          <w:t xml:space="preserve"> </w:t>
-        </w:r>
-        <w:r>
-          <w:rPr>
-            <w:rStyle w:val="Hyperlink"/>
-          </w:rPr>
-          <w:t xml:space="preserve">2010</w:t>
+          <w:t xml:space="preserve">Holmstrup et al. 2010</w:t>
         </w:r>
       </w:hyperlink>
       <w:r>
@@ -615,19 +635,7 @@
           <w:rPr>
             <w:rStyle w:val="Hyperlink"/>
           </w:rPr>
-          <w:t xml:space="preserve">Noyes et al.</w:t>
-        </w:r>
-        <w:r>
-          <w:rPr>
-            <w:rStyle w:val="Hyperlink"/>
-          </w:rPr>
-          <w:t xml:space="preserve"> </w:t>
-        </w:r>
-        <w:r>
-          <w:rPr>
-            <w:rStyle w:val="Hyperlink"/>
-          </w:rPr>
-          <w:t xml:space="preserve">2009</w:t>
+          <w:t xml:space="preserve">Noyes et al. 2009</w:t>
         </w:r>
       </w:hyperlink>
       <w:r>
@@ -692,12 +700,26 @@
       <w:r>
         <w:t xml:space="preserve">(</w:t>
       </w:r>
-      <w:hyperlink w:anchor="ref-parker2014">
-        <w:r>
-          <w:rPr>
-            <w:rStyle w:val="Hyperlink"/>
-          </w:rPr>
-          <w:t xml:space="preserve">Parker et al. 2014</w:t>
+      <w:hyperlink w:anchor="ref-shingu-vazquez2011">
+        <w:r>
+          <w:rPr>
+            <w:rStyle w:val="Hyperlink"/>
+          </w:rPr>
+          <w:t xml:space="preserve">Shingu-Vazquez and Traven 2011</w:t>
+        </w:r>
+      </w:hyperlink>
+      <w:r>
+        <w:t xml:space="preserve">;</w:t>
+      </w:r>
+      <w:r>
+        <w:t xml:space="preserve"> </w:t>
+      </w:r>
+      <w:hyperlink w:anchor="ref-kobayashi2002">
+        <w:r>
+          <w:rPr>
+            <w:rStyle w:val="Hyperlink"/>
+          </w:rPr>
+          <w:t xml:space="preserve">Kobayashi et al. 2002</w:t>
         </w:r>
       </w:hyperlink>
       <w:r>
@@ -2136,7 +2158,7 @@
           <w:rPr>
             <w:rStyle w:val="Hyperlink"/>
           </w:rPr>
-          <w:t xml:space="preserve">Bakar et al. 2020</w:t>
+          <w:t xml:space="preserve">Abu Bakar et al. 2020</w:t>
         </w:r>
       </w:hyperlink>
       <w:r>
@@ -2150,19 +2172,7 @@
           <w:rPr>
             <w:rStyle w:val="Hyperlink"/>
           </w:rPr>
-          <w:t xml:space="preserve">Neves-da-Rocha et al.</w:t>
-        </w:r>
-        <w:r>
-          <w:rPr>
-            <w:rStyle w:val="Hyperlink"/>
-          </w:rPr>
-          <w:t xml:space="preserve"> </w:t>
-        </w:r>
-        <w:r>
-          <w:rPr>
-            <w:rStyle w:val="Hyperlink"/>
-          </w:rPr>
-          <w:t xml:space="preserve">2023</w:t>
+          <w:t xml:space="preserve">Neves-da-Rocha et al. 2023</w:t>
         </w:r>
       </w:hyperlink>
       <w:r>
@@ -2270,19 +2280,7 @@
           <w:rPr>
             <w:rStyle w:val="Hyperlink"/>
           </w:rPr>
-          <w:t xml:space="preserve">Jørgensen et al.</w:t>
-        </w:r>
-        <w:r>
-          <w:rPr>
-            <w:rStyle w:val="Hyperlink"/>
-          </w:rPr>
-          <w:t xml:space="preserve"> </w:t>
-        </w:r>
-        <w:r>
-          <w:rPr>
-            <w:rStyle w:val="Hyperlink"/>
-          </w:rPr>
-          <w:t xml:space="preserve">2022</w:t>
+          <w:t xml:space="preserve">Jørgensen et al. 2022</w:t>
         </w:r>
       </w:hyperlink>
       <w:r>
@@ -2380,19 +2378,7 @@
           <w:rPr>
             <w:rStyle w:val="Hyperlink"/>
           </w:rPr>
-          <w:t xml:space="preserve">Goodwin et al.</w:t>
-        </w:r>
-        <w:r>
-          <w:rPr>
-            <w:rStyle w:val="Hyperlink"/>
-          </w:rPr>
-          <w:t xml:space="preserve"> </w:t>
-        </w:r>
-        <w:r>
-          <w:rPr>
-            <w:rStyle w:val="Hyperlink"/>
-          </w:rPr>
-          <w:t xml:space="preserve">2011</w:t>
+          <w:t xml:space="preserve">Goodwin et al. 2011</w:t>
         </w:r>
       </w:hyperlink>
       <w:r>
@@ -3160,24 +3146,12 @@
       <w:r>
         <w:t xml:space="preserve">(</w:t>
       </w:r>
-      <w:hyperlink w:anchor="ref-quaedvlieg2011">
-        <w:r>
-          <w:rPr>
-            <w:rStyle w:val="Hyperlink"/>
-          </w:rPr>
-          <w:t xml:space="preserve">Quaedvlieg et al.</w:t>
-        </w:r>
-        <w:r>
-          <w:rPr>
-            <w:rStyle w:val="Hyperlink"/>
-          </w:rPr>
-          <w:t xml:space="preserve"> </w:t>
-        </w:r>
-        <w:r>
-          <w:rPr>
-            <w:rStyle w:val="Hyperlink"/>
-          </w:rPr>
-          <w:t xml:space="preserve">2011</w:t>
+      <w:hyperlink w:anchor="ref-ababa2023">
+        <w:r>
+          <w:rPr>
+            <w:rStyle w:val="Hyperlink"/>
+          </w:rPr>
+          <w:t xml:space="preserve">Ababa 2023</w:t>
         </w:r>
       </w:hyperlink>
       <w:r>
@@ -4998,6 +4972,20 @@
         </w:r>
       </w:hyperlink>
       <w:r>
+        <w:t xml:space="preserve">;</w:t>
+      </w:r>
+      <w:r>
+        <w:t xml:space="preserve"> </w:t>
+      </w:r>
+      <w:hyperlink w:anchor="ref-wood2017">
+        <w:r>
+          <w:rPr>
+            <w:rStyle w:val="Hyperlink"/>
+          </w:rPr>
+          <w:t xml:space="preserve">Wood 2017</w:t>
+        </w:r>
+      </w:hyperlink>
+      <w:r>
         <w:t xml:space="preserve">)</w:t>
       </w:r>
       <w:r>
@@ -5365,7 +5353,27 @@
         <w:t xml:space="preserve"> </w:t>
       </w:r>
       <w:r>
-        <w:t xml:space="preserve">with temperature and prothioconazole as categorical factors (releveled to 15 °C and 0 mg L⁻¹ as references) and the design ~ temperature + prothioconazole + temperature:prothioconazole; pairwise contrasts (2 vs 0 mg L⁻¹ within each temperature; temperatures within each dose) used an equivalent combined-group model with ashr log₂FC shrinkage. The temperature × prothioconazole interaction was tested with a likelihood-ratio test comparing the full model against the reduced model ~ temperature + prothioconazole. Genes were retained if they had ≥10 counts in ≥7 samples; differential expression was called at adjusted P &lt; 0.05 and |log₂FC| ≥ 1. Conclusions were confirmed to be robust to exclusion of the lowest-depth libraries (refitting after dropping the single weakest library (21_0_R2, ~13.0 M read pairs), then the three weakest (21_0_R2, 27_0_R4 and 15_2_R3); per-gene log₂FC correlation with the full data ≥ 0.97). DESeq2 Cook’s-distance diagnostics flagged no sample as influential (maximum per-sample fraction of flagged genes 2 × 10⁻⁴).</w:t>
+        <w:t xml:space="preserve">with temperature and prothioconazole as categorical factors (releveled to 15 °C and 0 mg L⁻¹ as references) and the design ~ temperature + prothioconazole + temperature:prothioconazole; pairwise contrasts (2 vs 0 mg L⁻¹ within each temperature; temperatures within each dose) used an equivalent combined-group model with ashr log₂FC shrinkage</w:t>
+      </w:r>
+      <w:r>
+        <w:t xml:space="preserve"> </w:t>
+      </w:r>
+      <w:r>
+        <w:t xml:space="preserve">(</w:t>
+      </w:r>
+      <w:hyperlink w:anchor="ref-stephens2017">
+        <w:r>
+          <w:rPr>
+            <w:rStyle w:val="Hyperlink"/>
+          </w:rPr>
+          <w:t xml:space="preserve">Stephens 2017</w:t>
+        </w:r>
+      </w:hyperlink>
+      <w:r>
+        <w:t xml:space="preserve">)</w:t>
+      </w:r>
+      <w:r>
+        <w:t xml:space="preserve">. The temperature × prothioconazole interaction was tested with a likelihood-ratio test comparing the full model against the reduced model ~ temperature + prothioconazole. Genes were retained if they had ≥10 counts in ≥7 samples; differential expression was called at adjusted P &lt; 0.05 and |log₂FC| ≥ 1. Conclusions were confirmed to be robust to exclusion of the lowest-depth libraries (refitting after dropping the single weakest library (21_0_R2, ~13.0 M read pairs), then the three weakest (21_0_R2, 27_0_R4 and 15_2_R3); per-gene log₂FC correlation with the full data ≥ 0.97). DESeq2 Cook’s-distance diagnostics flagged no sample as influential (maximum per-sample fraction of flagged genes 2 × 10⁻⁴).</w:t>
       </w:r>
     </w:p>
     <w:p>
@@ -5528,7 +5536,7 @@
       </w:r>
     </w:p>
     <w:bookmarkEnd w:id="40"/>
-    <w:bookmarkStart w:id="131" w:name="references"/>
+    <w:bookmarkStart w:id="144" w:name="references"/>
     <w:p>
       <w:pPr>
         <w:pStyle w:val="Heading1"/>
@@ -5537,14 +5545,44 @@
         <w:t xml:space="preserve">References</w:t>
       </w:r>
     </w:p>
-    <w:bookmarkStart w:id="130" w:name="refs"/>
-    <w:bookmarkStart w:id="41" w:name="ref-angilletta2009"/>
+    <w:bookmarkStart w:id="143" w:name="refs"/>
+    <w:bookmarkStart w:id="42" w:name="ref-ababa2023"/>
     <w:p>
       <w:pPr>
         <w:pStyle w:val="Bibliography"/>
       </w:pPr>
       <w:r>
-        <w:t xml:space="preserve">Angilletta, M. J. 2009.</w:t>
+        <w:t xml:space="preserve">Ababa, Girma. 2023.</w:t>
+      </w:r>
+      <w:r>
+        <w:t xml:space="preserve"> </w:t>
+      </w:r>
+      <w:r>
+        <w:t xml:space="preserve">“Biology of</w:t>
+      </w:r>
+      <w:r>
+        <w:t xml:space="preserve"> </w:t>
+      </w:r>
+      <w:r>
+        <w:t xml:space="preserve">Zymoseptoria tritici</w:t>
+      </w:r>
+      <w:r>
+        <w:t xml:space="preserve"> </w:t>
+      </w:r>
+      <w:r>
+        <w:t xml:space="preserve">and the Epidemiology of</w:t>
+      </w:r>
+      <w:r>
+        <w:t xml:space="preserve"> </w:t>
+      </w:r>
+      <w:r>
+        <w:t xml:space="preserve">Septoria</w:t>
+      </w:r>
+      <w:r>
+        <w:t xml:space="preserve"> </w:t>
+      </w:r>
+      <w:r>
+        <w:t xml:space="preserve">Tritici Blotch of Wheat.”</w:t>
       </w:r>
       <w:r>
         <w:t xml:space="preserve"> </w:t>
@@ -5554,20 +5592,37 @@
           <w:i/>
           <w:iCs/>
         </w:rPr>
-        <w:t xml:space="preserve">Thermal Adaptation: A Theoretical and Empirical Synthesis</w:t>
-      </w:r>
+        <w:t xml:space="preserve">Mycology</w:t>
+      </w:r>
+      <w:r>
+        <w:t xml:space="preserve"> </w:t>
+      </w:r>
+      <w:r>
+        <w:t xml:space="preserve">14 (4): 292–315.</w:t>
+      </w:r>
+      <w:r>
+        <w:t xml:space="preserve"> </w:t>
+      </w:r>
+      <w:hyperlink r:id="rId41">
+        <w:r>
+          <w:rPr>
+            <w:rStyle w:val="Hyperlink"/>
+          </w:rPr>
+          <w:t xml:space="preserve">https://doi.org/10.1080/21501203.2023.2241492</w:t>
+        </w:r>
+      </w:hyperlink>
       <w:r>
         <w:t xml:space="preserve">.</w:t>
       </w:r>
     </w:p>
-    <w:bookmarkEnd w:id="41"/>
-    <w:bookmarkStart w:id="43" w:name="ref-bakar2020"/>
+    <w:bookmarkEnd w:id="42"/>
+    <w:bookmarkStart w:id="44" w:name="ref-bakar2020"/>
     <w:p>
       <w:pPr>
         <w:pStyle w:val="Bibliography"/>
       </w:pPr>
       <w:r>
-        <w:t xml:space="preserve">Bakar, N. A., S. A. Karsani, and S. A. Alias. 2020.</w:t>
+        <w:t xml:space="preserve">Abu Bakar, Nurlizah, Saiful Anuar Karsani, and Siti Aisyah Alias. 2020.</w:t>
       </w:r>
       <w:r>
         <w:t xml:space="preserve"> </w:t>
@@ -5594,7 +5649,7 @@
       <w:r>
         <w:t xml:space="preserve"> </w:t>
       </w:r>
-      <w:hyperlink r:id="rId42">
+      <w:hyperlink r:id="rId43">
         <w:r>
           <w:rPr>
             <w:rStyle w:val="Hyperlink"/>
@@ -5606,20 +5661,14 @@
         <w:t xml:space="preserve">.</w:t>
       </w:r>
     </w:p>
-    <w:bookmarkEnd w:id="43"/>
-    <w:bookmarkStart w:id="45" w:name="ref-bebber2013"/>
+    <w:bookmarkEnd w:id="44"/>
+    <w:bookmarkStart w:id="46" w:name="ref-angilletta2009"/>
     <w:p>
       <w:pPr>
         <w:pStyle w:val="Bibliography"/>
       </w:pPr>
       <w:r>
-        <w:t xml:space="preserve">Bebber, D. P., M. A. T. Ramotowski, and S. J. Gurr. 2013.</w:t>
-      </w:r>
-      <w:r>
-        <w:t xml:space="preserve"> </w:t>
-      </w:r>
-      <w:r>
-        <w:t xml:space="preserve">“Crop Pests and Pathogens Move Polewards in a Warming World.”</w:t>
+        <w:t xml:space="preserve">Angilletta, M. J. 2009.</w:t>
       </w:r>
       <w:r>
         <w:t xml:space="preserve"> </w:t>
@@ -5629,43 +5678,40 @@
           <w:i/>
           <w:iCs/>
         </w:rPr>
-        <w:t xml:space="preserve">Nature Climate Change</w:t>
-      </w:r>
-      <w:r>
-        <w:t xml:space="preserve"> </w:t>
-      </w:r>
-      <w:r>
-        <w:t xml:space="preserve">3: 985–88.</w:t>
-      </w:r>
-      <w:r>
-        <w:t xml:space="preserve"> </w:t>
-      </w:r>
-      <w:hyperlink r:id="rId44">
-        <w:r>
-          <w:rPr>
-            <w:rStyle w:val="Hyperlink"/>
-          </w:rPr>
-          <w:t xml:space="preserve">https://doi.org/10.1038/nclimate1990</w:t>
+        <w:t xml:space="preserve">Thermal Adaptation: A Theoretical and Empirical Synthesis</w:t>
+      </w:r>
+      <w:r>
+        <w:t xml:space="preserve">. Oxford University Press.</w:t>
+      </w:r>
+      <w:r>
+        <w:t xml:space="preserve"> </w:t>
+      </w:r>
+      <w:hyperlink r:id="rId45">
+        <w:r>
+          <w:rPr>
+            <w:rStyle w:val="Hyperlink"/>
+          </w:rPr>
+          <w:t xml:space="preserve">https://doi.org/10.1093/acprof:oso/9780198570875.001.1</w:t>
         </w:r>
       </w:hyperlink>
       <w:r>
         <w:t xml:space="preserve">.</w:t>
       </w:r>
     </w:p>
-    <w:bookmarkEnd w:id="45"/>
-    <w:bookmarkStart w:id="47" w:name="ref-berry2008"/>
+    <w:bookmarkEnd w:id="46"/>
+    <w:bookmarkStart w:id="48" w:name="ref-bebber2013"/>
     <w:p>
       <w:pPr>
         <w:pStyle w:val="Bibliography"/>
       </w:pPr>
       <w:r>
-        <w:t xml:space="preserve">Berry, D. B., and A. P. Gasch. 2008.</w:t>
-      </w:r>
-      <w:r>
-        <w:t xml:space="preserve"> </w:t>
-      </w:r>
-      <w:r>
-        <w:t xml:space="preserve">“Stress-Activated Genomic Expression Changes Serve a Preparative Role for Impending Stress in Yeast.”</w:t>
+        <w:t xml:space="preserve">Bebber, D. P., M. A. T. Ramotowski, and S. J. Gurr. 2013.</w:t>
+      </w:r>
+      <w:r>
+        <w:t xml:space="preserve"> </w:t>
+      </w:r>
+      <w:r>
+        <w:t xml:space="preserve">“Crop Pests and Pathogens Move Polewards in a Warming World.”</w:t>
       </w:r>
       <w:r>
         <w:t xml:space="preserve"> </w:t>
@@ -5675,43 +5721,43 @@
           <w:i/>
           <w:iCs/>
         </w:rPr>
-        <w:t xml:space="preserve">Molecular Biology of the Cell</w:t>
-      </w:r>
-      <w:r>
-        <w:t xml:space="preserve"> </w:t>
-      </w:r>
-      <w:r>
-        <w:t xml:space="preserve">19: 4580–87.</w:t>
-      </w:r>
-      <w:r>
-        <w:t xml:space="preserve"> </w:t>
-      </w:r>
-      <w:hyperlink r:id="rId46">
-        <w:r>
-          <w:rPr>
-            <w:rStyle w:val="Hyperlink"/>
-          </w:rPr>
-          <w:t xml:space="preserve">https://doi.org/10.1091/mbc.e07-07-0680</w:t>
+        <w:t xml:space="preserve">Nature Climate Change</w:t>
+      </w:r>
+      <w:r>
+        <w:t xml:space="preserve"> </w:t>
+      </w:r>
+      <w:r>
+        <w:t xml:space="preserve">3: 985–88.</w:t>
+      </w:r>
+      <w:r>
+        <w:t xml:space="preserve"> </w:t>
+      </w:r>
+      <w:hyperlink r:id="rId47">
+        <w:r>
+          <w:rPr>
+            <w:rStyle w:val="Hyperlink"/>
+          </w:rPr>
+          <w:t xml:space="preserve">https://doi.org/10.1038/nclimate1990</w:t>
         </w:r>
       </w:hyperlink>
       <w:r>
         <w:t xml:space="preserve">.</w:t>
       </w:r>
     </w:p>
-    <w:bookmarkEnd w:id="47"/>
-    <w:bookmarkStart w:id="49" w:name="ref-bliss1939"/>
+    <w:bookmarkEnd w:id="48"/>
+    <w:bookmarkStart w:id="50" w:name="ref-berry2008"/>
     <w:p>
       <w:pPr>
         <w:pStyle w:val="Bibliography"/>
       </w:pPr>
       <w:r>
-        <w:t xml:space="preserve">Bliss, C. I. 1939.</w:t>
-      </w:r>
-      <w:r>
-        <w:t xml:space="preserve"> </w:t>
-      </w:r>
-      <w:r>
-        <w:t xml:space="preserve">“The Toxicity of Poisons Applied Jointly.”</w:t>
+        <w:t xml:space="preserve">Berry, D. B., and A. P. Gasch. 2008.</w:t>
+      </w:r>
+      <w:r>
+        <w:t xml:space="preserve"> </w:t>
+      </w:r>
+      <w:r>
+        <w:t xml:space="preserve">“Stress-Activated Genomic Expression Changes Serve a Preparative Role for Impending Stress in Yeast.”</w:t>
       </w:r>
       <w:r>
         <w:t xml:space="preserve"> </w:t>
@@ -5721,43 +5767,43 @@
           <w:i/>
           <w:iCs/>
         </w:rPr>
-        <w:t xml:space="preserve">Annals of Applied Biology</w:t>
-      </w:r>
-      <w:r>
-        <w:t xml:space="preserve"> </w:t>
-      </w:r>
-      <w:r>
-        <w:t xml:space="preserve">26: 585–615.</w:t>
-      </w:r>
-      <w:r>
-        <w:t xml:space="preserve"> </w:t>
-      </w:r>
-      <w:hyperlink r:id="rId48">
-        <w:r>
-          <w:rPr>
-            <w:rStyle w:val="Hyperlink"/>
-          </w:rPr>
-          <w:t xml:space="preserve">https://doi.org/10.1111/j.1744-7348.1939.tb06990.x</w:t>
+        <w:t xml:space="preserve">Molecular Biology of the Cell</w:t>
+      </w:r>
+      <w:r>
+        <w:t xml:space="preserve"> </w:t>
+      </w:r>
+      <w:r>
+        <w:t xml:space="preserve">19: 4580–87.</w:t>
+      </w:r>
+      <w:r>
+        <w:t xml:space="preserve"> </w:t>
+      </w:r>
+      <w:hyperlink r:id="rId49">
+        <w:r>
+          <w:rPr>
+            <w:rStyle w:val="Hyperlink"/>
+          </w:rPr>
+          <w:t xml:space="preserve">https://doi.org/10.1091/mbc.e07-07-0680</w:t>
         </w:r>
       </w:hyperlink>
       <w:r>
         <w:t xml:space="preserve">.</w:t>
       </w:r>
     </w:p>
-    <w:bookmarkEnd w:id="49"/>
-    <w:bookmarkStart w:id="51" w:name="ref-brown2004"/>
+    <w:bookmarkEnd w:id="50"/>
+    <w:bookmarkStart w:id="52" w:name="ref-bliss1939"/>
     <w:p>
       <w:pPr>
         <w:pStyle w:val="Bibliography"/>
       </w:pPr>
       <w:r>
-        <w:t xml:space="preserve">Brown, J. H., J. F. Gillooly, A. P. Allen, V. M. Savage, and G. B. West. 2004.</w:t>
-      </w:r>
-      <w:r>
-        <w:t xml:space="preserve"> </w:t>
-      </w:r>
-      <w:r>
-        <w:t xml:space="preserve">“Toward a Metabolic Theory of Ecology.”</w:t>
+        <w:t xml:space="preserve">Bliss, C. I. 1939.</w:t>
+      </w:r>
+      <w:r>
+        <w:t xml:space="preserve"> </w:t>
+      </w:r>
+      <w:r>
+        <w:t xml:space="preserve">“The Toxicity of Poisons Applied Jointly.”</w:t>
       </w:r>
       <w:r>
         <w:t xml:space="preserve"> </w:t>
@@ -5767,43 +5813,43 @@
           <w:i/>
           <w:iCs/>
         </w:rPr>
-        <w:t xml:space="preserve">Ecology</w:t>
-      </w:r>
-      <w:r>
-        <w:t xml:space="preserve"> </w:t>
-      </w:r>
-      <w:r>
-        <w:t xml:space="preserve">85: 1771–89.</w:t>
-      </w:r>
-      <w:r>
-        <w:t xml:space="preserve"> </w:t>
-      </w:r>
-      <w:hyperlink r:id="rId50">
-        <w:r>
-          <w:rPr>
-            <w:rStyle w:val="Hyperlink"/>
-          </w:rPr>
-          <w:t xml:space="preserve">https://doi.org/10.1890/03-9000</w:t>
+        <w:t xml:space="preserve">Annals of Applied Biology</w:t>
+      </w:r>
+      <w:r>
+        <w:t xml:space="preserve"> </w:t>
+      </w:r>
+      <w:r>
+        <w:t xml:space="preserve">26: 585–615.</w:t>
+      </w:r>
+      <w:r>
+        <w:t xml:space="preserve"> </w:t>
+      </w:r>
+      <w:hyperlink r:id="rId51">
+        <w:r>
+          <w:rPr>
+            <w:rStyle w:val="Hyperlink"/>
+          </w:rPr>
+          <w:t xml:space="preserve">https://doi.org/10.1111/j.1744-7348.1939.tb06990.x</w:t>
         </w:r>
       </w:hyperlink>
       <w:r>
         <w:t xml:space="preserve">.</w:t>
       </w:r>
     </w:p>
-    <w:bookmarkEnd w:id="51"/>
-    <w:bookmarkStart w:id="53" w:name="ref-burkner2017"/>
+    <w:bookmarkEnd w:id="52"/>
+    <w:bookmarkStart w:id="54" w:name="ref-brown2004"/>
     <w:p>
       <w:pPr>
         <w:pStyle w:val="Bibliography"/>
       </w:pPr>
       <w:r>
-        <w:t xml:space="preserve">Bürkner, P.-C. 2017.</w:t>
-      </w:r>
-      <w:r>
-        <w:t xml:space="preserve"> </w:t>
-      </w:r>
-      <w:r>
-        <w:t xml:space="preserve">“Brms: An r Package for Bayesian Multilevel Models Using Stan.”</w:t>
+        <w:t xml:space="preserve">Brown, J. H., J. F. Gillooly, A. P. Allen, V. M. Savage, and G. B. West. 2004.</w:t>
+      </w:r>
+      <w:r>
+        <w:t xml:space="preserve"> </w:t>
+      </w:r>
+      <w:r>
+        <w:t xml:space="preserve">“Toward a Metabolic Theory of Ecology.”</w:t>
       </w:r>
       <w:r>
         <w:t xml:space="preserve"> </w:t>
@@ -5813,43 +5859,43 @@
           <w:i/>
           <w:iCs/>
         </w:rPr>
-        <w:t xml:space="preserve">Journal of Statistical Software</w:t>
-      </w:r>
-      <w:r>
-        <w:t xml:space="preserve"> </w:t>
-      </w:r>
-      <w:r>
-        <w:t xml:space="preserve">80(1): 1–28.</w:t>
-      </w:r>
-      <w:r>
-        <w:t xml:space="preserve"> </w:t>
-      </w:r>
-      <w:hyperlink r:id="rId52">
-        <w:r>
-          <w:rPr>
-            <w:rStyle w:val="Hyperlink"/>
-          </w:rPr>
-          <w:t xml:space="preserve">https://doi.org/10.18637/jss.v080.i01</w:t>
+        <w:t xml:space="preserve">Ecology</w:t>
+      </w:r>
+      <w:r>
+        <w:t xml:space="preserve"> </w:t>
+      </w:r>
+      <w:r>
+        <w:t xml:space="preserve">85: 1771–89.</w:t>
+      </w:r>
+      <w:r>
+        <w:t xml:space="preserve"> </w:t>
+      </w:r>
+      <w:hyperlink r:id="rId53">
+        <w:r>
+          <w:rPr>
+            <w:rStyle w:val="Hyperlink"/>
+          </w:rPr>
+          <w:t xml:space="preserve">https://doi.org/10.1890/03-9000</w:t>
         </w:r>
       </w:hyperlink>
       <w:r>
         <w:t xml:space="preserve">.</w:t>
       </w:r>
     </w:p>
-    <w:bookmarkEnd w:id="53"/>
-    <w:bookmarkStart w:id="55" w:name="ref-cakin2026"/>
+    <w:bookmarkEnd w:id="54"/>
+    <w:bookmarkStart w:id="56" w:name="ref-burkner2017"/>
     <w:p>
       <w:pPr>
         <w:pStyle w:val="Bibliography"/>
       </w:pPr>
       <w:r>
-        <w:t xml:space="preserve">Cakin, I., R. Millington, S. Pawar, et al. 2026.</w:t>
-      </w:r>
-      <w:r>
-        <w:t xml:space="preserve"> </w:t>
-      </w:r>
-      <w:r>
-        <w:t xml:space="preserve">“A Novel Method to Simultaneously Estimate Bacterial Respiration and Growth from Oxygen Dynamics.”</w:t>
+        <w:t xml:space="preserve">Bürkner, P.-C. 2017.</w:t>
+      </w:r>
+      <w:r>
+        <w:t xml:space="preserve"> </w:t>
+      </w:r>
+      <w:r>
+        <w:t xml:space="preserve">“Brms: An r Package for Bayesian Multilevel Models Using Stan.”</w:t>
       </w:r>
       <w:r>
         <w:t xml:space="preserve"> </w:t>
@@ -5859,43 +5905,43 @@
           <w:i/>
           <w:iCs/>
         </w:rPr>
-        <w:t xml:space="preserve">ISME Communications</w:t>
-      </w:r>
-      <w:r>
-        <w:t xml:space="preserve"> </w:t>
-      </w:r>
-      <w:r>
-        <w:t xml:space="preserve">6(1): ycag024.</w:t>
-      </w:r>
-      <w:r>
-        <w:t xml:space="preserve"> </w:t>
-      </w:r>
-      <w:hyperlink r:id="rId54">
-        <w:r>
-          <w:rPr>
-            <w:rStyle w:val="Hyperlink"/>
-          </w:rPr>
-          <w:t xml:space="preserve">https://doi.org/10.1093/ismeco/ycag024</w:t>
+        <w:t xml:space="preserve">Journal of Statistical Software</w:t>
+      </w:r>
+      <w:r>
+        <w:t xml:space="preserve"> </w:t>
+      </w:r>
+      <w:r>
+        <w:t xml:space="preserve">80 (1): 1–28.</w:t>
+      </w:r>
+      <w:r>
+        <w:t xml:space="preserve"> </w:t>
+      </w:r>
+      <w:hyperlink r:id="rId55">
+        <w:r>
+          <w:rPr>
+            <w:rStyle w:val="Hyperlink"/>
+          </w:rPr>
+          <w:t xml:space="preserve">https://doi.org/10.18637/jss.v080.i01</w:t>
         </w:r>
       </w:hyperlink>
       <w:r>
         <w:t xml:space="preserve">.</w:t>
       </w:r>
     </w:p>
-    <w:bookmarkEnd w:id="55"/>
-    <w:bookmarkStart w:id="57" w:name="ref-cantalapiedra2021"/>
+    <w:bookmarkEnd w:id="56"/>
+    <w:bookmarkStart w:id="58" w:name="ref-cakin2026"/>
     <w:p>
       <w:pPr>
         <w:pStyle w:val="Bibliography"/>
       </w:pPr>
       <w:r>
-        <w:t xml:space="preserve">Cantalapiedra, C. P., A. Hernández-Plaza, I. Letunic, P. Bork, and J. Huerta-Cepas. 2021.</w:t>
-      </w:r>
-      <w:r>
-        <w:t xml:space="preserve"> </w:t>
-      </w:r>
-      <w:r>
-        <w:t xml:space="preserve">“eggNOG-Mapper V2: Functional Annotation, Orthology Assignments, and Domain Prediction at the Metagenomic Scale.”</w:t>
+        <w:t xml:space="preserve">Cakin, I., R. Millington, S. Pawar, et al. 2026.</w:t>
+      </w:r>
+      <w:r>
+        <w:t xml:space="preserve"> </w:t>
+      </w:r>
+      <w:r>
+        <w:t xml:space="preserve">“A Novel Method to Simultaneously Estimate Bacterial Respiration and Growth from Oxygen Dynamics.”</w:t>
       </w:r>
       <w:r>
         <w:t xml:space="preserve"> </w:t>
@@ -5905,43 +5951,43 @@
           <w:i/>
           <w:iCs/>
         </w:rPr>
-        <w:t xml:space="preserve">Molecular Biology and Evolution</w:t>
-      </w:r>
-      <w:r>
-        <w:t xml:space="preserve"> </w:t>
-      </w:r>
-      <w:r>
-        <w:t xml:space="preserve">38(12): 5825–29.</w:t>
-      </w:r>
-      <w:r>
-        <w:t xml:space="preserve"> </w:t>
-      </w:r>
-      <w:hyperlink r:id="rId56">
-        <w:r>
-          <w:rPr>
-            <w:rStyle w:val="Hyperlink"/>
-          </w:rPr>
-          <w:t xml:space="preserve">https://doi.org/10.1093/molbev/msab293</w:t>
+        <w:t xml:space="preserve">ISME Communications</w:t>
+      </w:r>
+      <w:r>
+        <w:t xml:space="preserve"> </w:t>
+      </w:r>
+      <w:r>
+        <w:t xml:space="preserve">6 (1): ycag024.</w:t>
+      </w:r>
+      <w:r>
+        <w:t xml:space="preserve"> </w:t>
+      </w:r>
+      <w:hyperlink r:id="rId57">
+        <w:r>
+          <w:rPr>
+            <w:rStyle w:val="Hyperlink"/>
+          </w:rPr>
+          <w:t xml:space="preserve">https://doi.org/10.1093/ismeco/ycag024</w:t>
         </w:r>
       </w:hyperlink>
       <w:r>
         <w:t xml:space="preserve">.</w:t>
       </w:r>
     </w:p>
-    <w:bookmarkEnd w:id="57"/>
-    <w:bookmarkStart w:id="59" w:name="ref-chaloner2021"/>
+    <w:bookmarkEnd w:id="58"/>
+    <w:bookmarkStart w:id="60" w:name="ref-cantalapiedra2021"/>
     <w:p>
       <w:pPr>
         <w:pStyle w:val="Bibliography"/>
       </w:pPr>
       <w:r>
-        <w:t xml:space="preserve">Chaloner, T. M., S. J. Gurr, and D. P. Bebber. 2021.</w:t>
-      </w:r>
-      <w:r>
-        <w:t xml:space="preserve"> </w:t>
-      </w:r>
-      <w:r>
-        <w:t xml:space="preserve">“Plant Pathogen Infection Risk Tracks Global Crop Yields Under Climate Change.”</w:t>
+        <w:t xml:space="preserve">Cantalapiedra, C. P., A. Hernández-Plaza, I. Letunic, P. Bork, and J. Huerta-Cepas. 2021.</w:t>
+      </w:r>
+      <w:r>
+        <w:t xml:space="preserve"> </w:t>
+      </w:r>
+      <w:r>
+        <w:t xml:space="preserve">“eggNOG-Mapper V2: Functional Annotation, Orthology Assignments, and Domain Prediction at the Metagenomic Scale.”</w:t>
       </w:r>
       <w:r>
         <w:t xml:space="preserve"> </w:t>
@@ -5951,43 +5997,43 @@
           <w:i/>
           <w:iCs/>
         </w:rPr>
-        <w:t xml:space="preserve">Nature Climate Change</w:t>
-      </w:r>
-      <w:r>
-        <w:t xml:space="preserve"> </w:t>
-      </w:r>
-      <w:r>
-        <w:t xml:space="preserve">11: 710–15.</w:t>
-      </w:r>
-      <w:r>
-        <w:t xml:space="preserve"> </w:t>
-      </w:r>
-      <w:hyperlink r:id="rId58">
-        <w:r>
-          <w:rPr>
-            <w:rStyle w:val="Hyperlink"/>
-          </w:rPr>
-          <w:t xml:space="preserve">https://doi.org/10.1038/s41558-021-01104-8</w:t>
+        <w:t xml:space="preserve">Molecular Biology and Evolution</w:t>
+      </w:r>
+      <w:r>
+        <w:t xml:space="preserve"> </w:t>
+      </w:r>
+      <w:r>
+        <w:t xml:space="preserve">38 (12): 5825–29.</w:t>
+      </w:r>
+      <w:r>
+        <w:t xml:space="preserve"> </w:t>
+      </w:r>
+      <w:hyperlink r:id="rId59">
+        <w:r>
+          <w:rPr>
+            <w:rStyle w:val="Hyperlink"/>
+          </w:rPr>
+          <w:t xml:space="preserve">https://doi.org/10.1093/molbev/msab293</w:t>
         </w:r>
       </w:hyperlink>
       <w:r>
         <w:t xml:space="preserve">.</w:t>
       </w:r>
     </w:p>
-    <w:bookmarkEnd w:id="59"/>
-    <w:bookmarkStart w:id="61" w:name="ref-cools2013"/>
+    <w:bookmarkEnd w:id="60"/>
+    <w:bookmarkStart w:id="62" w:name="ref-chaloner2021"/>
     <w:p>
       <w:pPr>
         <w:pStyle w:val="Bibliography"/>
       </w:pPr>
       <w:r>
-        <w:t xml:space="preserve">Cools, H. J., and B. A. Fraaije. 2013.</w:t>
-      </w:r>
-      <w:r>
-        <w:t xml:space="preserve"> </w:t>
-      </w:r>
-      <w:r>
-        <w:t xml:space="preserve">“Update on Mechanisms of Azole Resistance in Mycosphaerella Graminicola and Implications for Future Control.”</w:t>
+        <w:t xml:space="preserve">Chaloner, T. M., S. J. Gurr, and D. P. Bebber. 2021.</w:t>
+      </w:r>
+      <w:r>
+        <w:t xml:space="preserve"> </w:t>
+      </w:r>
+      <w:r>
+        <w:t xml:space="preserve">“Plant Pathogen Infection Risk Tracks Global Crop Yields Under Climate Change.”</w:t>
       </w:r>
       <w:r>
         <w:t xml:space="preserve"> </w:t>
@@ -5997,43 +6043,43 @@
           <w:i/>
           <w:iCs/>
         </w:rPr>
-        <w:t xml:space="preserve">Pest Management Science</w:t>
-      </w:r>
-      <w:r>
-        <w:t xml:space="preserve"> </w:t>
-      </w:r>
-      <w:r>
-        <w:t xml:space="preserve">69: 150–55.</w:t>
-      </w:r>
-      <w:r>
-        <w:t xml:space="preserve"> </w:t>
-      </w:r>
-      <w:hyperlink r:id="rId60">
-        <w:r>
-          <w:rPr>
-            <w:rStyle w:val="Hyperlink"/>
-          </w:rPr>
-          <w:t xml:space="preserve">https://doi.org/10.1002/ps.3348</w:t>
+        <w:t xml:space="preserve">Nature Climate Change</w:t>
+      </w:r>
+      <w:r>
+        <w:t xml:space="preserve"> </w:t>
+      </w:r>
+      <w:r>
+        <w:t xml:space="preserve">11: 710–15.</w:t>
+      </w:r>
+      <w:r>
+        <w:t xml:space="preserve"> </w:t>
+      </w:r>
+      <w:hyperlink r:id="rId61">
+        <w:r>
+          <w:rPr>
+            <w:rStyle w:val="Hyperlink"/>
+          </w:rPr>
+          <w:t xml:space="preserve">https://doi.org/10.1038/s41558-021-01104-8</w:t>
         </w:r>
       </w:hyperlink>
       <w:r>
         <w:t xml:space="preserve">.</w:t>
       </w:r>
     </w:p>
-    <w:bookmarkEnd w:id="61"/>
-    <w:bookmarkStart w:id="63" w:name="ref-fang2023"/>
+    <w:bookmarkEnd w:id="62"/>
+    <w:bookmarkStart w:id="64" w:name="ref-cools2013"/>
     <w:p>
       <w:pPr>
         <w:pStyle w:val="Bibliography"/>
       </w:pPr>
       <w:r>
-        <w:t xml:space="preserve">Fang, Z., X. Liu, and G. Peltz. 2023.</w:t>
-      </w:r>
-      <w:r>
-        <w:t xml:space="preserve"> </w:t>
-      </w:r>
-      <w:r>
-        <w:t xml:space="preserve">“GSEApy: A Comprehensive Package for Performing Gene Set Enrichment Analysis in Python.”</w:t>
+        <w:t xml:space="preserve">Cools, H. J., and B. A. Fraaije. 2013.</w:t>
+      </w:r>
+      <w:r>
+        <w:t xml:space="preserve"> </w:t>
+      </w:r>
+      <w:r>
+        <w:t xml:space="preserve">“Update on Mechanisms of Azole Resistance in Mycosphaerella Graminicola and Implications for Future Control.”</w:t>
       </w:r>
       <w:r>
         <w:t xml:space="preserve"> </w:t>
@@ -6043,43 +6089,43 @@
           <w:i/>
           <w:iCs/>
         </w:rPr>
-        <w:t xml:space="preserve">Bioinformatics</w:t>
-      </w:r>
-      <w:r>
-        <w:t xml:space="preserve"> </w:t>
-      </w:r>
-      <w:r>
-        <w:t xml:space="preserve">39(1): btac757.</w:t>
-      </w:r>
-      <w:r>
-        <w:t xml:space="preserve"> </w:t>
-      </w:r>
-      <w:hyperlink r:id="rId62">
-        <w:r>
-          <w:rPr>
-            <w:rStyle w:val="Hyperlink"/>
-          </w:rPr>
-          <w:t xml:space="preserve">https://doi.org/10.1093/bioinformatics/btac757</w:t>
+        <w:t xml:space="preserve">Pest Management Science</w:t>
+      </w:r>
+      <w:r>
+        <w:t xml:space="preserve"> </w:t>
+      </w:r>
+      <w:r>
+        <w:t xml:space="preserve">69: 150–55.</w:t>
+      </w:r>
+      <w:r>
+        <w:t xml:space="preserve"> </w:t>
+      </w:r>
+      <w:hyperlink r:id="rId63">
+        <w:r>
+          <w:rPr>
+            <w:rStyle w:val="Hyperlink"/>
+          </w:rPr>
+          <w:t xml:space="preserve">https://doi.org/10.1002/ps.3348</w:t>
         </w:r>
       </w:hyperlink>
       <w:r>
         <w:t xml:space="preserve">.</w:t>
       </w:r>
     </w:p>
-    <w:bookmarkEnd w:id="63"/>
-    <w:bookmarkStart w:id="65" w:name="ref-fisher2018"/>
+    <w:bookmarkEnd w:id="64"/>
+    <w:bookmarkStart w:id="66" w:name="ref-fang2023"/>
     <w:p>
       <w:pPr>
         <w:pStyle w:val="Bibliography"/>
       </w:pPr>
       <w:r>
-        <w:t xml:space="preserve">Fisher, M. C., N. J. Hawkins, D. Sanglard, and S. J. Gurr. 2018.</w:t>
-      </w:r>
-      <w:r>
-        <w:t xml:space="preserve"> </w:t>
-      </w:r>
-      <w:r>
-        <w:t xml:space="preserve">“Worldwide Emergence of Resistance to Antifungal Drugs Challenges Human Health and Food Security.”</w:t>
+        <w:t xml:space="preserve">Fang, Z., X. Liu, and G. Peltz. 2023.</w:t>
+      </w:r>
+      <w:r>
+        <w:t xml:space="preserve"> </w:t>
+      </w:r>
+      <w:r>
+        <w:t xml:space="preserve">“GSEApy: A Comprehensive Package for Performing Gene Set Enrichment Analysis in Python.”</w:t>
       </w:r>
       <w:r>
         <w:t xml:space="preserve"> </w:t>
@@ -6089,43 +6135,43 @@
           <w:i/>
           <w:iCs/>
         </w:rPr>
-        <w:t xml:space="preserve">Science</w:t>
-      </w:r>
-      <w:r>
-        <w:t xml:space="preserve"> </w:t>
-      </w:r>
-      <w:r>
-        <w:t xml:space="preserve">360: 739–42.</w:t>
-      </w:r>
-      <w:r>
-        <w:t xml:space="preserve"> </w:t>
-      </w:r>
-      <w:hyperlink r:id="rId64">
-        <w:r>
-          <w:rPr>
-            <w:rStyle w:val="Hyperlink"/>
-          </w:rPr>
-          <w:t xml:space="preserve">https://doi.org/10.1126/science.aap7999</w:t>
+        <w:t xml:space="preserve">Bioinformatics</w:t>
+      </w:r>
+      <w:r>
+        <w:t xml:space="preserve"> </w:t>
+      </w:r>
+      <w:r>
+        <w:t xml:space="preserve">39 (1): btac757.</w:t>
+      </w:r>
+      <w:r>
+        <w:t xml:space="preserve"> </w:t>
+      </w:r>
+      <w:hyperlink r:id="rId65">
+        <w:r>
+          <w:rPr>
+            <w:rStyle w:val="Hyperlink"/>
+          </w:rPr>
+          <w:t xml:space="preserve">https://doi.org/10.1093/bioinformatics/btac757</w:t>
         </w:r>
       </w:hyperlink>
       <w:r>
         <w:t xml:space="preserve">.</w:t>
       </w:r>
     </w:p>
-    <w:bookmarkEnd w:id="65"/>
-    <w:bookmarkStart w:id="67" w:name="ref-fones2015"/>
+    <w:bookmarkEnd w:id="66"/>
+    <w:bookmarkStart w:id="68" w:name="ref-fisher2018"/>
     <w:p>
       <w:pPr>
         <w:pStyle w:val="Bibliography"/>
       </w:pPr>
       <w:r>
-        <w:t xml:space="preserve">Fones, H., and S. Gurr. 2015.</w:t>
-      </w:r>
-      <w:r>
-        <w:t xml:space="preserve"> </w:t>
-      </w:r>
-      <w:r>
-        <w:t xml:space="preserve">“The Impact of Septoria Tritici Blotch Disease on Wheat: An EU Perspective.”</w:t>
+        <w:t xml:space="preserve">Fisher, M. C., N. J. Hawkins, D. Sanglard, and S. J. Gurr. 2018.</w:t>
+      </w:r>
+      <w:r>
+        <w:t xml:space="preserve"> </w:t>
+      </w:r>
+      <w:r>
+        <w:t xml:space="preserve">“Worldwide Emergence of Resistance to Antifungal Drugs Challenges Human Health and Food Security.”</w:t>
       </w:r>
       <w:r>
         <w:t xml:space="preserve"> </w:t>
@@ -6135,43 +6181,43 @@
           <w:i/>
           <w:iCs/>
         </w:rPr>
-        <w:t xml:space="preserve">Fungal Genetics and Biology</w:t>
-      </w:r>
-      <w:r>
-        <w:t xml:space="preserve"> </w:t>
-      </w:r>
-      <w:r>
-        <w:t xml:space="preserve">79: 3–7.</w:t>
-      </w:r>
-      <w:r>
-        <w:t xml:space="preserve"> </w:t>
-      </w:r>
-      <w:hyperlink r:id="rId66">
-        <w:r>
-          <w:rPr>
-            <w:rStyle w:val="Hyperlink"/>
-          </w:rPr>
-          <w:t xml:space="preserve">https://doi.org/10.1016/j.fgb.2015.04.004</w:t>
+        <w:t xml:space="preserve">Science</w:t>
+      </w:r>
+      <w:r>
+        <w:t xml:space="preserve"> </w:t>
+      </w:r>
+      <w:r>
+        <w:t xml:space="preserve">360: 739–42.</w:t>
+      </w:r>
+      <w:r>
+        <w:t xml:space="preserve"> </w:t>
+      </w:r>
+      <w:hyperlink r:id="rId67">
+        <w:r>
+          <w:rPr>
+            <w:rStyle w:val="Hyperlink"/>
+          </w:rPr>
+          <w:t xml:space="preserve">https://doi.org/10.1126/science.aap7999</w:t>
         </w:r>
       </w:hyperlink>
       <w:r>
         <w:t xml:space="preserve">.</w:t>
       </w:r>
     </w:p>
-    <w:bookmarkEnd w:id="67"/>
-    <w:bookmarkStart w:id="69" w:name="ref-gillooly2001"/>
+    <w:bookmarkEnd w:id="68"/>
+    <w:bookmarkStart w:id="70" w:name="ref-fisher2012"/>
     <w:p>
       <w:pPr>
         <w:pStyle w:val="Bibliography"/>
       </w:pPr>
       <w:r>
-        <w:t xml:space="preserve">Gillooly, J. F., J. H. Brown, G. B. West, V. M. Savage, and E. L. Charnov. 2001.</w:t>
-      </w:r>
-      <w:r>
-        <w:t xml:space="preserve"> </w:t>
-      </w:r>
-      <w:r>
-        <w:t xml:space="preserve">“Effects of Size and Temperature on Metabolic Rate.”</w:t>
+        <w:t xml:space="preserve">Fisher, Matthew C., Daniel A. Henk, Cheryl J. Briggs, et al. 2012.</w:t>
+      </w:r>
+      <w:r>
+        <w:t xml:space="preserve"> </w:t>
+      </w:r>
+      <w:r>
+        <w:t xml:space="preserve">“Emerging Fungal Threats to Animal, Plant and Ecosystem Health.”</w:t>
       </w:r>
       <w:r>
         <w:t xml:space="preserve"> </w:t>
@@ -6181,46 +6227,43 @@
           <w:i/>
           <w:iCs/>
         </w:rPr>
-        <w:t xml:space="preserve">Science</w:t>
-      </w:r>
-      <w:r>
-        <w:t xml:space="preserve"> </w:t>
-      </w:r>
-      <w:r>
-        <w:t xml:space="preserve">293: 2248–51.</w:t>
-      </w:r>
-      <w:r>
-        <w:t xml:space="preserve"> </w:t>
-      </w:r>
-      <w:hyperlink r:id="rId68">
-        <w:r>
-          <w:rPr>
-            <w:rStyle w:val="Hyperlink"/>
-          </w:rPr>
-          <w:t xml:space="preserve">https://doi.org/10.1126/science.1061967</w:t>
+        <w:t xml:space="preserve">Nature</w:t>
+      </w:r>
+      <w:r>
+        <w:t xml:space="preserve"> </w:t>
+      </w:r>
+      <w:r>
+        <w:t xml:space="preserve">484 (7393): 186–94.</w:t>
+      </w:r>
+      <w:r>
+        <w:t xml:space="preserve"> </w:t>
+      </w:r>
+      <w:hyperlink r:id="rId69">
+        <w:r>
+          <w:rPr>
+            <w:rStyle w:val="Hyperlink"/>
+          </w:rPr>
+          <w:t xml:space="preserve">https://doi.org/10.1038/nature10947</w:t>
         </w:r>
       </w:hyperlink>
       <w:r>
         <w:t xml:space="preserve">.</w:t>
       </w:r>
     </w:p>
-    <w:bookmarkEnd w:id="69"/>
-    <w:bookmarkStart w:id="71" w:name="ref-goodwin2011"/>
+    <w:bookmarkEnd w:id="70"/>
+    <w:bookmarkStart w:id="72" w:name="ref-fones2015"/>
     <w:p>
       <w:pPr>
         <w:pStyle w:val="Bibliography"/>
       </w:pPr>
       <w:r>
-        <w:t xml:space="preserve">Goodwin, S. B. et al.</w:t>
-      </w:r>
-      <w:r>
-        <w:t xml:space="preserve"> 2011.</w:t>
-      </w:r>
-      <w:r>
-        <w:t xml:space="preserve"> </w:t>
-      </w:r>
-      <w:r>
-        <w:t xml:space="preserve">“Finished Genome of the Fungal Wheat Pathogen Mycosphaerella Graminicola Reveals Dispensome Structure, Chromosome Plasticity, and Stealth Pathogenesis.”</w:t>
+        <w:t xml:space="preserve">Fones, H., and S. Gurr. 2015.</w:t>
+      </w:r>
+      <w:r>
+        <w:t xml:space="preserve"> </w:t>
+      </w:r>
+      <w:r>
+        <w:t xml:space="preserve">“The Impact of Septoria Tritici Blotch Disease on Wheat: An EU Perspective.”</w:t>
       </w:r>
       <w:r>
         <w:t xml:space="preserve"> </w:t>
@@ -6230,46 +6273,43 @@
           <w:i/>
           <w:iCs/>
         </w:rPr>
-        <w:t xml:space="preserve">PLoS Genetics</w:t>
-      </w:r>
-      <w:r>
-        <w:t xml:space="preserve"> </w:t>
-      </w:r>
-      <w:r>
-        <w:t xml:space="preserve">7(6): e1002070.</w:t>
-      </w:r>
-      <w:r>
-        <w:t xml:space="preserve"> </w:t>
-      </w:r>
-      <w:hyperlink r:id="rId70">
-        <w:r>
-          <w:rPr>
-            <w:rStyle w:val="Hyperlink"/>
-          </w:rPr>
-          <w:t xml:space="preserve">https://doi.org/10.1371/journal.pgen.1002070</w:t>
+        <w:t xml:space="preserve">Fungal Genetics and Biology</w:t>
+      </w:r>
+      <w:r>
+        <w:t xml:space="preserve"> </w:t>
+      </w:r>
+      <w:r>
+        <w:t xml:space="preserve">79: 3–7.</w:t>
+      </w:r>
+      <w:r>
+        <w:t xml:space="preserve"> </w:t>
+      </w:r>
+      <w:hyperlink r:id="rId71">
+        <w:r>
+          <w:rPr>
+            <w:rStyle w:val="Hyperlink"/>
+          </w:rPr>
+          <w:t xml:space="preserve">https://doi.org/10.1016/j.fgb.2015.04.004</w:t>
         </w:r>
       </w:hyperlink>
       <w:r>
         <w:t xml:space="preserve">.</w:t>
       </w:r>
     </w:p>
-    <w:bookmarkEnd w:id="71"/>
-    <w:bookmarkStart w:id="73" w:name="ref-holmstrup2010"/>
+    <w:bookmarkEnd w:id="72"/>
+    <w:bookmarkStart w:id="74" w:name="ref-gillooly2001"/>
     <w:p>
       <w:pPr>
         <w:pStyle w:val="Bibliography"/>
       </w:pPr>
       <w:r>
-        <w:t xml:space="preserve">Holmstrup, M. et al.</w:t>
-      </w:r>
-      <w:r>
-        <w:t xml:space="preserve"> 2010.</w:t>
-      </w:r>
-      <w:r>
-        <w:t xml:space="preserve"> </w:t>
-      </w:r>
-      <w:r>
-        <w:t xml:space="preserve">“Interactions Between Effects of Environmental Chemicals and Natural Stressors: A Review.”</w:t>
+        <w:t xml:space="preserve">Gillooly, J. F., J. H. Brown, G. B. West, V. M. Savage, and E. L. Charnov. 2001.</w:t>
+      </w:r>
+      <w:r>
+        <w:t xml:space="preserve"> </w:t>
+      </w:r>
+      <w:r>
+        <w:t xml:space="preserve">“Effects of Size and Temperature on Metabolic Rate.”</w:t>
       </w:r>
       <w:r>
         <w:t xml:space="preserve"> </w:t>
@@ -6279,46 +6319,43 @@
           <w:i/>
           <w:iCs/>
         </w:rPr>
-        <w:t xml:space="preserve">Science of the Total Environment</w:t>
-      </w:r>
-      <w:r>
-        <w:t xml:space="preserve"> </w:t>
-      </w:r>
-      <w:r>
-        <w:t xml:space="preserve">408: 3746–62.</w:t>
-      </w:r>
-      <w:r>
-        <w:t xml:space="preserve"> </w:t>
-      </w:r>
-      <w:hyperlink r:id="rId72">
-        <w:r>
-          <w:rPr>
-            <w:rStyle w:val="Hyperlink"/>
-          </w:rPr>
-          <w:t xml:space="preserve">https://doi.org/10.1016/j.scitotenv.2009.10.067</w:t>
+        <w:t xml:space="preserve">Science</w:t>
+      </w:r>
+      <w:r>
+        <w:t xml:space="preserve"> </w:t>
+      </w:r>
+      <w:r>
+        <w:t xml:space="preserve">293: 2248–51.</w:t>
+      </w:r>
+      <w:r>
+        <w:t xml:space="preserve"> </w:t>
+      </w:r>
+      <w:hyperlink r:id="rId73">
+        <w:r>
+          <w:rPr>
+            <w:rStyle w:val="Hyperlink"/>
+          </w:rPr>
+          <w:t xml:space="preserve">https://doi.org/10.1126/science.1061967</w:t>
         </w:r>
       </w:hyperlink>
       <w:r>
         <w:t xml:space="preserve">.</w:t>
       </w:r>
     </w:p>
-    <w:bookmarkEnd w:id="73"/>
-    <w:bookmarkStart w:id="75" w:name="ref-jorgensen2022"/>
+    <w:bookmarkEnd w:id="74"/>
+    <w:bookmarkStart w:id="76" w:name="ref-goodwin2011"/>
     <w:p>
       <w:pPr>
         <w:pStyle w:val="Bibliography"/>
       </w:pPr>
       <w:r>
-        <w:t xml:space="preserve">Jørgensen, L. N. et al.</w:t>
-      </w:r>
-      <w:r>
-        <w:t xml:space="preserve"> 2022.</w:t>
-      </w:r>
-      <w:r>
-        <w:t xml:space="preserve"> </w:t>
-      </w:r>
-      <w:r>
-        <w:t xml:space="preserve">“Shifting Sensitivity of Septoria Tritici Blotch Compromises Field Performance and Yield of Main Fungicides in Europe.”</w:t>
+        <w:t xml:space="preserve">Goodwin, Stephen B., Sarrah Ben M’Barek, Braham Dhillon, et al. 2011.</w:t>
+      </w:r>
+      <w:r>
+        <w:t xml:space="preserve"> </w:t>
+      </w:r>
+      <w:r>
+        <w:t xml:space="preserve">“Finished Genome of the Fungal Wheat Pathogen Mycosphaerella Graminicola Reveals Dispensome Structure, Chromosome Plasticity, and Stealth Pathogenesis.”</w:t>
       </w:r>
       <w:r>
         <w:t xml:space="preserve"> </w:t>
@@ -6328,43 +6365,43 @@
           <w:i/>
           <w:iCs/>
         </w:rPr>
-        <w:t xml:space="preserve">Frontiers in Plant Science</w:t>
-      </w:r>
-      <w:r>
-        <w:t xml:space="preserve"> </w:t>
-      </w:r>
-      <w:r>
-        <w:t xml:space="preserve">13: 1060428.</w:t>
-      </w:r>
-      <w:r>
-        <w:t xml:space="preserve"> </w:t>
-      </w:r>
-      <w:hyperlink r:id="rId74">
-        <w:r>
-          <w:rPr>
-            <w:rStyle w:val="Hyperlink"/>
-          </w:rPr>
-          <w:t xml:space="preserve">https://doi.org/10.3389/fpls.2022.1060428</w:t>
+        <w:t xml:space="preserve">PLoS Genetics</w:t>
+      </w:r>
+      <w:r>
+        <w:t xml:space="preserve"> </w:t>
+      </w:r>
+      <w:r>
+        <w:t xml:space="preserve">7 (6): e1002070.</w:t>
+      </w:r>
+      <w:r>
+        <w:t xml:space="preserve"> </w:t>
+      </w:r>
+      <w:hyperlink r:id="rId75">
+        <w:r>
+          <w:rPr>
+            <w:rStyle w:val="Hyperlink"/>
+          </w:rPr>
+          <w:t xml:space="preserve">https://doi.org/10.1371/journal.pgen.1002070</w:t>
         </w:r>
       </w:hyperlink>
       <w:r>
         <w:t xml:space="preserve">.</w:t>
       </w:r>
     </w:p>
-    <w:bookmarkEnd w:id="75"/>
-    <w:bookmarkStart w:id="77" w:name="ref-joseph-horne2001"/>
+    <w:bookmarkEnd w:id="76"/>
+    <w:bookmarkStart w:id="78" w:name="ref-holmstrup2010"/>
     <w:p>
       <w:pPr>
         <w:pStyle w:val="Bibliography"/>
       </w:pPr>
       <w:r>
-        <w:t xml:space="preserve">Joseph-Horne, T., D. W. Hollomon, and P. M. Wood. 2001.</w:t>
-      </w:r>
-      <w:r>
-        <w:t xml:space="preserve"> </w:t>
-      </w:r>
-      <w:r>
-        <w:t xml:space="preserve">“Fungal Respiration: A Fusion of Standard and Alternative Components.”</w:t>
+        <w:t xml:space="preserve">Holmstrup, Martin, Anne-Mette Bindesbøl, Gertie Janneke Oostingh, et al. 2010.</w:t>
+      </w:r>
+      <w:r>
+        <w:t xml:space="preserve"> </w:t>
+      </w:r>
+      <w:r>
+        <w:t xml:space="preserve">“Interactions Between Effects of Environmental Chemicals and Natural Stressors: A Review.”</w:t>
       </w:r>
       <w:r>
         <w:t xml:space="preserve"> </w:t>
@@ -6374,43 +6411,43 @@
           <w:i/>
           <w:iCs/>
         </w:rPr>
-        <w:t xml:space="preserve">Biochimica Et Biophysica Acta</w:t>
-      </w:r>
-      <w:r>
-        <w:t xml:space="preserve"> </w:t>
-      </w:r>
-      <w:r>
-        <w:t xml:space="preserve">1504: 179–95.</w:t>
-      </w:r>
-      <w:r>
-        <w:t xml:space="preserve"> </w:t>
-      </w:r>
-      <w:hyperlink r:id="rId76">
-        <w:r>
-          <w:rPr>
-            <w:rStyle w:val="Hyperlink"/>
-          </w:rPr>
-          <w:t xml:space="preserve">https://doi.org/10.1016/S0005-2728(00)00251-6</w:t>
+        <w:t xml:space="preserve">Science of the Total Environment</w:t>
+      </w:r>
+      <w:r>
+        <w:t xml:space="preserve"> </w:t>
+      </w:r>
+      <w:r>
+        <w:t xml:space="preserve">408: 3746–62.</w:t>
+      </w:r>
+      <w:r>
+        <w:t xml:space="preserve"> </w:t>
+      </w:r>
+      <w:hyperlink r:id="rId77">
+        <w:r>
+          <w:rPr>
+            <w:rStyle w:val="Hyperlink"/>
+          </w:rPr>
+          <w:t xml:space="preserve">https://doi.org/10.1016/j.scitotenv.2009.10.067</w:t>
         </w:r>
       </w:hyperlink>
       <w:r>
         <w:t xml:space="preserve">.</w:t>
       </w:r>
     </w:p>
-    <w:bookmarkEnd w:id="77"/>
-    <w:bookmarkStart w:id="79" w:name="ref-juroszek2022"/>
+    <w:bookmarkEnd w:id="78"/>
+    <w:bookmarkStart w:id="80" w:name="ref-jorgensen2022"/>
     <w:p>
       <w:pPr>
         <w:pStyle w:val="Bibliography"/>
       </w:pPr>
       <w:r>
-        <w:t xml:space="preserve">Juroszek, P., M. Laborde, B. Kleinhenz, M. Mellenthin, P. Racca, and H. Sierotzki. 2022.</w:t>
-      </w:r>
-      <w:r>
-        <w:t xml:space="preserve"> </w:t>
-      </w:r>
-      <w:r>
-        <w:t xml:space="preserve">“A Review on the Potential Effects of Temperature on Fungicide Effectiveness.”</w:t>
+        <w:t xml:space="preserve">Jørgensen, Lise Nistrup, Niels Matzen, Thies Marten Heick, et al. 2022.</w:t>
+      </w:r>
+      <w:r>
+        <w:t xml:space="preserve"> </w:t>
+      </w:r>
+      <w:r>
+        <w:t xml:space="preserve">“Shifting Sensitivity of Septoria Tritici Blotch Compromises Field Performance and Yield of Main Fungicides in Europe.”</w:t>
       </w:r>
       <w:r>
         <w:t xml:space="preserve"> </w:t>
@@ -6420,43 +6457,43 @@
           <w:i/>
           <w:iCs/>
         </w:rPr>
-        <w:t xml:space="preserve">Plant Pathology</w:t>
-      </w:r>
-      <w:r>
-        <w:t xml:space="preserve"> </w:t>
-      </w:r>
-      <w:r>
-        <w:t xml:space="preserve">71: 775–84.</w:t>
-      </w:r>
-      <w:r>
-        <w:t xml:space="preserve"> </w:t>
-      </w:r>
-      <w:hyperlink r:id="rId78">
-        <w:r>
-          <w:rPr>
-            <w:rStyle w:val="Hyperlink"/>
-          </w:rPr>
-          <w:t xml:space="preserve">https://doi.org/10.1111/ppa.13531</w:t>
+        <w:t xml:space="preserve">Frontiers in Plant Science</w:t>
+      </w:r>
+      <w:r>
+        <w:t xml:space="preserve"> </w:t>
+      </w:r>
+      <w:r>
+        <w:t xml:space="preserve">13: 1060428.</w:t>
+      </w:r>
+      <w:r>
+        <w:t xml:space="preserve"> </w:t>
+      </w:r>
+      <w:hyperlink r:id="rId79">
+        <w:r>
+          <w:rPr>
+            <w:rStyle w:val="Hyperlink"/>
+          </w:rPr>
+          <w:t xml:space="preserve">https://doi.org/10.3389/fpls.2022.1060428</w:t>
         </w:r>
       </w:hyperlink>
       <w:r>
         <w:t xml:space="preserve">.</w:t>
       </w:r>
     </w:p>
-    <w:bookmarkEnd w:id="79"/>
-    <w:bookmarkStart w:id="81" w:name="ref-kellner2014"/>
+    <w:bookmarkEnd w:id="80"/>
+    <w:bookmarkStart w:id="82" w:name="ref-joseph-horne2001"/>
     <w:p>
       <w:pPr>
         <w:pStyle w:val="Bibliography"/>
       </w:pPr>
       <w:r>
-        <w:t xml:space="preserve">Kellner, R., A. Bhattacharyya, S. Poppe, T. Y. Hsu, R. B. Brem, and E. H. Stukenbrock. 2014.</w:t>
-      </w:r>
-      <w:r>
-        <w:t xml:space="preserve"> </w:t>
-      </w:r>
-      <w:r>
-        <w:t xml:space="preserve">“Expression Profiling of the Wheat Pathogen Zymoseptoria Tritici Reveals Genomic Patterns of Transcription and Host-Specific Regulatory Programs.”</w:t>
+        <w:t xml:space="preserve">Joseph-Horne, T., D. W. Hollomon, and P. M. Wood. 2001.</w:t>
+      </w:r>
+      <w:r>
+        <w:t xml:space="preserve"> </w:t>
+      </w:r>
+      <w:r>
+        <w:t xml:space="preserve">“Fungal Respiration: A Fusion of Standard and Alternative Components.”</w:t>
       </w:r>
       <w:r>
         <w:t xml:space="preserve"> </w:t>
@@ -6466,43 +6503,43 @@
           <w:i/>
           <w:iCs/>
         </w:rPr>
-        <w:t xml:space="preserve">Genome Biology and Evolution</w:t>
-      </w:r>
-      <w:r>
-        <w:t xml:space="preserve"> </w:t>
-      </w:r>
-      <w:r>
-        <w:t xml:space="preserve">6(6): 1353–65.</w:t>
-      </w:r>
-      <w:r>
-        <w:t xml:space="preserve"> </w:t>
-      </w:r>
-      <w:hyperlink r:id="rId80">
-        <w:r>
-          <w:rPr>
-            <w:rStyle w:val="Hyperlink"/>
-          </w:rPr>
-          <w:t xml:space="preserve">https://doi.org/10.1093/gbe/evu101</w:t>
+        <w:t xml:space="preserve">Biochimica Et Biophysica Acta (BBA) - Bioenergetics</w:t>
+      </w:r>
+      <w:r>
+        <w:t xml:space="preserve"> </w:t>
+      </w:r>
+      <w:r>
+        <w:t xml:space="preserve">1504: 179–95.</w:t>
+      </w:r>
+      <w:r>
+        <w:t xml:space="preserve"> </w:t>
+      </w:r>
+      <w:hyperlink r:id="rId81">
+        <w:r>
+          <w:rPr>
+            <w:rStyle w:val="Hyperlink"/>
+          </w:rPr>
+          <w:t xml:space="preserve">https://doi.org/10.1016/S0005-2728(00)00251-6</w:t>
         </w:r>
       </w:hyperlink>
       <w:r>
         <w:t xml:space="preserve">.</w:t>
       </w:r>
     </w:p>
-    <w:bookmarkEnd w:id="81"/>
-    <w:bookmarkStart w:id="83" w:name="ref-leach2014"/>
+    <w:bookmarkEnd w:id="82"/>
+    <w:bookmarkStart w:id="84" w:name="ref-juroszek2022"/>
     <w:p>
       <w:pPr>
         <w:pStyle w:val="Bibliography"/>
       </w:pPr>
       <w:r>
-        <w:t xml:space="preserve">Leach, M. D., and L. E. Cowen. 2014.</w:t>
-      </w:r>
-      <w:r>
-        <w:t xml:space="preserve"> </w:t>
-      </w:r>
-      <w:r>
-        <w:t xml:space="preserve">“Membrane Fluidity and Temperature Sensing Are Coupled via Circuitry Comprised of Ole1, Rsp5, and Hsf1 in Candida Albicans.”</w:t>
+        <w:t xml:space="preserve">Juroszek, P., M. Laborde, B. Kleinhenz, M. Mellenthin, P. Racca, and H. Sierotzki. 2022.</w:t>
+      </w:r>
+      <w:r>
+        <w:t xml:space="preserve"> </w:t>
+      </w:r>
+      <w:r>
+        <w:t xml:space="preserve">“A Review on the Potential Effects of Temperature on Fungicide Effectiveness.”</w:t>
       </w:r>
       <w:r>
         <w:t xml:space="preserve"> </w:t>
@@ -6512,43 +6549,43 @@
           <w:i/>
           <w:iCs/>
         </w:rPr>
-        <w:t xml:space="preserve">Eukaryotic Cell</w:t>
-      </w:r>
-      <w:r>
-        <w:t xml:space="preserve"> </w:t>
-      </w:r>
-      <w:r>
-        <w:t xml:space="preserve">13(8): 1077–84.</w:t>
-      </w:r>
-      <w:r>
-        <w:t xml:space="preserve"> </w:t>
-      </w:r>
-      <w:hyperlink r:id="rId82">
-        <w:r>
-          <w:rPr>
-            <w:rStyle w:val="Hyperlink"/>
-          </w:rPr>
-          <w:t xml:space="preserve">https://doi.org/10.1128/EC.00138-14</w:t>
+        <w:t xml:space="preserve">Plant Pathology</w:t>
+      </w:r>
+      <w:r>
+        <w:t xml:space="preserve"> </w:t>
+      </w:r>
+      <w:r>
+        <w:t xml:space="preserve">71: 775–84.</w:t>
+      </w:r>
+      <w:r>
+        <w:t xml:space="preserve"> </w:t>
+      </w:r>
+      <w:hyperlink r:id="rId83">
+        <w:r>
+          <w:rPr>
+            <w:rStyle w:val="Hyperlink"/>
+          </w:rPr>
+          <w:t xml:space="preserve">https://doi.org/10.1111/ppa.13531</w:t>
         </w:r>
       </w:hyperlink>
       <w:r>
         <w:t xml:space="preserve">.</w:t>
       </w:r>
     </w:p>
-    <w:bookmarkEnd w:id="83"/>
-    <w:bookmarkStart w:id="85" w:name="ref-lendenmann2016"/>
+    <w:bookmarkEnd w:id="84"/>
+    <w:bookmarkStart w:id="86" w:name="ref-kellner2014"/>
     <w:p>
       <w:pPr>
         <w:pStyle w:val="Bibliography"/>
       </w:pPr>
       <w:r>
-        <w:t xml:space="preserve">Lendenmann, M. H., D. Croll, J. Palma-Guerrero, E. L. Stewart, and B. A. McDonald. 2016.</w:t>
-      </w:r>
-      <w:r>
-        <w:t xml:space="preserve"> </w:t>
-      </w:r>
-      <w:r>
-        <w:t xml:space="preserve">“QTL Mapping of Temperature Sensitivity Reveals Candidate Genes for Thermal Adaptation and Growth Morphology in the Plant Pathogenic Fungus Zymoseptoria Tritici.”</w:t>
+        <w:t xml:space="preserve">Kellner, R., A. Bhattacharyya, S. Poppe, T. Y. Hsu, R. B. Brem, and E. H. Stukenbrock. 2014.</w:t>
+      </w:r>
+      <w:r>
+        <w:t xml:space="preserve"> </w:t>
+      </w:r>
+      <w:r>
+        <w:t xml:space="preserve">“Expression Profiling of the Wheat Pathogen Zymoseptoria Tritici Reveals Genomic Patterns of Transcription and Host-Specific Regulatory Programs.”</w:t>
       </w:r>
       <w:r>
         <w:t xml:space="preserve"> </w:t>
@@ -6558,43 +6595,43 @@
           <w:i/>
           <w:iCs/>
         </w:rPr>
-        <w:t xml:space="preserve">Heredity</w:t>
-      </w:r>
-      <w:r>
-        <w:t xml:space="preserve"> </w:t>
-      </w:r>
-      <w:r>
-        <w:t xml:space="preserve">116: 384–94.</w:t>
-      </w:r>
-      <w:r>
-        <w:t xml:space="preserve"> </w:t>
-      </w:r>
-      <w:hyperlink r:id="rId84">
-        <w:r>
-          <w:rPr>
-            <w:rStyle w:val="Hyperlink"/>
-          </w:rPr>
-          <w:t xml:space="preserve">https://doi.org/10.1038/hdy.2015.111</w:t>
+        <w:t xml:space="preserve">Genome Biology and Evolution</w:t>
+      </w:r>
+      <w:r>
+        <w:t xml:space="preserve"> </w:t>
+      </w:r>
+      <w:r>
+        <w:t xml:space="preserve">6 (6): 1353–65.</w:t>
+      </w:r>
+      <w:r>
+        <w:t xml:space="preserve"> </w:t>
+      </w:r>
+      <w:hyperlink r:id="rId85">
+        <w:r>
+          <w:rPr>
+            <w:rStyle w:val="Hyperlink"/>
+          </w:rPr>
+          <w:t xml:space="preserve">https://doi.org/10.1093/gbe/evu101</w:t>
         </w:r>
       </w:hyperlink>
       <w:r>
         <w:t xml:space="preserve">.</w:t>
       </w:r>
     </w:p>
-    <w:bookmarkEnd w:id="85"/>
-    <w:bookmarkStart w:id="87" w:name="ref-love2014"/>
+    <w:bookmarkEnd w:id="86"/>
+    <w:bookmarkStart w:id="88" w:name="ref-kobayashi2002"/>
     <w:p>
       <w:pPr>
         <w:pStyle w:val="Bibliography"/>
       </w:pPr>
       <w:r>
-        <w:t xml:space="preserve">Love, M. I., W. Huber, and S. Anders. 2014.</w:t>
-      </w:r>
-      <w:r>
-        <w:t xml:space="preserve"> </w:t>
-      </w:r>
-      <w:r>
-        <w:t xml:space="preserve">“Moderated Estimation of Fold Change and Dispersion for RNA-Seq Data with DESeq2.”</w:t>
+        <w:t xml:space="preserve">Kobayashi, Daisuke, Kazuhiro Kondo, Norio Uehara, et al. 2002.</w:t>
+      </w:r>
+      <w:r>
+        <w:t xml:space="preserve"> </w:t>
+      </w:r>
+      <w:r>
+        <w:t xml:space="preserve">“Endogenous Reactive Oxygen Species Is an Important Mediator of Miconazole Antifungal Effect.”</w:t>
       </w:r>
       <w:r>
         <w:t xml:space="preserve"> </w:t>
@@ -6604,43 +6641,43 @@
           <w:i/>
           <w:iCs/>
         </w:rPr>
-        <w:t xml:space="preserve">Genome Biology</w:t>
-      </w:r>
-      <w:r>
-        <w:t xml:space="preserve"> </w:t>
-      </w:r>
-      <w:r>
-        <w:t xml:space="preserve">15(12): 550.</w:t>
-      </w:r>
-      <w:r>
-        <w:t xml:space="preserve"> </w:t>
-      </w:r>
-      <w:hyperlink r:id="rId86">
-        <w:r>
-          <w:rPr>
-            <w:rStyle w:val="Hyperlink"/>
-          </w:rPr>
-          <w:t xml:space="preserve">https://doi.org/10.1186/s13059-014-0550-8</w:t>
+        <w:t xml:space="preserve">Antimicrobial Agents and Chemotherapy</w:t>
+      </w:r>
+      <w:r>
+        <w:t xml:space="preserve"> </w:t>
+      </w:r>
+      <w:r>
+        <w:t xml:space="preserve">46 (10): 3113–17.</w:t>
+      </w:r>
+      <w:r>
+        <w:t xml:space="preserve"> </w:t>
+      </w:r>
+      <w:hyperlink r:id="rId87">
+        <w:r>
+          <w:rPr>
+            <w:rStyle w:val="Hyperlink"/>
+          </w:rPr>
+          <w:t xml:space="preserve">https://doi.org/10.1128/AAC.46.10.3113-3117.2002</w:t>
         </w:r>
       </w:hyperlink>
       <w:r>
         <w:t xml:space="preserve">.</w:t>
       </w:r>
     </w:p>
-    <w:bookmarkEnd w:id="87"/>
-    <w:bookmarkStart w:id="89" w:name="ref-lucas2015"/>
+    <w:bookmarkEnd w:id="88"/>
+    <w:bookmarkStart w:id="90" w:name="ref-leach2014"/>
     <w:p>
       <w:pPr>
         <w:pStyle w:val="Bibliography"/>
       </w:pPr>
       <w:r>
-        <w:t xml:space="preserve">Lucas, J. A., N. J. Hawkins, and B. A. Fraaije. 2015.</w:t>
-      </w:r>
-      <w:r>
-        <w:t xml:space="preserve"> </w:t>
-      </w:r>
-      <w:r>
-        <w:t xml:space="preserve">“The Evolution of Fungicide Resistance.”</w:t>
+        <w:t xml:space="preserve">Leach, M. D., and L. E. Cowen. 2014.</w:t>
+      </w:r>
+      <w:r>
+        <w:t xml:space="preserve"> </w:t>
+      </w:r>
+      <w:r>
+        <w:t xml:space="preserve">“Membrane Fluidity and Temperature Sensing Are Coupled via Circuitry Comprised of Ole1, Rsp5, and Hsf1 in Candida Albicans.”</w:t>
       </w:r>
       <w:r>
         <w:t xml:space="preserve"> </w:t>
@@ -6650,43 +6687,43 @@
           <w:i/>
           <w:iCs/>
         </w:rPr>
-        <w:t xml:space="preserve">Advances in Applied Microbiology</w:t>
-      </w:r>
-      <w:r>
-        <w:t xml:space="preserve"> </w:t>
-      </w:r>
-      <w:r>
-        <w:t xml:space="preserve">90: 29–92.</w:t>
-      </w:r>
-      <w:r>
-        <w:t xml:space="preserve"> </w:t>
-      </w:r>
-      <w:hyperlink r:id="rId88">
-        <w:r>
-          <w:rPr>
-            <w:rStyle w:val="Hyperlink"/>
-          </w:rPr>
-          <w:t xml:space="preserve">https://doi.org/10.1016/bs.aambs.2014.09.001</w:t>
+        <w:t xml:space="preserve">Eukaryotic Cell</w:t>
+      </w:r>
+      <w:r>
+        <w:t xml:space="preserve"> </w:t>
+      </w:r>
+      <w:r>
+        <w:t xml:space="preserve">13 (8): 1077–84.</w:t>
+      </w:r>
+      <w:r>
+        <w:t xml:space="preserve"> </w:t>
+      </w:r>
+      <w:hyperlink r:id="rId89">
+        <w:r>
+          <w:rPr>
+            <w:rStyle w:val="Hyperlink"/>
+          </w:rPr>
+          <w:t xml:space="preserve">https://doi.org/10.1128/EC.00138-14</w:t>
         </w:r>
       </w:hyperlink>
       <w:r>
         <w:t xml:space="preserve">.</w:t>
       </w:r>
     </w:p>
-    <w:bookmarkEnd w:id="89"/>
-    <w:bookmarkStart w:id="91" w:name="ref-manzoni2012"/>
+    <w:bookmarkEnd w:id="90"/>
+    <w:bookmarkStart w:id="92" w:name="ref-lendenmann2016"/>
     <w:p>
       <w:pPr>
         <w:pStyle w:val="Bibliography"/>
       </w:pPr>
       <w:r>
-        <w:t xml:space="preserve">Manzoni, S., P. Taylor, A. Richter, A. Porporato, and G. I. Ågren. 2012.</w:t>
-      </w:r>
-      <w:r>
-        <w:t xml:space="preserve"> </w:t>
-      </w:r>
-      <w:r>
-        <w:t xml:space="preserve">“Environmental and Stoichiometric Controls on Microbial Carbon-Use Efficiency in Soils.”</w:t>
+        <w:t xml:space="preserve">Lendenmann, M. H., D. Croll, J. Palma-Guerrero, E. L. Stewart, and B. A. McDonald. 2016.</w:t>
+      </w:r>
+      <w:r>
+        <w:t xml:space="preserve"> </w:t>
+      </w:r>
+      <w:r>
+        <w:t xml:space="preserve">“QTL Mapping of Temperature Sensitivity Reveals Candidate Genes for Thermal Adaptation and Growth Morphology in the Plant Pathogenic Fungus Zymoseptoria Tritici.”</w:t>
       </w:r>
       <w:r>
         <w:t xml:space="preserve"> </w:t>
@@ -6696,43 +6733,43 @@
           <w:i/>
           <w:iCs/>
         </w:rPr>
-        <w:t xml:space="preserve">New Phytologist</w:t>
-      </w:r>
-      <w:r>
-        <w:t xml:space="preserve"> </w:t>
-      </w:r>
-      <w:r>
-        <w:t xml:space="preserve">196: 79–91.</w:t>
-      </w:r>
-      <w:r>
-        <w:t xml:space="preserve"> </w:t>
-      </w:r>
-      <w:hyperlink r:id="rId90">
-        <w:r>
-          <w:rPr>
-            <w:rStyle w:val="Hyperlink"/>
-          </w:rPr>
-          <w:t xml:space="preserve">https://doi.org/10.1111/j.1469-8137.2012.04225.x</w:t>
+        <w:t xml:space="preserve">Heredity</w:t>
+      </w:r>
+      <w:r>
+        <w:t xml:space="preserve"> </w:t>
+      </w:r>
+      <w:r>
+        <w:t xml:space="preserve">116: 384–94.</w:t>
+      </w:r>
+      <w:r>
+        <w:t xml:space="preserve"> </w:t>
+      </w:r>
+      <w:hyperlink r:id="rId91">
+        <w:r>
+          <w:rPr>
+            <w:rStyle w:val="Hyperlink"/>
+          </w:rPr>
+          <w:t xml:space="preserve">https://doi.org/10.1038/hdy.2015.111</w:t>
         </w:r>
       </w:hyperlink>
       <w:r>
         <w:t xml:space="preserve">.</w:t>
       </w:r>
     </w:p>
-    <w:bookmarkEnd w:id="91"/>
-    <w:bookmarkStart w:id="93" w:name="ref-miguez2004"/>
+    <w:bookmarkEnd w:id="92"/>
+    <w:bookmarkStart w:id="94" w:name="ref-love2014"/>
     <w:p>
       <w:pPr>
         <w:pStyle w:val="Bibliography"/>
       </w:pPr>
       <w:r>
-        <w:t xml:space="preserve">Miguez, M., C. Reeve, P. M. Wood, and D. W. Hollomon. 2004.</w:t>
-      </w:r>
-      <w:r>
-        <w:t xml:space="preserve"> </w:t>
-      </w:r>
-      <w:r>
-        <w:t xml:space="preserve">“Alternative Oxidase Reduces the Sensitivity of Mycosphaerella Graminicola to QoI Fungicides.”</w:t>
+        <w:t xml:space="preserve">Love, M. I., W. Huber, and S. Anders. 2014.</w:t>
+      </w:r>
+      <w:r>
+        <w:t xml:space="preserve"> </w:t>
+      </w:r>
+      <w:r>
+        <w:t xml:space="preserve">“Moderated Estimation of Fold Change and Dispersion for RNA-Seq Data with DESeq2.”</w:t>
       </w:r>
       <w:r>
         <w:t xml:space="preserve"> </w:t>
@@ -6742,46 +6779,43 @@
           <w:i/>
           <w:iCs/>
         </w:rPr>
-        <w:t xml:space="preserve">Pest Management Science</w:t>
-      </w:r>
-      <w:r>
-        <w:t xml:space="preserve"> </w:t>
-      </w:r>
-      <w:r>
-        <w:t xml:space="preserve">60: 3–7.</w:t>
-      </w:r>
-      <w:r>
-        <w:t xml:space="preserve"> </w:t>
-      </w:r>
-      <w:hyperlink r:id="rId92">
-        <w:r>
-          <w:rPr>
-            <w:rStyle w:val="Hyperlink"/>
-          </w:rPr>
-          <w:t xml:space="preserve">https://doi.org/10.1002/ps.837</w:t>
+        <w:t xml:space="preserve">Genome Biology</w:t>
+      </w:r>
+      <w:r>
+        <w:t xml:space="preserve"> </w:t>
+      </w:r>
+      <w:r>
+        <w:t xml:space="preserve">15 (12): 550.</w:t>
+      </w:r>
+      <w:r>
+        <w:t xml:space="preserve"> </w:t>
+      </w:r>
+      <w:hyperlink r:id="rId93">
+        <w:r>
+          <w:rPr>
+            <w:rStyle w:val="Hyperlink"/>
+          </w:rPr>
+          <w:t xml:space="preserve">https://doi.org/10.1186/s13059-014-0550-8</w:t>
         </w:r>
       </w:hyperlink>
       <w:r>
         <w:t xml:space="preserve">.</w:t>
       </w:r>
     </w:p>
-    <w:bookmarkEnd w:id="93"/>
-    <w:bookmarkStart w:id="95" w:name="ref-neves-da-rocha2023"/>
+    <w:bookmarkEnd w:id="94"/>
+    <w:bookmarkStart w:id="96" w:name="ref-lucas2015"/>
     <w:p>
       <w:pPr>
         <w:pStyle w:val="Bibliography"/>
       </w:pPr>
       <w:r>
-        <w:t xml:space="preserve">Neves-da-Rocha, J. et al.</w:t>
-      </w:r>
-      <w:r>
-        <w:t xml:space="preserve"> 2023.</w:t>
-      </w:r>
-      <w:r>
-        <w:t xml:space="preserve"> </w:t>
-      </w:r>
-      <w:r>
-        <w:t xml:space="preserve">“Insights and Perspectives on the Role of Proteostasis and Heat Shock Proteins in Fungal Infections.”</w:t>
+        <w:t xml:space="preserve">Lucas, J. A., N. J. Hawkins, and B. A. Fraaije. 2015.</w:t>
+      </w:r>
+      <w:r>
+        <w:t xml:space="preserve"> </w:t>
+      </w:r>
+      <w:r>
+        <w:t xml:space="preserve">“The Evolution of Fungicide Resistance.”</w:t>
       </w:r>
       <w:r>
         <w:t xml:space="preserve"> </w:t>
@@ -6791,46 +6825,43 @@
           <w:i/>
           <w:iCs/>
         </w:rPr>
-        <w:t xml:space="preserve">Microorganisms</w:t>
-      </w:r>
-      <w:r>
-        <w:t xml:space="preserve"> </w:t>
-      </w:r>
-      <w:r>
-        <w:t xml:space="preserve">11(8): 1878.</w:t>
-      </w:r>
-      <w:r>
-        <w:t xml:space="preserve"> </w:t>
-      </w:r>
-      <w:hyperlink r:id="rId94">
-        <w:r>
-          <w:rPr>
-            <w:rStyle w:val="Hyperlink"/>
-          </w:rPr>
-          <w:t xml:space="preserve">https://doi.org/10.3390/microorganisms11081878</w:t>
+        <w:t xml:space="preserve">Advances in Applied Microbiology</w:t>
+      </w:r>
+      <w:r>
+        <w:t xml:space="preserve"> </w:t>
+      </w:r>
+      <w:r>
+        <w:t xml:space="preserve">90: 29–92.</w:t>
+      </w:r>
+      <w:r>
+        <w:t xml:space="preserve"> </w:t>
+      </w:r>
+      <w:hyperlink r:id="rId95">
+        <w:r>
+          <w:rPr>
+            <w:rStyle w:val="Hyperlink"/>
+          </w:rPr>
+          <w:t xml:space="preserve">https://doi.org/10.1016/bs.aambs.2014.09.001</w:t>
         </w:r>
       </w:hyperlink>
       <w:r>
         <w:t xml:space="preserve">.</w:t>
       </w:r>
     </w:p>
-    <w:bookmarkEnd w:id="95"/>
-    <w:bookmarkStart w:id="97" w:name="ref-noyes2009"/>
+    <w:bookmarkEnd w:id="96"/>
+    <w:bookmarkStart w:id="98" w:name="ref-manzoni2012"/>
     <w:p>
       <w:pPr>
         <w:pStyle w:val="Bibliography"/>
       </w:pPr>
       <w:r>
-        <w:t xml:space="preserve">Noyes, P. D. et al.</w:t>
-      </w:r>
-      <w:r>
-        <w:t xml:space="preserve"> 2009.</w:t>
-      </w:r>
-      <w:r>
-        <w:t xml:space="preserve"> </w:t>
-      </w:r>
-      <w:r>
-        <w:t xml:space="preserve">“The Toxicology of Climate Change: Environmental Contaminants in a Warming World.”</w:t>
+        <w:t xml:space="preserve">Manzoni, S., P. Taylor, A. Richter, A. Porporato, and G. I. Ågren. 2012.</w:t>
+      </w:r>
+      <w:r>
+        <w:t xml:space="preserve"> </w:t>
+      </w:r>
+      <w:r>
+        <w:t xml:space="preserve">“Environmental and Stoichiometric Controls on Microbial Carbon-Use Efficiency in Soils.”</w:t>
       </w:r>
       <w:r>
         <w:t xml:space="preserve"> </w:t>
@@ -6840,46 +6871,43 @@
           <w:i/>
           <w:iCs/>
         </w:rPr>
-        <w:t xml:space="preserve">Environment International</w:t>
-      </w:r>
-      <w:r>
-        <w:t xml:space="preserve"> </w:t>
-      </w:r>
-      <w:r>
-        <w:t xml:space="preserve">35: 971–86.</w:t>
-      </w:r>
-      <w:r>
-        <w:t xml:space="preserve"> </w:t>
-      </w:r>
-      <w:hyperlink r:id="rId96">
-        <w:r>
-          <w:rPr>
-            <w:rStyle w:val="Hyperlink"/>
-          </w:rPr>
-          <w:t xml:space="preserve">https://doi.org/10.1016/j.envint.2009.02.006</w:t>
+        <w:t xml:space="preserve">New Phytologist</w:t>
+      </w:r>
+      <w:r>
+        <w:t xml:space="preserve"> </w:t>
+      </w:r>
+      <w:r>
+        <w:t xml:space="preserve">196: 79–91.</w:t>
+      </w:r>
+      <w:r>
+        <w:t xml:space="preserve"> </w:t>
+      </w:r>
+      <w:hyperlink r:id="rId97">
+        <w:r>
+          <w:rPr>
+            <w:rStyle w:val="Hyperlink"/>
+          </w:rPr>
+          <w:t xml:space="preserve">https://doi.org/10.1111/j.1469-8137.2012.04225.x</w:t>
         </w:r>
       </w:hyperlink>
       <w:r>
         <w:t xml:space="preserve">.</w:t>
       </w:r>
     </w:p>
-    <w:bookmarkEnd w:id="97"/>
-    <w:bookmarkStart w:id="99" w:name="ref-parker2011"/>
+    <w:bookmarkEnd w:id="98"/>
+    <w:bookmarkStart w:id="100" w:name="ref-miguez2004"/>
     <w:p>
       <w:pPr>
         <w:pStyle w:val="Bibliography"/>
       </w:pPr>
       <w:r>
-        <w:t xml:space="preserve">Parker, J. E. et al.</w:t>
-      </w:r>
-      <w:r>
-        <w:t xml:space="preserve"> 2011.</w:t>
-      </w:r>
-      <w:r>
-        <w:t xml:space="preserve"> </w:t>
-      </w:r>
-      <w:r>
-        <w:t xml:space="preserve">“Mechanism of Binding of Prothioconazole to Mycosphaerella Graminicola CYP51 Differs from That of Other Azole Antifungals.”</w:t>
+        <w:t xml:space="preserve">Miguez, M., C. Reeve, P. M. Wood, and D. W. Hollomon. 2004.</w:t>
+      </w:r>
+      <w:r>
+        <w:t xml:space="preserve"> </w:t>
+      </w:r>
+      <w:r>
+        <w:t xml:space="preserve">“Alternative Oxidase Reduces the Sensitivity of Mycosphaerella Graminicola to QoI Fungicides.”</w:t>
       </w:r>
       <w:r>
         <w:t xml:space="preserve"> </w:t>
@@ -6889,43 +6917,43 @@
           <w:i/>
           <w:iCs/>
         </w:rPr>
-        <w:t xml:space="preserve">Applied and Environmental Microbiology</w:t>
-      </w:r>
-      <w:r>
-        <w:t xml:space="preserve"> </w:t>
-      </w:r>
-      <w:r>
-        <w:t xml:space="preserve">77: 1460–65.</w:t>
-      </w:r>
-      <w:r>
-        <w:t xml:space="preserve"> </w:t>
-      </w:r>
-      <w:hyperlink r:id="rId98">
-        <w:r>
-          <w:rPr>
-            <w:rStyle w:val="Hyperlink"/>
-          </w:rPr>
-          <w:t xml:space="preserve">https://doi.org/10.1128/AEM.01332-10</w:t>
+        <w:t xml:space="preserve">Pest Management Science</w:t>
+      </w:r>
+      <w:r>
+        <w:t xml:space="preserve"> </w:t>
+      </w:r>
+      <w:r>
+        <w:t xml:space="preserve">60: 3–7.</w:t>
+      </w:r>
+      <w:r>
+        <w:t xml:space="preserve"> </w:t>
+      </w:r>
+      <w:hyperlink r:id="rId99">
+        <w:r>
+          <w:rPr>
+            <w:rStyle w:val="Hyperlink"/>
+          </w:rPr>
+          <w:t xml:space="preserve">https://doi.org/10.1002/ps.837</w:t>
         </w:r>
       </w:hyperlink>
       <w:r>
         <w:t xml:space="preserve">.</w:t>
       </w:r>
     </w:p>
-    <w:bookmarkEnd w:id="99"/>
-    <w:bookmarkStart w:id="101" w:name="ref-parker2014"/>
+    <w:bookmarkEnd w:id="100"/>
+    <w:bookmarkStart w:id="102" w:name="ref-neves-da-rocha2023"/>
     <w:p>
       <w:pPr>
         <w:pStyle w:val="Bibliography"/>
       </w:pPr>
       <w:r>
-        <w:t xml:space="preserve">Parker, J. E., A. G. S. Warrilow, C. L. Price, J. G. L. Mullins, D. E. Kelly, and S. L. Kelly. 2014.</w:t>
-      </w:r>
-      <w:r>
-        <w:t xml:space="preserve"> </w:t>
-      </w:r>
-      <w:r>
-        <w:t xml:space="preserve">“Resistance to Antifungals That Target CYP51.”</w:t>
+        <w:t xml:space="preserve">Neves-da-Rocha, João, Maria J. Santos-Saboya, Marcos E. R. Lopes, Antonio Rossi, and Nilce M. Martinez-Rossi. 2023.</w:t>
+      </w:r>
+      <w:r>
+        <w:t xml:space="preserve"> </w:t>
+      </w:r>
+      <w:r>
+        <w:t xml:space="preserve">“Insights and Perspectives on the Role of Proteostasis and Heat Shock Proteins in Fungal Infections.”</w:t>
       </w:r>
       <w:r>
         <w:t xml:space="preserve"> </w:t>
@@ -6935,43 +6963,43 @@
           <w:i/>
           <w:iCs/>
         </w:rPr>
-        <w:t xml:space="preserve">Journal of Chemical Biology</w:t>
-      </w:r>
-      <w:r>
-        <w:t xml:space="preserve"> </w:t>
-      </w:r>
-      <w:r>
-        <w:t xml:space="preserve">7: 143–61.</w:t>
-      </w:r>
-      <w:r>
-        <w:t xml:space="preserve"> </w:t>
-      </w:r>
-      <w:hyperlink r:id="rId100">
-        <w:r>
-          <w:rPr>
-            <w:rStyle w:val="Hyperlink"/>
-          </w:rPr>
-          <w:t xml:space="preserve">https://doi.org/10.1007/s12154-014-0121-1</w:t>
+        <w:t xml:space="preserve">Microorganisms</w:t>
+      </w:r>
+      <w:r>
+        <w:t xml:space="preserve"> </w:t>
+      </w:r>
+      <w:r>
+        <w:t xml:space="preserve">11 (8): 1878.</w:t>
+      </w:r>
+      <w:r>
+        <w:t xml:space="preserve"> </w:t>
+      </w:r>
+      <w:hyperlink r:id="rId101">
+        <w:r>
+          <w:rPr>
+            <w:rStyle w:val="Hyperlink"/>
+          </w:rPr>
+          <w:t xml:space="preserve">https://doi.org/10.3390/microorganisms11081878</w:t>
         </w:r>
       </w:hyperlink>
       <w:r>
         <w:t xml:space="preserve">.</w:t>
       </w:r>
     </w:p>
-    <w:bookmarkEnd w:id="101"/>
-    <w:bookmarkStart w:id="103" w:name="ref-patro2017"/>
+    <w:bookmarkEnd w:id="102"/>
+    <w:bookmarkStart w:id="104" w:name="ref-noyes2009"/>
     <w:p>
       <w:pPr>
         <w:pStyle w:val="Bibliography"/>
       </w:pPr>
       <w:r>
-        <w:t xml:space="preserve">Patro, R., G. Duggal, M. I. Love, R. A. Irizarry, and C. Kingsford. 2017.</w:t>
-      </w:r>
-      <w:r>
-        <w:t xml:space="preserve"> </w:t>
-      </w:r>
-      <w:r>
-        <w:t xml:space="preserve">“Salmon Provides Fast and Bias-Aware Quantification of Transcript Expression.”</w:t>
+        <w:t xml:space="preserve">Noyes, Pamela D., Matthew K. McElwee, Hilary D. Miller, et al. 2009.</w:t>
+      </w:r>
+      <w:r>
+        <w:t xml:space="preserve"> </w:t>
+      </w:r>
+      <w:r>
+        <w:t xml:space="preserve">“The Toxicology of Climate Change: Environmental Contaminants in a Warming World.”</w:t>
       </w:r>
       <w:r>
         <w:t xml:space="preserve"> </w:t>
@@ -6981,43 +7009,43 @@
           <w:i/>
           <w:iCs/>
         </w:rPr>
-        <w:t xml:space="preserve">Nature Methods</w:t>
-      </w:r>
-      <w:r>
-        <w:t xml:space="preserve"> </w:t>
-      </w:r>
-      <w:r>
-        <w:t xml:space="preserve">14(4): 417–19.</w:t>
-      </w:r>
-      <w:r>
-        <w:t xml:space="preserve"> </w:t>
-      </w:r>
-      <w:hyperlink r:id="rId102">
-        <w:r>
-          <w:rPr>
-            <w:rStyle w:val="Hyperlink"/>
-          </w:rPr>
-          <w:t xml:space="preserve">https://doi.org/10.1038/nmeth.4197</w:t>
+        <w:t xml:space="preserve">Environment International</w:t>
+      </w:r>
+      <w:r>
+        <w:t xml:space="preserve"> </w:t>
+      </w:r>
+      <w:r>
+        <w:t xml:space="preserve">35: 971–86.</w:t>
+      </w:r>
+      <w:r>
+        <w:t xml:space="preserve"> </w:t>
+      </w:r>
+      <w:hyperlink r:id="rId103">
+        <w:r>
+          <w:rPr>
+            <w:rStyle w:val="Hyperlink"/>
+          </w:rPr>
+          <w:t xml:space="preserve">https://doi.org/10.1016/j.envint.2009.02.006</w:t>
         </w:r>
       </w:hyperlink>
       <w:r>
         <w:t xml:space="preserve">.</w:t>
       </w:r>
     </w:p>
-    <w:bookmarkEnd w:id="103"/>
-    <w:bookmarkStart w:id="105" w:name="ref-price2015"/>
+    <w:bookmarkEnd w:id="104"/>
+    <w:bookmarkStart w:id="106" w:name="ref-parker2014"/>
     <w:p>
       <w:pPr>
         <w:pStyle w:val="Bibliography"/>
       </w:pPr>
       <w:r>
-        <w:t xml:space="preserve">Price, C. L., A. G. S. Warrilow, J. E. Parker, et al. 2015.</w:t>
-      </w:r>
-      <w:r>
-        <w:t xml:space="preserve"> </w:t>
-      </w:r>
-      <w:r>
-        <w:t xml:space="preserve">“Novel Substrate Specificity and Temperature-Sensitive Activity of Mycosphaerella Graminicola CYP51 Supported by the Native NADPH Cytochrome P450 Reductase.”</w:t>
+        <w:t xml:space="preserve">Parker, J. E., A. G. S. Warrilow, C. L. Price, J. G. L. Mullins, D. E. Kelly, and S. L. Kelly. 2014.</w:t>
+      </w:r>
+      <w:r>
+        <w:t xml:space="preserve"> </w:t>
+      </w:r>
+      <w:r>
+        <w:t xml:space="preserve">“Resistance to Antifungals That Target CYP51.”</w:t>
       </w:r>
       <w:r>
         <w:t xml:space="preserve"> </w:t>
@@ -7027,46 +7055,43 @@
           <w:i/>
           <w:iCs/>
         </w:rPr>
-        <w:t xml:space="preserve">Applied and Environmental Microbiology</w:t>
-      </w:r>
-      <w:r>
-        <w:t xml:space="preserve"> </w:t>
-      </w:r>
-      <w:r>
-        <w:t xml:space="preserve">81: 3379–86.</w:t>
-      </w:r>
-      <w:r>
-        <w:t xml:space="preserve"> </w:t>
-      </w:r>
-      <w:hyperlink r:id="rId104">
-        <w:r>
-          <w:rPr>
-            <w:rStyle w:val="Hyperlink"/>
-          </w:rPr>
-          <w:t xml:space="preserve">https://doi.org/10.1128/AEM.03965-14</w:t>
+        <w:t xml:space="preserve">Journal of Chemical Biology</w:t>
+      </w:r>
+      <w:r>
+        <w:t xml:space="preserve"> </w:t>
+      </w:r>
+      <w:r>
+        <w:t xml:space="preserve">7: 143–61.</w:t>
+      </w:r>
+      <w:r>
+        <w:t xml:space="preserve"> </w:t>
+      </w:r>
+      <w:hyperlink r:id="rId105">
+        <w:r>
+          <w:rPr>
+            <w:rStyle w:val="Hyperlink"/>
+          </w:rPr>
+          <w:t xml:space="preserve">https://doi.org/10.1007/s12154-014-0121-1</w:t>
         </w:r>
       </w:hyperlink>
       <w:r>
         <w:t xml:space="preserve">.</w:t>
       </w:r>
     </w:p>
-    <w:bookmarkEnd w:id="105"/>
-    <w:bookmarkStart w:id="107" w:name="ref-quaedvlieg2011"/>
+    <w:bookmarkEnd w:id="106"/>
+    <w:bookmarkStart w:id="108" w:name="ref-parker2011"/>
     <w:p>
       <w:pPr>
         <w:pStyle w:val="Bibliography"/>
       </w:pPr>
       <w:r>
-        <w:t xml:space="preserve">Quaedvlieg, W. et al.</w:t>
-      </w:r>
-      <w:r>
-        <w:t xml:space="preserve"> 2011.</w:t>
-      </w:r>
-      <w:r>
-        <w:t xml:space="preserve"> </w:t>
-      </w:r>
-      <w:r>
-        <w:t xml:space="preserve">“Zymoseptoria Gen. Nov.: A New Genus to Accommodate Septoria-Like Species Occurring on Graminicolous Hosts.”</w:t>
+        <w:t xml:space="preserve">Parker, Josie E., Andrew G. S. Warrilow, Hans J. Cools, et al. 2011.</w:t>
+      </w:r>
+      <w:r>
+        <w:t xml:space="preserve"> </w:t>
+      </w:r>
+      <w:r>
+        <w:t xml:space="preserve">“Mechanism of Binding of Prothioconazole to Mycosphaerella Graminicola CYP51 Differs from That of Other Azole Antifungals.”</w:t>
       </w:r>
       <w:r>
         <w:t xml:space="preserve"> </w:t>
@@ -7076,43 +7101,43 @@
           <w:i/>
           <w:iCs/>
         </w:rPr>
-        <w:t xml:space="preserve">Persoonia</w:t>
-      </w:r>
-      <w:r>
-        <w:t xml:space="preserve"> </w:t>
-      </w:r>
-      <w:r>
-        <w:t xml:space="preserve">26: 57–69.</w:t>
-      </w:r>
-      <w:r>
-        <w:t xml:space="preserve"> </w:t>
-      </w:r>
-      <w:hyperlink r:id="rId106">
-        <w:r>
-          <w:rPr>
-            <w:rStyle w:val="Hyperlink"/>
-          </w:rPr>
-          <w:t xml:space="preserve">https://doi.org/10.3767/003158511X571841</w:t>
+        <w:t xml:space="preserve">Applied and Environmental Microbiology</w:t>
+      </w:r>
+      <w:r>
+        <w:t xml:space="preserve"> </w:t>
+      </w:r>
+      <w:r>
+        <w:t xml:space="preserve">77: 1460–65.</w:t>
+      </w:r>
+      <w:r>
+        <w:t xml:space="preserve"> </w:t>
+      </w:r>
+      <w:hyperlink r:id="rId107">
+        <w:r>
+          <w:rPr>
+            <w:rStyle w:val="Hyperlink"/>
+          </w:rPr>
+          <w:t xml:space="preserve">https://doi.org/10.1128/AEM.01332-10</w:t>
         </w:r>
       </w:hyperlink>
       <w:r>
         <w:t xml:space="preserve">.</w:t>
       </w:r>
     </w:p>
-    <w:bookmarkEnd w:id="107"/>
-    <w:bookmarkStart w:id="109" w:name="ref-schoolfield1981"/>
+    <w:bookmarkEnd w:id="108"/>
+    <w:bookmarkStart w:id="110" w:name="ref-patro2017"/>
     <w:p>
       <w:pPr>
         <w:pStyle w:val="Bibliography"/>
       </w:pPr>
       <w:r>
-        <w:t xml:space="preserve">Schoolfield, R. M., P. J. H. Sharpe, and C. E. Magnuson. 1981.</w:t>
-      </w:r>
-      <w:r>
-        <w:t xml:space="preserve"> </w:t>
-      </w:r>
-      <w:r>
-        <w:t xml:space="preserve">“Non-Linear Regression of Biological Temperature-Dependent Rate Models Based on Absolute Reaction-Rate Theory.”</w:t>
+        <w:t xml:space="preserve">Patro, R., G. Duggal, M. I. Love, R. A. Irizarry, and C. Kingsford. 2017.</w:t>
+      </w:r>
+      <w:r>
+        <w:t xml:space="preserve"> </w:t>
+      </w:r>
+      <w:r>
+        <w:t xml:space="preserve">“Salmon Provides Fast and Bias-Aware Quantification of Transcript Expression.”</w:t>
       </w:r>
       <w:r>
         <w:t xml:space="preserve"> </w:t>
@@ -7122,43 +7147,43 @@
           <w:i/>
           <w:iCs/>
         </w:rPr>
-        <w:t xml:space="preserve">Journal of Theoretical Biology</w:t>
-      </w:r>
-      <w:r>
-        <w:t xml:space="preserve"> </w:t>
-      </w:r>
-      <w:r>
-        <w:t xml:space="preserve">88: 719–31.</w:t>
-      </w:r>
-      <w:r>
-        <w:t xml:space="preserve"> </w:t>
-      </w:r>
-      <w:hyperlink r:id="rId108">
-        <w:r>
-          <w:rPr>
-            <w:rStyle w:val="Hyperlink"/>
-          </w:rPr>
-          <w:t xml:space="preserve">https://doi.org/10.1016/0022-5193(81)90246-0</w:t>
+        <w:t xml:space="preserve">Nature Methods</w:t>
+      </w:r>
+      <w:r>
+        <w:t xml:space="preserve"> </w:t>
+      </w:r>
+      <w:r>
+        <w:t xml:space="preserve">14 (4): 417–19.</w:t>
+      </w:r>
+      <w:r>
+        <w:t xml:space="preserve"> </w:t>
+      </w:r>
+      <w:hyperlink r:id="rId109">
+        <w:r>
+          <w:rPr>
+            <w:rStyle w:val="Hyperlink"/>
+          </w:rPr>
+          <w:t xml:space="preserve">https://doi.org/10.1038/nmeth.4197</w:t>
         </w:r>
       </w:hyperlink>
       <w:r>
         <w:t xml:space="preserve">.</w:t>
       </w:r>
     </w:p>
-    <w:bookmarkEnd w:id="109"/>
-    <w:bookmarkStart w:id="111" w:name="ref-smith2019"/>
+    <w:bookmarkEnd w:id="110"/>
+    <w:bookmarkStart w:id="112" w:name="ref-price2015"/>
     <w:p>
       <w:pPr>
         <w:pStyle w:val="Bibliography"/>
       </w:pPr>
       <w:r>
-        <w:t xml:space="preserve">Smith, T. P., T. J. H. Thomas, B. García-Carreras, et al. 2019.</w:t>
-      </w:r>
-      <w:r>
-        <w:t xml:space="preserve"> </w:t>
-      </w:r>
-      <w:r>
-        <w:t xml:space="preserve">“Community-Level Respiration of Prokaryotic Microbes May Rise with Global Warming.”</w:t>
+        <w:t xml:space="preserve">Price, C. L., A. G. S. Warrilow, J. E. Parker, et al. 2015.</w:t>
+      </w:r>
+      <w:r>
+        <w:t xml:space="preserve"> </w:t>
+      </w:r>
+      <w:r>
+        <w:t xml:space="preserve">“Novel Substrate Specificity and Temperature-Sensitive Activity of Mycosphaerella Graminicola CYP51 Supported by the Native NADPH Cytochrome P450 Reductase.”</w:t>
       </w:r>
       <w:r>
         <w:t xml:space="preserve"> </w:t>
@@ -7168,43 +7193,43 @@
           <w:i/>
           <w:iCs/>
         </w:rPr>
-        <w:t xml:space="preserve">Nature Communications</w:t>
-      </w:r>
-      <w:r>
-        <w:t xml:space="preserve"> </w:t>
-      </w:r>
-      <w:r>
-        <w:t xml:space="preserve">10: 5124.</w:t>
-      </w:r>
-      <w:r>
-        <w:t xml:space="preserve"> </w:t>
-      </w:r>
-      <w:hyperlink r:id="rId110">
-        <w:r>
-          <w:rPr>
-            <w:rStyle w:val="Hyperlink"/>
-          </w:rPr>
-          <w:t xml:space="preserve">https://doi.org/10.1038/s41467-019-13109-1</w:t>
+        <w:t xml:space="preserve">Applied and Environmental Microbiology</w:t>
+      </w:r>
+      <w:r>
+        <w:t xml:space="preserve"> </w:t>
+      </w:r>
+      <w:r>
+        <w:t xml:space="preserve">81: 3379–86.</w:t>
+      </w:r>
+      <w:r>
+        <w:t xml:space="preserve"> </w:t>
+      </w:r>
+      <w:hyperlink r:id="rId111">
+        <w:r>
+          <w:rPr>
+            <w:rStyle w:val="Hyperlink"/>
+          </w:rPr>
+          <w:t xml:space="preserve">https://doi.org/10.1128/AEM.03965-14</w:t>
         </w:r>
       </w:hyperlink>
       <w:r>
         <w:t xml:space="preserve">.</w:t>
       </w:r>
     </w:p>
-    <w:bookmarkEnd w:id="111"/>
-    <w:bookmarkStart w:id="113" w:name="ref-soneson2015"/>
+    <w:bookmarkEnd w:id="112"/>
+    <w:bookmarkStart w:id="114" w:name="ref-schoolfield1981"/>
     <w:p>
       <w:pPr>
         <w:pStyle w:val="Bibliography"/>
       </w:pPr>
       <w:r>
-        <w:t xml:space="preserve">Soneson, C., M. I. Love, and M. D. Robinson. 2015.</w:t>
-      </w:r>
-      <w:r>
-        <w:t xml:space="preserve"> </w:t>
-      </w:r>
-      <w:r>
-        <w:t xml:space="preserve">“Differential Analyses for RNA-Seq: Transcript-Level Estimates Improve Gene-Level Inferences.”</w:t>
+        <w:t xml:space="preserve">Schoolfield, R. M., P. J. H. Sharpe, and C. E. Magnuson. 1981.</w:t>
+      </w:r>
+      <w:r>
+        <w:t xml:space="preserve"> </w:t>
+      </w:r>
+      <w:r>
+        <w:t xml:space="preserve">“Non-Linear Regression of Biological Temperature-Dependent Rate Models Based on Absolute Reaction-Rate Theory.”</w:t>
       </w:r>
       <w:r>
         <w:t xml:space="preserve"> </w:t>
@@ -7214,43 +7239,43 @@
           <w:i/>
           <w:iCs/>
         </w:rPr>
-        <w:t xml:space="preserve">F1000Research</w:t>
-      </w:r>
-      <w:r>
-        <w:t xml:space="preserve"> </w:t>
-      </w:r>
-      <w:r>
-        <w:t xml:space="preserve">4: 1521.</w:t>
-      </w:r>
-      <w:r>
-        <w:t xml:space="preserve"> </w:t>
-      </w:r>
-      <w:hyperlink r:id="rId112">
-        <w:r>
-          <w:rPr>
-            <w:rStyle w:val="Hyperlink"/>
-          </w:rPr>
-          <w:t xml:space="preserve">https://doi.org/10.12688/f1000research.7563.1</w:t>
+        <w:t xml:space="preserve">Journal of Theoretical Biology</w:t>
+      </w:r>
+      <w:r>
+        <w:t xml:space="preserve"> </w:t>
+      </w:r>
+      <w:r>
+        <w:t xml:space="preserve">88: 719–31.</w:t>
+      </w:r>
+      <w:r>
+        <w:t xml:space="preserve"> </w:t>
+      </w:r>
+      <w:hyperlink r:id="rId113">
+        <w:r>
+          <w:rPr>
+            <w:rStyle w:val="Hyperlink"/>
+          </w:rPr>
+          <w:t xml:space="preserve">https://doi.org/10.1016/0022-5193(81)90246-0</w:t>
         </w:r>
       </w:hyperlink>
       <w:r>
         <w:t xml:space="preserve">.</w:t>
       </w:r>
     </w:p>
-    <w:bookmarkEnd w:id="113"/>
-    <w:bookmarkStart w:id="115" w:name="ref-steinberg2015"/>
+    <w:bookmarkEnd w:id="114"/>
+    <w:bookmarkStart w:id="116" w:name="ref-shingu-vazquez2011"/>
     <w:p>
       <w:pPr>
         <w:pStyle w:val="Bibliography"/>
       </w:pPr>
       <w:r>
-        <w:t xml:space="preserve">Steinberg, G. 2015.</w:t>
-      </w:r>
-      <w:r>
-        <w:t xml:space="preserve"> </w:t>
-      </w:r>
-      <w:r>
-        <w:t xml:space="preserve">“Cell Biology of Zymoseptoria Tritici: Pathogen Cell Organization and Wheat Infection.”</w:t>
+        <w:t xml:space="preserve">Shingu-Vazquez, Miguel, and Ana Traven. 2011.</w:t>
+      </w:r>
+      <w:r>
+        <w:t xml:space="preserve"> </w:t>
+      </w:r>
+      <w:r>
+        <w:t xml:space="preserve">“Mitochondria and Fungal Pathogenesis: Drug Tolerance, Virulence, and Potential for Antifungal Therapy.”</w:t>
       </w:r>
       <w:r>
         <w:t xml:space="preserve"> </w:t>
@@ -7260,43 +7285,43 @@
           <w:i/>
           <w:iCs/>
         </w:rPr>
-        <w:t xml:space="preserve">Fungal Genetics and Biology</w:t>
-      </w:r>
-      <w:r>
-        <w:t xml:space="preserve"> </w:t>
-      </w:r>
-      <w:r>
-        <w:t xml:space="preserve">79: 17–23.</w:t>
-      </w:r>
-      <w:r>
-        <w:t xml:space="preserve"> </w:t>
-      </w:r>
-      <w:hyperlink r:id="rId114">
-        <w:r>
-          <w:rPr>
-            <w:rStyle w:val="Hyperlink"/>
-          </w:rPr>
-          <w:t xml:space="preserve">https://doi.org/10.1016/j.fgb.2015.04.002</w:t>
+        <w:t xml:space="preserve">Eukaryotic Cell</w:t>
+      </w:r>
+      <w:r>
+        <w:t xml:space="preserve"> </w:t>
+      </w:r>
+      <w:r>
+        <w:t xml:space="preserve">10 (11): 1376–83.</w:t>
+      </w:r>
+      <w:r>
+        <w:t xml:space="preserve"> </w:t>
+      </w:r>
+      <w:hyperlink r:id="rId115">
+        <w:r>
+          <w:rPr>
+            <w:rStyle w:val="Hyperlink"/>
+          </w:rPr>
+          <w:t xml:space="preserve">https://doi.org/10.1128/EC.05184-11</w:t>
         </w:r>
       </w:hyperlink>
       <w:r>
         <w:t xml:space="preserve">.</w:t>
       </w:r>
     </w:p>
-    <w:bookmarkEnd w:id="115"/>
-    <w:bookmarkStart w:id="117" w:name="ref-steinberg2020"/>
+    <w:bookmarkEnd w:id="116"/>
+    <w:bookmarkStart w:id="118" w:name="ref-smith2021"/>
     <w:p>
       <w:pPr>
         <w:pStyle w:val="Bibliography"/>
       </w:pPr>
       <w:r>
-        <w:t xml:space="preserve">Steinberg, G., and S. J. Gurr. 2020.</w:t>
-      </w:r>
-      <w:r>
-        <w:t xml:space="preserve"> </w:t>
-      </w:r>
-      <w:r>
-        <w:t xml:space="preserve">“Fungi, Fungicide Discovery and Global Food Security.”</w:t>
+        <w:t xml:space="preserve">Smith, Thomas P., Tom Clegg, Thomas Bell, and Samraat Pawar. 2021.</w:t>
+      </w:r>
+      <w:r>
+        <w:t xml:space="preserve"> </w:t>
+      </w:r>
+      <w:r>
+        <w:t xml:space="preserve">“Systematic Variation in the Temperature Dependence of Bacterial Carbon Use Efficiency.”</w:t>
       </w:r>
       <w:r>
         <w:t xml:space="preserve"> </w:t>
@@ -7306,43 +7331,43 @@
           <w:i/>
           <w:iCs/>
         </w:rPr>
-        <w:t xml:space="preserve">Fungal Genetics and Biology</w:t>
-      </w:r>
-      <w:r>
-        <w:t xml:space="preserve"> </w:t>
-      </w:r>
-      <w:r>
-        <w:t xml:space="preserve">144: 103476.</w:t>
-      </w:r>
-      <w:r>
-        <w:t xml:space="preserve"> </w:t>
-      </w:r>
-      <w:hyperlink r:id="rId116">
-        <w:r>
-          <w:rPr>
-            <w:rStyle w:val="Hyperlink"/>
-          </w:rPr>
-          <w:t xml:space="preserve">https://doi.org/10.1016/j.fgb.2020.103476</w:t>
+        <w:t xml:space="preserve">Ecology Letters</w:t>
+      </w:r>
+      <w:r>
+        <w:t xml:space="preserve"> </w:t>
+      </w:r>
+      <w:r>
+        <w:t xml:space="preserve">24 (10): 2123–33.</w:t>
+      </w:r>
+      <w:r>
+        <w:t xml:space="preserve"> </w:t>
+      </w:r>
+      <w:hyperlink r:id="rId117">
+        <w:r>
+          <w:rPr>
+            <w:rStyle w:val="Hyperlink"/>
+          </w:rPr>
+          <w:t xml:space="preserve">https://doi.org/10.1111/ele.13840</w:t>
         </w:r>
       </w:hyperlink>
       <w:r>
         <w:t xml:space="preserve">.</w:t>
       </w:r>
     </w:p>
-    <w:bookmarkEnd w:id="117"/>
-    <w:bookmarkStart w:id="119" w:name="ref-torriani2015"/>
+    <w:bookmarkEnd w:id="118"/>
+    <w:bookmarkStart w:id="120" w:name="ref-soneson2015"/>
     <w:p>
       <w:pPr>
         <w:pStyle w:val="Bibliography"/>
       </w:pPr>
       <w:r>
-        <w:t xml:space="preserve">Torriani, S. F. F., J. P. E. Melichar, C. Mills, N. Pain, H. Sierotzki, and M. Courbot. 2015.</w:t>
-      </w:r>
-      <w:r>
-        <w:t xml:space="preserve"> </w:t>
-      </w:r>
-      <w:r>
-        <w:t xml:space="preserve">“Zymoseptoria Tritici: A Major Threat to Wheat Production, Integrated Approaches to Control.”</w:t>
+        <w:t xml:space="preserve">Soneson, C., M. I. Love, and M. D. Robinson. 2015.</w:t>
+      </w:r>
+      <w:r>
+        <w:t xml:space="preserve"> </w:t>
+      </w:r>
+      <w:r>
+        <w:t xml:space="preserve">“Differential Analyses for RNA-Seq: Transcript-Level Estimates Improve Gene-Level Inferences.”</w:t>
       </w:r>
       <w:r>
         <w:t xml:space="preserve"> </w:t>
@@ -7352,43 +7377,43 @@
           <w:i/>
           <w:iCs/>
         </w:rPr>
-        <w:t xml:space="preserve">Fungal Genetics and Biology</w:t>
-      </w:r>
-      <w:r>
-        <w:t xml:space="preserve"> </w:t>
-      </w:r>
-      <w:r>
-        <w:t xml:space="preserve">79: 8–12.</w:t>
-      </w:r>
-      <w:r>
-        <w:t xml:space="preserve"> </w:t>
-      </w:r>
-      <w:hyperlink r:id="rId118">
-        <w:r>
-          <w:rPr>
-            <w:rStyle w:val="Hyperlink"/>
-          </w:rPr>
-          <w:t xml:space="preserve">https://doi.org/10.1016/j.fgb.2015.04.010</w:t>
+        <w:t xml:space="preserve">F1000Research</w:t>
+      </w:r>
+      <w:r>
+        <w:t xml:space="preserve"> </w:t>
+      </w:r>
+      <w:r>
+        <w:t xml:space="preserve">4: 1521.</w:t>
+      </w:r>
+      <w:r>
+        <w:t xml:space="preserve"> </w:t>
+      </w:r>
+      <w:hyperlink r:id="rId119">
+        <w:r>
+          <w:rPr>
+            <w:rStyle w:val="Hyperlink"/>
+          </w:rPr>
+          <w:t xml:space="preserve">https://doi.org/10.12688/f1000research.7563.1</w:t>
         </w:r>
       </w:hyperlink>
       <w:r>
         <w:t xml:space="preserve">.</w:t>
       </w:r>
     </w:p>
-    <w:bookmarkEnd w:id="119"/>
-    <w:bookmarkStart w:id="121" w:name="ref-vehtari2017"/>
+    <w:bookmarkEnd w:id="120"/>
+    <w:bookmarkStart w:id="122" w:name="ref-steinberg2015"/>
     <w:p>
       <w:pPr>
         <w:pStyle w:val="Bibliography"/>
       </w:pPr>
       <w:r>
-        <w:t xml:space="preserve">Vehtari, A., A. Gelman, and J. Gabry. 2017.</w:t>
-      </w:r>
-      <w:r>
-        <w:t xml:space="preserve"> </w:t>
-      </w:r>
-      <w:r>
-        <w:t xml:space="preserve">“Practical Bayesian Model Evaluation Using Leave-One-Out Cross-Validation and WAIC.”</w:t>
+        <w:t xml:space="preserve">Steinberg, G. 2015.</w:t>
+      </w:r>
+      <w:r>
+        <w:t xml:space="preserve"> </w:t>
+      </w:r>
+      <w:r>
+        <w:t xml:space="preserve">“Cell Biology of Zymoseptoria Tritici: Pathogen Cell Organization and Wheat Infection.”</w:t>
       </w:r>
       <w:r>
         <w:t xml:space="preserve"> </w:t>
@@ -7398,43 +7423,43 @@
           <w:i/>
           <w:iCs/>
         </w:rPr>
-        <w:t xml:space="preserve">Statistics and Computing</w:t>
-      </w:r>
-      <w:r>
-        <w:t xml:space="preserve"> </w:t>
-      </w:r>
-      <w:r>
-        <w:t xml:space="preserve">27: 1413–32.</w:t>
-      </w:r>
-      <w:r>
-        <w:t xml:space="preserve"> </w:t>
-      </w:r>
-      <w:hyperlink r:id="rId120">
-        <w:r>
-          <w:rPr>
-            <w:rStyle w:val="Hyperlink"/>
-          </w:rPr>
-          <w:t xml:space="preserve">https://doi.org/10.1007/s11222-016-9696-4</w:t>
+        <w:t xml:space="preserve">Fungal Genetics and Biology</w:t>
+      </w:r>
+      <w:r>
+        <w:t xml:space="preserve"> </w:t>
+      </w:r>
+      <w:r>
+        <w:t xml:space="preserve">79: 17–23.</w:t>
+      </w:r>
+      <w:r>
+        <w:t xml:space="preserve"> </w:t>
+      </w:r>
+      <w:hyperlink r:id="rId121">
+        <w:r>
+          <w:rPr>
+            <w:rStyle w:val="Hyperlink"/>
+          </w:rPr>
+          <w:t xml:space="preserve">https://doi.org/10.1016/j.fgb.2015.04.002</w:t>
         </w:r>
       </w:hyperlink>
       <w:r>
         <w:t xml:space="preserve">.</w:t>
       </w:r>
     </w:p>
-    <w:bookmarkEnd w:id="121"/>
-    <w:bookmarkStart w:id="123" w:name="ref-verheyen2023"/>
+    <w:bookmarkEnd w:id="122"/>
+    <w:bookmarkStart w:id="124" w:name="ref-steinberg2020"/>
     <w:p>
       <w:pPr>
         <w:pStyle w:val="Bibliography"/>
       </w:pPr>
       <w:r>
-        <w:t xml:space="preserve">Verheyen, J., and R. Stoks. 2023.</w:t>
-      </w:r>
-      <w:r>
-        <w:t xml:space="preserve"> </w:t>
-      </w:r>
-      <w:r>
-        <w:t xml:space="preserve">“Thermal Performance Curves in a Polluted World: Too Cold and Too Hot Temperatures Synergistically Increase Pesticide Toxicity.”</w:t>
+        <w:t xml:space="preserve">Steinberg, G., and S. J. Gurr. 2020.</w:t>
+      </w:r>
+      <w:r>
+        <w:t xml:space="preserve"> </w:t>
+      </w:r>
+      <w:r>
+        <w:t xml:space="preserve">“Fungi, Fungicide Discovery and Global Food Security.”</w:t>
       </w:r>
       <w:r>
         <w:t xml:space="preserve"> </w:t>
@@ -7444,43 +7469,43 @@
           <w:i/>
           <w:iCs/>
         </w:rPr>
-        <w:t xml:space="preserve">Environmental Science &amp; Technology</w:t>
-      </w:r>
-      <w:r>
-        <w:t xml:space="preserve"> </w:t>
-      </w:r>
-      <w:r>
-        <w:t xml:space="preserve">57(8): 3270–79.</w:t>
-      </w:r>
-      <w:r>
-        <w:t xml:space="preserve"> </w:t>
-      </w:r>
-      <w:hyperlink r:id="rId122">
-        <w:r>
-          <w:rPr>
-            <w:rStyle w:val="Hyperlink"/>
-          </w:rPr>
-          <w:t xml:space="preserve">https://doi.org/10.1021/acs.est.2c07567</w:t>
+        <w:t xml:space="preserve">Fungal Genetics and Biology</w:t>
+      </w:r>
+      <w:r>
+        <w:t xml:space="preserve"> </w:t>
+      </w:r>
+      <w:r>
+        <w:t xml:space="preserve">144: 103476.</w:t>
+      </w:r>
+      <w:r>
+        <w:t xml:space="preserve"> </w:t>
+      </w:r>
+      <w:hyperlink r:id="rId123">
+        <w:r>
+          <w:rPr>
+            <w:rStyle w:val="Hyperlink"/>
+          </w:rPr>
+          <w:t xml:space="preserve">https://doi.org/10.1016/j.fgb.2020.103476</w:t>
         </w:r>
       </w:hyperlink>
       <w:r>
         <w:t xml:space="preserve">.</w:t>
       </w:r>
     </w:p>
-    <w:bookmarkEnd w:id="123"/>
-    <w:bookmarkStart w:id="125" w:name="ref-wood2003"/>
+    <w:bookmarkEnd w:id="124"/>
+    <w:bookmarkStart w:id="126" w:name="ref-stephens2017"/>
     <w:p>
       <w:pPr>
         <w:pStyle w:val="Bibliography"/>
       </w:pPr>
       <w:r>
-        <w:t xml:space="preserve">Wood, P. M., and D. W. Hollomon. 2003.</w:t>
-      </w:r>
-      <w:r>
-        <w:t xml:space="preserve"> </w:t>
-      </w:r>
-      <w:r>
-        <w:t xml:space="preserve">“A Critical Evaluation of the Role of Alternative Oxidase in the Performance of Strobilurin and Related Fungicides Acting at the Qo Site of Complex III.”</w:t>
+        <w:t xml:space="preserve">Stephens, Matthew. 2017.</w:t>
+      </w:r>
+      <w:r>
+        <w:t xml:space="preserve"> </w:t>
+      </w:r>
+      <w:r>
+        <w:t xml:space="preserve">“False Discovery Rates: A New Deal.”</w:t>
       </w:r>
       <w:r>
         <w:t xml:space="preserve"> </w:t>
@@ -7490,43 +7515,43 @@
           <w:i/>
           <w:iCs/>
         </w:rPr>
-        <w:t xml:space="preserve">Pest Management Science</w:t>
-      </w:r>
-      <w:r>
-        <w:t xml:space="preserve"> </w:t>
-      </w:r>
-      <w:r>
-        <w:t xml:space="preserve">59: 499–511.</w:t>
-      </w:r>
-      <w:r>
-        <w:t xml:space="preserve"> </w:t>
-      </w:r>
-      <w:hyperlink r:id="rId124">
-        <w:r>
-          <w:rPr>
-            <w:rStyle w:val="Hyperlink"/>
-          </w:rPr>
-          <w:t xml:space="preserve">https://doi.org/10.1002/ps.655</w:t>
+        <w:t xml:space="preserve">Biostatistics</w:t>
+      </w:r>
+      <w:r>
+        <w:t xml:space="preserve"> </w:t>
+      </w:r>
+      <w:r>
+        <w:t xml:space="preserve">18 (2): 275–94.</w:t>
+      </w:r>
+      <w:r>
+        <w:t xml:space="preserve"> </w:t>
+      </w:r>
+      <w:hyperlink r:id="rId125">
+        <w:r>
+          <w:rPr>
+            <w:rStyle w:val="Hyperlink"/>
+          </w:rPr>
+          <w:t xml:space="preserve">https://doi.org/10.1093/biostatistics/kxw041</w:t>
         </w:r>
       </w:hyperlink>
       <w:r>
         <w:t xml:space="preserve">.</w:t>
       </w:r>
     </w:p>
-    <w:bookmarkEnd w:id="125"/>
-    <w:bookmarkStart w:id="127" w:name="ref-wood2006"/>
+    <w:bookmarkEnd w:id="126"/>
+    <w:bookmarkStart w:id="128" w:name="ref-torriani2015"/>
     <w:p>
       <w:pPr>
         <w:pStyle w:val="Bibliography"/>
       </w:pPr>
       <w:r>
-        <w:t xml:space="preserve">Wood, S. N. 2006.</w:t>
-      </w:r>
-      <w:r>
-        <w:t xml:space="preserve"> </w:t>
-      </w:r>
-      <w:r>
-        <w:t xml:space="preserve">“Low-Rank Scale-Invariant Tensor Product Smooths for Generalized Additive Mixed Models.”</w:t>
+        <w:t xml:space="preserve">Torriani, S. F. F., J. P. E. Melichar, C. Mills, N. Pain, H. Sierotzki, and M. Courbot. 2015.</w:t>
+      </w:r>
+      <w:r>
+        <w:t xml:space="preserve"> </w:t>
+      </w:r>
+      <w:r>
+        <w:t xml:space="preserve">“Zymoseptoria Tritici: A Major Threat to Wheat Production, Integrated Approaches to Control.”</w:t>
       </w:r>
       <w:r>
         <w:t xml:space="preserve"> </w:t>
@@ -7536,43 +7561,43 @@
           <w:i/>
           <w:iCs/>
         </w:rPr>
-        <w:t xml:space="preserve">Biometrics</w:t>
-      </w:r>
-      <w:r>
-        <w:t xml:space="preserve"> </w:t>
-      </w:r>
-      <w:r>
-        <w:t xml:space="preserve">62(4): 1025–36.</w:t>
-      </w:r>
-      <w:r>
-        <w:t xml:space="preserve"> </w:t>
-      </w:r>
-      <w:hyperlink r:id="rId126">
-        <w:r>
-          <w:rPr>
-            <w:rStyle w:val="Hyperlink"/>
-          </w:rPr>
-          <w:t xml:space="preserve">https://doi.org/10.1111/j.1541-0420.2006.00574.x</w:t>
+        <w:t xml:space="preserve">Fungal Genetics and Biology</w:t>
+      </w:r>
+      <w:r>
+        <w:t xml:space="preserve"> </w:t>
+      </w:r>
+      <w:r>
+        <w:t xml:space="preserve">79: 8–12.</w:t>
+      </w:r>
+      <w:r>
+        <w:t xml:space="preserve"> </w:t>
+      </w:r>
+      <w:hyperlink r:id="rId127">
+        <w:r>
+          <w:rPr>
+            <w:rStyle w:val="Hyperlink"/>
+          </w:rPr>
+          <w:t xml:space="preserve">https://doi.org/10.1016/j.fgb.2015.04.010</w:t>
         </w:r>
       </w:hyperlink>
       <w:r>
         <w:t xml:space="preserve">.</w:t>
       </w:r>
     </w:p>
-    <w:bookmarkEnd w:id="127"/>
-    <w:bookmarkStart w:id="129" w:name="ref-wood2011"/>
+    <w:bookmarkEnd w:id="128"/>
+    <w:bookmarkStart w:id="130" w:name="ref-vehtari2017"/>
     <w:p>
       <w:pPr>
         <w:pStyle w:val="Bibliography"/>
       </w:pPr>
       <w:r>
-        <w:t xml:space="preserve">Wood, S. N. 2011.</w:t>
-      </w:r>
-      <w:r>
-        <w:t xml:space="preserve"> </w:t>
-      </w:r>
-      <w:r>
-        <w:t xml:space="preserve">“Fast Stable Restricted Maximum Likelihood and Marginal Likelihood Estimation of Semiparametric Generalized Linear Models.”</w:t>
+        <w:t xml:space="preserve">Vehtari, A., A. Gelman, and J. Gabry. 2017.</w:t>
+      </w:r>
+      <w:r>
+        <w:t xml:space="preserve"> </w:t>
+      </w:r>
+      <w:r>
+        <w:t xml:space="preserve">“Practical Bayesian Model Evaluation Using Leave-One-Out Cross-Validation and WAIC.”</w:t>
       </w:r>
       <w:r>
         <w:t xml:space="preserve"> </w:t>
@@ -7582,18 +7607,202 @@
           <w:i/>
           <w:iCs/>
         </w:rPr>
+        <w:t xml:space="preserve">Statistics and Computing</w:t>
+      </w:r>
+      <w:r>
+        <w:t xml:space="preserve"> </w:t>
+      </w:r>
+      <w:r>
+        <w:t xml:space="preserve">27: 1413–32.</w:t>
+      </w:r>
+      <w:r>
+        <w:t xml:space="preserve"> </w:t>
+      </w:r>
+      <w:hyperlink r:id="rId129">
+        <w:r>
+          <w:rPr>
+            <w:rStyle w:val="Hyperlink"/>
+          </w:rPr>
+          <w:t xml:space="preserve">https://doi.org/10.1007/s11222-016-9696-4</w:t>
+        </w:r>
+      </w:hyperlink>
+      <w:r>
+        <w:t xml:space="preserve">.</w:t>
+      </w:r>
+    </w:p>
+    <w:bookmarkEnd w:id="130"/>
+    <w:bookmarkStart w:id="132" w:name="ref-verheyen2023"/>
+    <w:p>
+      <w:pPr>
+        <w:pStyle w:val="Bibliography"/>
+      </w:pPr>
+      <w:r>
+        <w:t xml:space="preserve">Verheyen, J., and R. Stoks. 2023.</w:t>
+      </w:r>
+      <w:r>
+        <w:t xml:space="preserve"> </w:t>
+      </w:r>
+      <w:r>
+        <w:t xml:space="preserve">“Thermal Performance Curves in a Polluted World: Too Cold and Too Hot Temperatures Synergistically Increase Pesticide Toxicity.”</w:t>
+      </w:r>
+      <w:r>
+        <w:t xml:space="preserve"> </w:t>
+      </w:r>
+      <w:r>
+        <w:rPr>
+          <w:i/>
+          <w:iCs/>
+        </w:rPr>
+        <w:t xml:space="preserve">Environmental Science &amp; Technology</w:t>
+      </w:r>
+      <w:r>
+        <w:t xml:space="preserve"> </w:t>
+      </w:r>
+      <w:r>
+        <w:t xml:space="preserve">57 (8): 3270–79.</w:t>
+      </w:r>
+      <w:r>
+        <w:t xml:space="preserve"> </w:t>
+      </w:r>
+      <w:hyperlink r:id="rId131">
+        <w:r>
+          <w:rPr>
+            <w:rStyle w:val="Hyperlink"/>
+          </w:rPr>
+          <w:t xml:space="preserve">https://doi.org/10.1021/acs.est.2c07567</w:t>
+        </w:r>
+      </w:hyperlink>
+      <w:r>
+        <w:t xml:space="preserve">.</w:t>
+      </w:r>
+    </w:p>
+    <w:bookmarkEnd w:id="132"/>
+    <w:bookmarkStart w:id="134" w:name="ref-wood2003"/>
+    <w:p>
+      <w:pPr>
+        <w:pStyle w:val="Bibliography"/>
+      </w:pPr>
+      <w:r>
+        <w:t xml:space="preserve">Wood, P. M., and D. W. Hollomon. 2003.</w:t>
+      </w:r>
+      <w:r>
+        <w:t xml:space="preserve"> </w:t>
+      </w:r>
+      <w:r>
+        <w:t xml:space="preserve">“A Critical Evaluation of the Role of Alternative Oxidase in the Performance of Strobilurin and Related Fungicides Acting at the Qo Site of Complex III.”</w:t>
+      </w:r>
+      <w:r>
+        <w:t xml:space="preserve"> </w:t>
+      </w:r>
+      <w:r>
+        <w:rPr>
+          <w:i/>
+          <w:iCs/>
+        </w:rPr>
+        <w:t xml:space="preserve">Pest Management Science</w:t>
+      </w:r>
+      <w:r>
+        <w:t xml:space="preserve"> </w:t>
+      </w:r>
+      <w:r>
+        <w:t xml:space="preserve">59: 499–511.</w:t>
+      </w:r>
+      <w:r>
+        <w:t xml:space="preserve"> </w:t>
+      </w:r>
+      <w:hyperlink r:id="rId133">
+        <w:r>
+          <w:rPr>
+            <w:rStyle w:val="Hyperlink"/>
+          </w:rPr>
+          <w:t xml:space="preserve">https://doi.org/10.1002/ps.655</w:t>
+        </w:r>
+      </w:hyperlink>
+      <w:r>
+        <w:t xml:space="preserve">.</w:t>
+      </w:r>
+    </w:p>
+    <w:bookmarkEnd w:id="134"/>
+    <w:bookmarkStart w:id="136" w:name="ref-wood2006"/>
+    <w:p>
+      <w:pPr>
+        <w:pStyle w:val="Bibliography"/>
+      </w:pPr>
+      <w:r>
+        <w:t xml:space="preserve">Wood, S. N. 2006.</w:t>
+      </w:r>
+      <w:r>
+        <w:t xml:space="preserve"> </w:t>
+      </w:r>
+      <w:r>
+        <w:t xml:space="preserve">“Low-Rank Scale-Invariant Tensor Product Smooths for Generalized Additive Mixed Models.”</w:t>
+      </w:r>
+      <w:r>
+        <w:t xml:space="preserve"> </w:t>
+      </w:r>
+      <w:r>
+        <w:rPr>
+          <w:i/>
+          <w:iCs/>
+        </w:rPr>
+        <w:t xml:space="preserve">Biometrics</w:t>
+      </w:r>
+      <w:r>
+        <w:t xml:space="preserve"> </w:t>
+      </w:r>
+      <w:r>
+        <w:t xml:space="preserve">62 (4): 1025–36.</w:t>
+      </w:r>
+      <w:r>
+        <w:t xml:space="preserve"> </w:t>
+      </w:r>
+      <w:hyperlink r:id="rId135">
+        <w:r>
+          <w:rPr>
+            <w:rStyle w:val="Hyperlink"/>
+          </w:rPr>
+          <w:t xml:space="preserve">https://doi.org/10.1111/j.1541-0420.2006.00574.x</w:t>
+        </w:r>
+      </w:hyperlink>
+      <w:r>
+        <w:t xml:space="preserve">.</w:t>
+      </w:r>
+    </w:p>
+    <w:bookmarkEnd w:id="136"/>
+    <w:bookmarkStart w:id="138" w:name="ref-wood2011"/>
+    <w:p>
+      <w:pPr>
+        <w:pStyle w:val="Bibliography"/>
+      </w:pPr>
+      <w:r>
+        <w:t xml:space="preserve">Wood, S. N. 2011.</w:t>
+      </w:r>
+      <w:r>
+        <w:t xml:space="preserve"> </w:t>
+      </w:r>
+      <w:r>
+        <w:t xml:space="preserve">“Fast Stable Restricted Maximum Likelihood and Marginal Likelihood Estimation of Semiparametric Generalized Linear Models.”</w:t>
+      </w:r>
+      <w:r>
+        <w:t xml:space="preserve"> </w:t>
+      </w:r>
+      <w:r>
+        <w:rPr>
+          <w:i/>
+          <w:iCs/>
+        </w:rPr>
         <w:t xml:space="preserve">Journal of the Royal Statistical Society: Series B (Statistical Methodology)</w:t>
       </w:r>
       <w:r>
         <w:t xml:space="preserve"> </w:t>
       </w:r>
       <w:r>
-        <w:t xml:space="preserve">73(1): 3–36.</w:t>
-      </w:r>
-      <w:r>
-        <w:t xml:space="preserve"> </w:t>
-      </w:r>
-      <w:hyperlink r:id="rId128">
+        <w:t xml:space="preserve">73 (1): 3–36.</w:t>
+      </w:r>
+      <w:r>
+        <w:t xml:space="preserve"> </w:t>
+      </w:r>
+      <w:hyperlink r:id="rId137">
         <w:r>
           <w:rPr>
             <w:rStyle w:val="Hyperlink"/>
@@ -7605,10 +7814,116 @@
         <w:t xml:space="preserve">.</w:t>
       </w:r>
     </w:p>
-    <w:bookmarkEnd w:id="129"/>
-    <w:bookmarkEnd w:id="130"/>
-    <w:bookmarkEnd w:id="131"/>
-    <w:bookmarkStart w:id="132" w:name="supplementary-materials"/>
+    <w:bookmarkEnd w:id="138"/>
+    <w:bookmarkStart w:id="140" w:name="ref-wood2017"/>
+    <w:p>
+      <w:pPr>
+        <w:pStyle w:val="Bibliography"/>
+      </w:pPr>
+      <w:r>
+        <w:t xml:space="preserve">Wood, Simon N. 2017.</w:t>
+      </w:r>
+      <w:r>
+        <w:t xml:space="preserve"> </w:t>
+      </w:r>
+      <w:r>
+        <w:rPr>
+          <w:i/>
+          <w:iCs/>
+        </w:rPr>
+        <w:t xml:space="preserve">Generalized Additive Models: An Introduction with</w:t>
+      </w:r>
+      <w:r>
+        <w:rPr>
+          <w:i/>
+          <w:iCs/>
+        </w:rPr>
+        <w:t xml:space="preserve"> </w:t>
+      </w:r>
+      <w:r>
+        <w:rPr>
+          <w:i/>
+          <w:iCs/>
+        </w:rPr>
+        <w:t xml:space="preserve">R</w:t>
+      </w:r>
+      <w:r>
+        <w:t xml:space="preserve">. 2nd ed. Chapman; Hall/CRC.</w:t>
+      </w:r>
+      <w:r>
+        <w:t xml:space="preserve"> </w:t>
+      </w:r>
+      <w:hyperlink r:id="rId139">
+        <w:r>
+          <w:rPr>
+            <w:rStyle w:val="Hyperlink"/>
+          </w:rPr>
+          <w:t xml:space="preserve">https://doi.org/10.1201/9781315370279</w:t>
+        </w:r>
+      </w:hyperlink>
+      <w:r>
+        <w:t xml:space="preserve">.</w:t>
+      </w:r>
+    </w:p>
+    <w:bookmarkEnd w:id="140"/>
+    <w:bookmarkStart w:id="142" w:name="ref-zhan2011"/>
+    <w:p>
+      <w:pPr>
+        <w:pStyle w:val="Bibliography"/>
+      </w:pPr>
+      <w:r>
+        <w:t xml:space="preserve">Zhan, Jiasui, and Bruce A. McDonald. 2011.</w:t>
+      </w:r>
+      <w:r>
+        <w:t xml:space="preserve"> </w:t>
+      </w:r>
+      <w:r>
+        <w:t xml:space="preserve">“Thermal Adaptation in the Fungal Pathogen</w:t>
+      </w:r>
+      <w:r>
+        <w:t xml:space="preserve"> </w:t>
+      </w:r>
+      <w:r>
+        <w:t xml:space="preserve">Mycosphaerella graminicola</w:t>
+      </w:r>
+      <w:r>
+        <w:t xml:space="preserve">.”</w:t>
+      </w:r>
+      <w:r>
+        <w:t xml:space="preserve"> </w:t>
+      </w:r>
+      <w:r>
+        <w:rPr>
+          <w:i/>
+          <w:iCs/>
+        </w:rPr>
+        <w:t xml:space="preserve">Molecular Ecology</w:t>
+      </w:r>
+      <w:r>
+        <w:t xml:space="preserve"> </w:t>
+      </w:r>
+      <w:r>
+        <w:t xml:space="preserve">20 (8): 1689–701.</w:t>
+      </w:r>
+      <w:r>
+        <w:t xml:space="preserve"> </w:t>
+      </w:r>
+      <w:hyperlink r:id="rId141">
+        <w:r>
+          <w:rPr>
+            <w:rStyle w:val="Hyperlink"/>
+          </w:rPr>
+          <w:t xml:space="preserve">https://doi.org/10.1111/j.1365-294X.2011.05023.x</w:t>
+        </w:r>
+      </w:hyperlink>
+      <w:r>
+        <w:t xml:space="preserve">.</w:t>
+      </w:r>
+    </w:p>
+    <w:bookmarkEnd w:id="142"/>
+    <w:bookmarkEnd w:id="143"/>
+    <w:bookmarkEnd w:id="144"/>
+    <w:bookmarkStart w:id="145" w:name="supplementary-materials"/>
     <w:p>
       <w:pPr>
         <w:pStyle w:val="Heading1"/>
@@ -7625,7 +7940,7 @@
         <w:t xml:space="preserve">Supplementary Figures S1–S14 and Supplementary Table S1 are provided in the separate Supplementary Materials document.</w:t>
       </w:r>
     </w:p>
-    <w:bookmarkEnd w:id="132"/>
+    <w:bookmarkEnd w:id="145"/>
     <w:sectPr>
       <w:footnotePr>
         <w:numRestart w:val="eachSect"/>

</xml_diff>

<commit_message>
Manuscript tidy: EC50 at 27 C as a bound, stale numbers fixed, length cut, S12 reproducible
</commit_message>
<xml_diff>
--- a/manuscript/Manuscript.docx
+++ b/manuscript/Manuscript.docx
@@ -95,7 +95,7 @@
         <w:pStyle w:val="Abstract"/>
       </w:pPr>
       <w:r>
-        <w:t xml:space="preserve">Fungicide sensitivity is typically measured at a single laboratory temperature, yet plant pathogens experience fluctuating thermal conditions that are shifting under climate change. Combining temperature-resolved dose–response physiology, RNA-seq and targeted respiratory inhibition, we show that temperature reshapes the action of the azole fungicide prothioconazole in the wheat pathogen</w:t>
+        <w:t xml:space="preserve">Fungicide sensitivity is measured at a single laboratory temperature, yet pathogens experience thermal regimes that are shifting under climate change. Combining temperature-resolved dose-response physiology, RNA-seq and targeted respiratory inhibition in the wheat pathogen</w:t>
       </w:r>
       <w:r>
         <w:t xml:space="preserve"> </w:t>
@@ -108,7 +108,7 @@
         <w:t xml:space="preserve">Zymoseptoria tritici</w:t>
       </w:r>
       <w:r>
-        <w:t xml:space="preserve">. Across seven temperatures and a full dose range, prothioconazole imposed an energetically costly stress state rather than simply arresting growth: it suppressed growth while increasing biomass-specific respiration, reducing estimated carbon-use efficiency by roughly two-thirds. The temperature–fungicide interaction reversed across the thermal optimum, shifting from synergy below it to antagonism above it, with EC₅₀ increasing at least ~4.5-fold from 15 to 27 °C. Transcriptomics provided a molecular basis for this pattern: the fungicide remodelled approximately 2,000 genes at cool and near-optimal temperatures, repressing ribosomal and respiratory-chain genes while strongly inducing the non-phosphorylating alternative oxidase (AOX), but this response contracted nearly ten-fold at 27 °C, where heat alone had already engaged many of the same programmes. To ask whether AOX contributes to performance rather than merely marking the stress state, we inhibited it pharmacologically with salicylhydroxamic acid across a dose series at 15 and 27 °C. Growth was unaffected at 15 °C but fell steeply with dose at 27 °C, a difference between temperatures of −0.017 h⁻¹ per tenfold increase in inhibitor concentration (Welch’s t on culture-level slopes, P = 0.009), indicating that the alternative respiratory route carries a measurable share of growth specifically under supra-optimal heat. Blocking it alongside the fungicide then restored the drug’s effect where heat had removed it: prothioconazole inhibited growth by 14% at 27 °C on its own and by 66% on a SHAM background, against 56% and 60% at 15 °C, so the two agents acted independently when cool and strongly together when warm. Together, these results identify thermal physiology as a determinant of fungicide potency and support incorporating temperature dependence into fungicide sensitivity testing and disease-control models as cropping environments become warmer and more thermally variable.</w:t>
+        <w:t xml:space="preserve">, we show that temperature reshapes the action of the azole prothioconazole. Across seven temperatures the fungicide suppressed growth while raising respiration, cutting carbon-use efficiency by two-thirds, and its interaction with temperature reversed across the thermal optimum, from synergy below it to antagonism above it, where potency fell at least 3.6-fold. The transcriptional response contracted nearly ten-fold at 27 °C, where heat alone had engaged the same programmes, including strong induction of the alternative oxidase. Inhibiting that oxidase cost growth only at 27 °C, and inhibiting it alongside the fungicide restored the drug’s effect there (14% to 66% inhibition) while changing nothing at 15 °C. Thermal physiology therefore determines fungicide potency, and sensitivity testing should incorporate it.</w:t>
       </w:r>
     </w:p>
     <w:bookmarkStart w:id="9" w:name="introduction"/>
@@ -865,7 +865,7 @@
         <w:pStyle w:val="BodyText"/>
       </w:pPr>
       <w:r>
-        <w:t xml:space="preserve">Respiration moved in the opposite direction: baseline ln(B₀) increased from −2.79 to −2.29 (P(positive) &gt; 0.98 for doses ≥ 0.5 mg L⁻¹; Fig. 1C,D), i.e. treated cells respired more per unit biomass even as they grew less. The consequence is a sharp loss of efficiency: modelling estimated carbon-use efficiency (CUE; derived from the fitted rates and a common cell-carbon conversion, Methods) as a Boltzmann–Arrhenius function with a shared thermal sensitivity (E = −0.40) and dose-specific intercepts, the intercept α fell from −0.86 (control) to −1.87 (4 mg L⁻¹), a roughly two-thirds reduction in predicted CUE, while the thermal sensitivity was unchanged (Fig. 1E,F). Consistent with this decline, respiration was more thermally sensitive than growth at every dose (activation energies 0.67–0.88 eV versus 0.33–0.62 eV; across-dose contrast ΔĒ_a = 0.34 eV, 95% CrI 0.21–0.48; Fig. 1G), and the size of this gap matches the magnitude of the CUE thermal sensitivity re-estimated on the log scale (|E_CUE| = 0.37, 95% CrI 0.26–0.49) — an internal consistency of the fitted rates rather than an independent test, since growth, respiration and CUE all derive from the same oxygen trajectories. No systematic dose dependence of either activation energy was resolved (all dose-versus-control contrasts crossed zero). Together, these data indicate that prothioconazole does not simply arrest growth; it induces a metabolically costly state characterised by elevated biomass-specific respiration and reduced conversion of assimilated carbon into biomass.</w:t>
+        <w:t xml:space="preserve">Respiration moved in the opposite direction: baseline ln(B₀) increased from −2.79 to −2.29 (P(positive) &gt; 0.98 for doses ≥ 0.5 mg L⁻¹; Fig. 1C,D), i.e. treated cells respired more per unit biomass even as they grew less. The consequence is a sharp loss of efficiency: modelling estimated carbon-use efficiency (CUE; derived from the fitted rates and a common cell-carbon conversion, Methods) as a Boltzmann–Arrhenius function with a shared thermal sensitivity (E = −0.40) and dose-specific intercepts, the intercept α fell from −0.86 (control) to −1.87 (4 mg L⁻¹), a roughly two-thirds reduction in predicted CUE, while the thermal sensitivity was unchanged (Fig. 1E,F). Consistent with this decline, respiration was more thermally sensitive than growth at every dose (activation energies 0.67–0.88 eV versus 0.33–0.62 eV; across-dose contrast ΔĒ_a = 0.34 eV, 95% CrI 0.21–0.48; Fig. 1G), and the size of this gap matches the magnitude of the CUE thermal sensitivity re-estimated on the log scale (|E_CUE| = 0.37, 95% CrI 0.26–0.49): an internal consistency of the fitted rates rather than an independent test, since growth, respiration and CUE all derive from the same oxygen trajectories. No systematic dose dependence of either activation energy was resolved (all dose-versus-control contrasts crossed zero). Together, these data indicate that prothioconazole does not simply arrest growth; it induces a metabolically costly state characterised by elevated biomass-specific respiration and reduced conversion of assimilated carbon into biomass.</w:t>
       </w:r>
     </w:p>
     <w:p>
@@ -953,7 +953,7 @@
         <w:t xml:space="preserve"> </w:t>
       </w:r>
       <w:r>
-        <w:t xml:space="preserve">(A) Sharpe–Schoolfield thermal performance curves for biomass-corrected growth rate across seven temperatures (15–28 °C) and eight prothioconazole doses (0–4 mg L⁻¹). Lines show posterior medians and ribbons 95% credible intervals; colours encode dose (grey, solvent control; viridis ramp, increasing dose). (B) Posterior distributions of the dose-specific baseline growth parameter ln(B₀), showing progressive suppression of growth capacity with increasing concentration. (C) Sharpe–Schoolfield thermal performance curves for biomass-corrected respiration rate. (D) Posterior distributions of dose-specific ln(B₀) for respiration, showing increased biomass-specific respiration under prothioconazole. (E) Carbon-use efficiency (CUE = P/(P + R)) modelled as a Boltzmann–Arrhenius function of temperature with a shared thermal sensitivity and dose-specific intercepts; lines show posterior medians per dose and ribbons 95% credible intervals. (F) Posterior distributions of the dose-specific CUE intercept α, showing a progressive downward shift with increasing concentration. (G) Dose-specific activation energies from the Sharpe–Schoolfield fits: paired posterior medians and 95% credible intervals for growth and respiration at each dose (within-dose pairs connected), with the across-dose summary at right — the mean respiration–growth contrast ΔĒ_a = 0.34 eV (95% CrI 0.21–0.48) alongside the CUE thermal sensitivity re-estimated on the log scale (|E_CUE| = 0.37, 95% CrI 0.26–0.49). The agreement of these two quantities is a cross-model consistency check, not an independent test, as all rates derive from the same oxygen trajectories. Bottom strip: the within-dose difference ΔE_a = E_a,resp − E_a,growth with 95% CrI (dashed line, zero); respiration was more temperature-sensitive than growth at every dose (posterior probability 0.60–1.00 across doses; ≥ 0.93 at six of eight), and no systematic dose dependence of either activation energy was resolved. Raw-data fit diagnostics are in Fig. S1 and posterior predictive checks in Fig. S2.</w:t>
+        <w:t xml:space="preserve">(A) Sharpe–Schoolfield thermal performance curves for biomass-corrected growth rate across seven temperatures (15–28 °C) and eight prothioconazole doses (0–4 mg L⁻¹). Lines show posterior medians and ribbons 95% credible intervals; colours encode dose (grey, solvent control; viridis ramp, increasing dose). (B) Posterior distributions of the dose-specific baseline growth parameter ln(B₀), showing progressive suppression of growth capacity with increasing concentration. (C) Sharpe–Schoolfield thermal performance curves for biomass-corrected respiration rate. (D) Posterior distributions of dose-specific ln(B₀) for respiration, showing increased biomass-specific respiration under prothioconazole. (E) Carbon-use efficiency (CUE = P/(P + R)) modelled as a Boltzmann–Arrhenius function of temperature with a shared thermal sensitivity and dose-specific intercepts; lines show posterior medians per dose and ribbons 95% credible intervals. (F) Posterior distributions of the dose-specific CUE intercept α, showing a progressive downward shift with increasing concentration. (G) Dose-specific activation energies from the Sharpe–Schoolfield fits: paired posterior medians and 95% credible intervals for growth and respiration at each dose (within-dose pairs connected), with the across-dose summary at right: the mean respiration–growth contrast ΔĒ_a = 0.34 eV (95% CrI 0.21–0.48) alongside the CUE thermal sensitivity re-estimated on the log scale (|E_CUE| = 0.37, 95% CrI 0.26–0.49). The agreement of these two quantities is a cross-model consistency check, not an independent test, as all rates derive from the same oxygen trajectories. Bottom strip: the within-dose difference ΔE_a = E_a,resp − E_a,growth with 95% CrI (dashed line, zero); respiration was more temperature-sensitive than growth at every dose (posterior probability 0.60–1.00 across doses; ≥ 0.93 at six of eight), and no systematic dose dependence of either activation energy was resolved. Raw-data fit diagnostics are in Fig. S1 and posterior predictive checks in Fig. S2.</w:t>
       </w:r>
     </w:p>
     <w:bookmarkEnd w:id="13"/>
@@ -971,7 +971,7 @@
         <w:pStyle w:val="FirstParagraph"/>
       </w:pPr>
       <w:r>
-        <w:t xml:space="preserve">Hill dose–response modelling revealed that fungicide potency depends strongly on temperature (Fig. 2A,B; per-temperature fits in Fig. S3; model-form sensitivity in Methods). The half-maximal effective concentration (EC₅₀) for growth was lowest, i.e. the fungus was most sensitive, at 15 °C (1.12 mg L⁻¹, pEC₅₀ = 5.49) and highest at 27 °C (5.00 mg L⁻¹, pEC₅₀ = 4.82; this fitted value lies beyond the maximum tested dose of 4 mg L⁻¹ and is therefore an extrapolation — the posterior probability that the true EC₅₀ exceeds the tested range is 0.84 at 27 °C (95% CrI 3.2–11.2 mg L⁻¹), against 0.32 at 18 °C; Fig. S9B), an estimated ~4.5-fold loss of potency at supra-optimal temperature. At 18 and 27 °C the tested concentrations did not reduce growth below half the dose-zero control (minimum relative growth 0.53 at both), so the EC₅₀ estimates at these two temperatures are extrapolations of the Hill form rather than interpolations of the measured range, and their credible intervals are correspondingly wide. At 27 °C the constraint is tighter still: every dose below 4 mg L⁻¹ left relative growth between 0.80 and 0.96, so the fitted curve is set almost entirely by the 4 mg L⁻¹ point, which comes from two vials. The factorial experiment reported below measured the same nominal concentration at this temperature in nine wells across three cultures and obtained a higher value, so the potency loss at 27 °C is more safely read as a lower bound than as the fitted 4.5-fold. Respiration responded to dose in the opposite direction, increasing log-linearly with concentration; the effect was largest at the 24 °C optimum (+27.9% per mg L⁻¹, 95% CrI 15.4–42.4; the largest of the seven temperatures in 86% of posterior draws), and the 95% credible interval excluded zero at 15, 21 and 24 °C only (Fig. 2C; per-temperature fits with data in Fig. S3).</w:t>
+        <w:t xml:space="preserve">Hill dose–response modelling revealed that fungicide potency depends strongly on temperature (Fig. 2A,B; per-temperature fits in Fig. S3; model-form sensitivity in Methods). The half-maximal effective concentration (EC₅₀) for growth was lowest, i.e. the fungus was most sensitive, at 15 °C (1.12 mg L⁻¹, pEC₅₀ = 5.49). At 27 °C no tested concentration reduced growth to half the control, so the EC₅₀ lies above the highest dose tested (4 mg L⁻¹; posterior probability 0.84; fitted median 5.0 mg L⁻¹, 95% CrI 3.2–11.2; Fig. S9B), a loss of potency of at least 3.6-fold relative to 15 °C. We report this as a bound rather than as the fitted value because every dose below 4 mg L⁻¹ left relative growth between 0.80 and 0.96 at 27 °C, so the fitted curve is set almost entirely by the 4 mg L⁻¹ point, which comes from two vials, and the factorial experiment reported below measured the same nominal concentration at 27 °C in nine wells across three cultures and found less inhibition. At 18 °C the tested range likewise did not reach half-maximal inhibition (minimum relative growth 0.53), so that EC₅₀ is also an extrapolation with a wide credible interval. Respiration responded to dose in the opposite direction, increasing log-linearly with concentration; the effect was largest at the 24 °C optimum (+27.9% per mg L⁻¹, 95% CrI 15.4–42.4; the largest of the seven temperatures in 86% of posterior draws), and the 95% credible interval excluded zero at 15, 21 and 24 °C only (Fig. 2C; per-temperature fits with data in Fig. S3).</w:t>
       </w:r>
     </w:p>
     <w:p>
@@ -987,7 +987,7 @@
         <w:pStyle w:val="BodyText"/>
       </w:pPr>
       <w:r>
-        <w:t xml:space="preserve">Because the Bliss analysis requires both a reference temperature and a multiplicative null, the interaction was also assessed independently of that formulation. Log growth rate across all 156 replicate-level observations was modelled with penalised regression splines as a separable surface,</w:t>
+        <w:t xml:space="preserve">Because the Bliss analysis requires both a reference temperature and a multiplicative null, the interaction was also assessed with neither. Log growth rate across all 156 replicate-level observations was modelled with penalised regression splines as a separable surface,</w:t>
       </w:r>
       <w:r>
         <w:t xml:space="preserve"> </w:t>
@@ -1052,7 +1052,7 @@
         </m:r>
       </m:oMath>
       <w:r>
-        <w:t xml:space="preserve">, in which temperature and dose act independently, and compared with an otherwise identical surface containing an additional pure-interaction tensor term,</w:t>
+        <w:t xml:space="preserve">, and compared with the same surface plus a pure-interaction tensor term,</w:t>
       </w:r>
       <w:r>
         <w:t xml:space="preserve"> </w:t>
@@ -1102,7 +1102,7 @@
         <w:t xml:space="preserve"> </w:t>
       </w:r>
       <w:r>
-        <w:t xml:space="preserve">(Methods). The interaction term was strongly supported (effective degrees of freedom 5.50, F = 4.62, P = 1.1 × 10⁻⁴; ΔAIC = 22.1) and improved out-of-sample prediction under exact leave-one-out cross-validation, in which both models were refitted once per held-out observation (paired difference in squared prediction error 0.0082, 95% CI 0.0019–0.0144, P = 0.011). Given no reference temperature and no multiplicative structure, the fitted surface nonetheless recovers the reversal: at the higher concentrations the interaction residual is negative at 15 °C, indicating growth lower than a non-interacting surface predicts, and positive at 27–28 °C, passing through zero in the intermediate range (Fig. S11). Two bounds apply. Support depends in part on the dimension of the spline basis, being weakest where the temperature basis is too coarse to represent a sign reversal at all (Table S1), and pointwise credible intervals on the residual surface include zero almost everywhere, so the evidence lies in the global model comparison and out-of-sample performance rather than at individual points of the surface. Within those bounds, the temperature × fungicide interaction is supported independently of the Bliss reference temperature and of the multiplicative null.</w:t>
+        <w:t xml:space="preserve">(Methods). The interaction term was strongly supported (effective degrees of freedom 5.50, F = 4.62, P = 1.1 × 10⁻⁴; ΔAIC = 22.1) and improved prediction under exact leave-one-out cross-validation (paired difference in squared prediction error 0.0082, 95% CI 0.0019–0.0144, P = 0.011). The fitted surface recovers the reversal without any reference temperature: at the higher concentrations the interaction residual is negative at 15 °C and positive at 27–28 °C, passing through zero between (Fig. S11). Support weakens where the temperature basis is too coarse to represent a sign reversal (Table S1), and pointwise intervals on the residual surface include zero almost everywhere, so the evidence lies in the global model comparison and out-of-sample performance rather than at individual points.</w:t>
       </w:r>
     </w:p>
     <w:p>
@@ -1167,7 +1167,7 @@
         <w:t xml:space="preserve"> </w:t>
       </w:r>
       <w:r>
-        <w:t xml:space="preserve">(A) Hill dose–response curves for growth at each temperature (posterior medians with 95% credible ribbons; colours encode temperature from cool blue to hot red; per-temperature panels with data in Fig. S3). (B) Temperature-specific potency (pEC₅₀, the negative log₁₀ EC₅₀ in mol L⁻¹): the fungus is most sensitive at 15 °C and least sensitive at 27 °C (the 18 and 27 °C estimates are extrapolations beyond the tested dose range; see text and Fig. S9B). (C) The prothioconazole effect on respiration, expressed as the percentage change per mg L⁻¹ from the log-linear model (posterior medians with 95% and 66% credible intervals). The effect is largest at the 24 °C optimum (+27.9% per mg L⁻¹, 95% CrI 15.4–42.4; the largest of the seven temperatures in 86% of posterior draws) and the 95% CrI excludes zero at 15, 21 and 24 °C only; the underlying per-temperature fits with data are in Fig. S3. (D) Bliss deviation Δ versus temperature for each concentration (posterior medians, 95% credible ribbons; dashed line, Bliss independence Δ = 0; the 24 °C thermal optimum is the zero-deviation reference). Negative Δ indicates synergy, positive Δ antagonism. (E) Heatmap of posterior mean Δ for each temperature × concentration combination, showing synergy at cool and antagonism at supra-optimal temperatures. Robustness to the reference choice and dose range is shown in Fig. S9.</w:t>
+        <w:t xml:space="preserve">(A) Hill dose–response curves for growth at each temperature (posterior medians with 95% credible ribbons; colours encode temperature from cool blue to hot red; per-temperature panels with data in Fig. S3). (B) Temperature-specific potency (pEC₅₀, the negative log₁₀ EC₅₀ in mol L⁻¹): the fungus is most sensitive at 15 °C and least sensitive at 27 °C (the 27 °C estimate lies above the tested dose range and is reported in the text as a bound at 4 mg L⁻¹; the 18 °C estimate is also an extrapolation; see text and Fig. S9B). (C) The prothioconazole effect on respiration, expressed as the percentage change per mg L⁻¹ from the log-linear model (posterior medians with 95% and 66% credible intervals). The effect is largest at the 24 °C optimum (+27.9% per mg L⁻¹, 95% CrI 15.4–42.4; the largest of the seven temperatures in 86% of posterior draws) and the 95% CrI excludes zero at 15, 21 and 24 °C only; the underlying per-temperature fits with data are in Fig. S3. (D) Bliss deviation Δ versus temperature for each concentration (posterior medians, 95% credible ribbons; dashed line, Bliss independence Δ = 0; the 24 °C thermal optimum is the zero-deviation reference). Negative Δ indicates synergy, positive Δ antagonism. (E) Heatmap of posterior mean Δ for each temperature × concentration combination, showing synergy at cool and antagonism at supra-optimal temperatures. Robustness to the reference choice and dose range is shown in Fig. S9.</w:t>
       </w:r>
     </w:p>
     <w:bookmarkEnd w:id="17"/>
@@ -1193,7 +1193,7 @@
         <w:pStyle w:val="BodyText"/>
       </w:pPr>
       <w:r>
-        <w:t xml:space="preserve">The prothioconazole response was large and strongly temperature-dependent. The drug significantly altered 1,922 genes at 15 °C and 2,194 at 21 °C (adjusted P &lt; 0.05, |log₂FC| ≥ 1), but only 182 at 27 °C, an approximately ten-fold contraction (Fig. 3B). A formal interaction test confirmed this temperature dependence gene by gene: 2,409 genes responded to the drug differently across temperatures (likelihood-ratio test, adjusted P &lt; 0.05), and among interaction genes contrasting 27 °C with 15 °C, 97% showed attenuation rather than amplification of the drug response. At the pathway level the interaction was likewise dominated by attenuation at 27 °C: repression of the gene-expression machinery weakened (ribosome interaction NES +3.44, FDR &lt; 10⁻⁴; spliceosome +2.72; RNA polymerase +2.38) and induction of xenobiotic/P450 detoxification also weakened (NES −2.3 and −2.1), whereas ABC-efflux induction showed no significant interaction — the component of the drug response that persists at supra-optimal temperature (Fig. S14). At the sample level, the ribosomal-module response to the drug was 0.87 ± 0.38 log₂ units weaker at 27 °C than at 15 °C (temperature × drug interaction F(2,39) = 12.3, P = 7.3 × 10⁻⁵; robust to leaving out any single sample, maximum P = 2.7 × 10⁻⁴). At the cool and near-optimal temperatures the cell mounted a clear xenobiotic-defence programme: ATP-binding-cassette efflux pumps were strongly induced (CDR1, +4.0 log₂FC; SNQ2) together with glutathione-S-transferases, whereas the drug target itself was barely affected, with CYP51/ERG11 not significantly induced at any temperature and the ergosterol pathway only mildly perturbed (Fig. S4). The magnitude of the transcriptome-wide drug response, quantified per gene, likewise contracted with warming (median |log₂FC| of drug-responsive genes falling by roughly a third at 27 °C relative to 15 °C; Fig. S5). Excluding the lowest-depth libraries did not alter these conclusions (per-gene log₂FC correlation with the full data ≥ 0.97; Methods).</w:t>
+        <w:t xml:space="preserve">The prothioconazole response was large and strongly temperature-dependent. The drug significantly altered 1,922 genes at 15 °C and 2,194 at 21 °C (adjusted P &lt; 0.05, |log₂FC| ≥ 1), but only 182 at 27 °C, an approximately ten-fold contraction (Fig. 3B). A formal interaction test confirmed this temperature dependence gene by gene: 2,409 genes responded to the drug differently across temperatures (likelihood-ratio test, adjusted P &lt; 0.05), and among interaction genes contrasting 27 °C with 15 °C, 97% showed attenuation rather than amplification of the drug response. At the pathway level the interaction was likewise dominated by attenuation at 27 °C: repression of the gene-expression machinery weakened (ribosome interaction NES +3.44, FDR &lt; 10⁻⁴; spliceosome +2.72; RNA polymerase +2.38) and induction of xenobiotic/P450 detoxification also weakened (NES −2.3 and −2.1), whereas ABC-efflux induction showed no significant interaction, the component of the drug response that persists at supra-optimal temperature (Fig. S14). At the sample level, the ribosomal-module response to the drug was 0.87 ± 0.38 log₂ units weaker at 27 °C than at 15 °C (temperature × drug interaction F(2,39) = 12.3, P = 7.3 × 10⁻⁵; robust to leaving out any single sample, maximum P = 2.7 × 10⁻⁴). At the cool and near-optimal temperatures the cell mounted a clear xenobiotic-defence programme: ATP-binding-cassette efflux pumps were strongly induced (CDR1, +4.0 log₂FC; SNQ2) together with glutathione-S-transferases, whereas the drug target itself was barely affected, with CYP51/ERG11 not significantly induced at any temperature and the ergosterol pathway only mildly perturbed (Fig. S4). The magnitude of the transcriptome-wide drug response, quantified per gene, likewise contracted with warming (median |log₂FC| of drug-responsive genes falling by roughly a third at 27 °C relative to 15 °C; Fig. S5). Excluding the lowest-depth libraries did not alter these conclusions (per-gene log₂FC correlation with the full data ≥ 0.97; Methods).</w:t>
       </w:r>
     </w:p>
     <w:p>
@@ -1258,7 +1258,7 @@
         <w:t xml:space="preserve"> </w:t>
       </w:r>
       <w:r>
-        <w:t xml:space="preserve">(A) Principal-component analysis of all RNA-seq samples (top 500 variable genes; n = 7–8 per group). Points are coloured by temperature and shaped by prothioconazole dose (circles, 0; triangles, 2 mg L⁻¹), with outline ellipses per group. (B) Volcano plots of the prothioconazole effect (log₂FC, 2 versus 0 mg L⁻¹) at 15, 21 and 27 °C, with the number of genes passing adjusted P &lt; 0.05 and |log₂FC| ≥ 1 tallied per panel (↑ up, ↓ down). Selected KEGG categories are coloured (legend). A fixed set of mechanistically central genes — the azole target CYP51/ERG11, the alternative oxidase AOX, the efflux transporter CDR1 and the ribosomal protein RPL7 — is labelled in every panel irrespective of significance (ringed points;</w:t>
+        <w:t xml:space="preserve">(A) Principal-component analysis of all RNA-seq samples (top 500 variable genes; n = 7–8 per group). Points are coloured by temperature and shaped by prothioconazole dose (circles, 0; triangles, 2 mg L⁻¹), with outline ellipses per group. (B) Volcano plots of the prothioconazole effect (log₂FC, 2 versus 0 mg L⁻¹) at 15, 21 and 27 °C, with the number of genes passing adjusted P &lt; 0.05 and |log₂FC| ≥ 1 tallied per panel (↑ up, ↓ down). Selected KEGG categories are coloured (legend). A fixed set of mechanistically central genes (the azole target CYP51/ERG11, the alternative oxidase AOX, the efflux transporter CDR1 and the ribosomal protein RPL7) is labelled in every panel irrespective of significance (ringed points;</w:t>
       </w:r>
       <w:r>
         <w:t xml:space="preserve"> </w:t>
@@ -1311,7 +1311,7 @@
         <w:pStyle w:val="FirstParagraph"/>
       </w:pPr>
       <w:r>
-        <w:t xml:space="preserve">To separate the drug response from the cell’s intrinsic thermal response, we examined temperature alone in untreated controls (Fig. 4). Warming from 15 to 21 °C, toward the thermal optimum, changed remarkably little (49 genes), whereas warming to the supra-optimal 27 °C elicited a genome-wide response of roughly 1,400 genes (Fig. 4A). At the pathway level this response fell into two regimes (Fig. 4B): from 15 to 21 °C oxidative phosphorylation, the proteasome and translation were mildly induced, consistent with ramping toward maximal growth, whereas from 21 to 27 °C the entire gene-expression machinery (ribosome, ribosome biogenesis, RNA polymerase, spliceosome) was strongly repressed, consistent with a supra-optimal heat-stress response. Classical respiration peaked near the optimum and declined at 27 °C, while the alternative oxidase was strongly induced at 27 °C (Fig. 4C), a temperature-driven shift toward non-phosphorylating respiration that mirrors the drug-induced shift in Fig. 3D. Notably, this supra-optimal response was dominated by translational shutdown rather than a classical heat-shock or chaperone induction. In contrast to this shared repression, CDR1 responded in opposite directions to the two stressors — induced by prothioconazole (Fig. 3) but repressed by warming (Fig. 4) — indicating that the drug–heat convergence documented below is a programme-level phenomenon rather than gene-by-gene identity.</w:t>
+        <w:t xml:space="preserve">To separate the drug response from the cell’s intrinsic thermal response, we examined temperature alone in untreated controls (Fig. 4). Warming from 15 to 21 °C, toward the thermal optimum, changed remarkably little (49 genes), whereas warming to the supra-optimal 27 °C elicited a genome-wide response of roughly 1,400 genes (Fig. 4A). At the pathway level this response fell into two regimes (Fig. 4B): from 15 to 21 °C oxidative phosphorylation, the proteasome and translation were mildly induced, consistent with ramping toward maximal growth, whereas from 21 to 27 °C the entire gene-expression machinery (ribosome, ribosome biogenesis, RNA polymerase, spliceosome) was strongly repressed, consistent with a supra-optimal heat-stress response. Classical respiration peaked near the optimum and declined at 27 °C, while the alternative oxidase was strongly induced at 27 °C (Fig. 4C), a temperature-driven shift toward non-phosphorylating respiration that mirrors the drug-induced shift in Fig. 3D. Notably, this supra-optimal response was dominated by translational shutdown rather than a classical heat-shock or chaperone induction. In contrast to this shared repression, CDR1 responded in opposite directions to the two stressors, induced by prothioconazole (Fig. 3) but repressed by warming (Fig. 4), indicating that the drug–heat convergence documented below is a programme-level phenomenon rather than gene-by-gene identity.</w:t>
       </w:r>
     </w:p>
     <w:p>
@@ -1370,7 +1370,7 @@
           <w:b/>
           <w:bCs/>
         </w:rPr>
-        <w:t xml:space="preserve">Figure 4. Temperature alone reshapes the transcriptome in two regimes — limited toward the thermal optimum and extensive above it.</w:t>
+        <w:t xml:space="preserve">Figure 4. Temperature alone reshapes the transcriptome in two regimes: limited toward the thermal optimum and extensive above it.</w:t>
       </w:r>
       <w:r>
         <w:t xml:space="preserve"> </w:t>
@@ -1410,7 +1410,7 @@
         <w:pStyle w:val="BodyText"/>
       </w:pPr>
       <w:r>
-        <w:t xml:space="preserve">Drug-induced repression of the ribosomal regulon was strongly temperature-dependent (sample-level interaction above), such that at 27 °C — where heat alone had already down-shifted the translational machinery (Fig. 4) — the drug removed substantially less residual ribosomal expression. These observations are consistent with a translation-capacity hypothesis for the loss of potency at supra-optimal temperature, in which the drug’s growth effect is limited by how much translational capacity remains to be repressed; testing this causally requires perturbation experiments. As a complementary, direction-level view of the same convergence, projecting the untreated 27 °C transcriptome onto the fixed drug-response direction indicated a displacement of the control state toward the drug-responsive state (cos = 0.45, ≈ 20% of the total heat shift; sample bootstrap 95% CI 0.27–0.56; robust to removing the top 1–5% of contributing genes, cos 0.44–0.41; Methods). This displacement was directionally consistent but did not exceed a correlation-preserving sample-label permutation null at α = 0.05 (P = 0.096) and is reported descriptively. Together these results provide a mechanistic hypothesis for the Bliss interaction (Fig. 2D,E): because prothioconazole and temperature converge on the same machinery, their effects compound below the thermal optimum, whereas at supra-optimal temperature heat has already repressed that machinery, leaving little for the fungicide to act upon.</w:t>
+        <w:t xml:space="preserve">Drug-induced repression of the ribosomal regulon was strongly temperature-dependent (sample-level interaction above), such that at 27 °C, where heat alone had already down-shifted the translational machinery (Fig. 4), the drug removed substantially less residual ribosomal expression. These observations are consistent with a translation-capacity hypothesis for the loss of potency at supra-optimal temperature, in which the drug’s growth effect is limited by how much translational capacity remains to be repressed; testing this causally requires perturbation experiments. Projecting the untreated 27 °C transcriptome onto the fixed drug-response direction gave the same picture: heat alone displaced the control state toward the drug-responsive state (cos = 0.45, about 20% of the total heat shift; bootstrap 95% CI 0.27–0.56), although this did not exceed a sample-label permutation null (P = 0.096) and is reported descriptively (Methods). Together these results provide a mechanistic hypothesis for the Bliss interaction (Fig. 2D,E): because prothioconazole and temperature converge on the same machinery, their effects compound below the thermal optimum, whereas at supra-optimal temperature heat has already repressed that machinery, leaving little for the fungicide to act upon.</w:t>
       </w:r>
     </w:p>
     <w:p>
@@ -1493,7 +1493,7 @@
         <w:pStyle w:val="FirstParagraph"/>
       </w:pPr>
       <w:r>
-        <w:t xml:space="preserve">The transcriptional data identify AOX as a marker of the low-CUE state, but they cannot say whether the enzyme contributes to performance or merely accompanies it. If AOX carries an appreciable share of respiratory electron flow specifically at supra-optimal temperature, then removing that branch should cost the cell growth at 27 °C and little or nothing at 15 °C. SHAM is not selective for the alternative oxidase, so this is a test of the prediction rather than of AOX alone; we return to that below. We tested this directly with salicylhydroxamic acid (SHAM), the standard pharmacological inhibitor of alternative oxidase, applied as a five-point dose series (0.0125–0.2 mM) to three independent cultures at each of 15 and 27 °C, with growth rates estimated from dissolved oxygen using the same model and fitting procedure as throughout (Fig. 6a; Methods).</w:t>
+        <w:t xml:space="preserve">The transcriptional data identify AOX as a marker of the low-CUE state, but they cannot say whether the enzyme contributes to performance or merely accompanies it. If AOX carries an appreciable share of respiratory electron flow specifically at supra-optimal temperature, then removing that branch should cost the cell growth at 27 °C and little or nothing at 15 °C. We tested this with salicylhydroxamic acid (SHAM), the standard pharmacological inhibitor of alternative oxidase, applied as a five-point dose series (0.0125–0.2 mM) to three independent cultures at each of 15 and 27 °C, with growth rates estimated from dissolved oxygen using the same model and fitting procedure as throughout (Fig. 6a; Methods). SHAM also inhibits other enzymes, so this is a test of the prediction rather than of AOX alone. In this strain, however, its action falls on the alternative route: with cytochrome oxidase blocked by 0.5 mM azide, 1 mM SHAM returned the residual oxygen consumption to the cell-free background in all three plates (paired t on plate means, P = 0.012; Fig. 6c).</w:t>
       </w:r>
     </w:p>
     <w:p>
@@ -1501,7 +1501,7 @@
         <w:pStyle w:val="BodyText"/>
       </w:pPr>
       <w:r>
-        <w:t xml:space="preserve">The two temperatures responded in opposite directions (Fig. 6a). Within each culture we regressed growth rate on log₁₀ SHAM concentration and treated the three resulting slopes as replicates, so that the comparison is made at the level of the biological replicate rather than the well. At 15 °C the slope was slightly positive and not distinguishable from zero (mean +0.0038 h⁻¹ per tenfold increase in dose, n = 3 cultures, P = 0.14), and the concentrations tested produced no ordered response of any kind, so no dose dependence was detected at 15 °C over the range tested. At 27 °C every culture declined (mean −0.0132 h⁻¹ per tenfold, P = 0.037), with growth at the highest retained dose falling to about 60% of the untreated rate. The difference between temperatures was −0.0170 h⁻¹ per tenfold, with a 95% confidence interval of −0.0263 to −0.0077 that excludes zero across its whole width (Welch’s t on the six culture-level slopes, P = 0.009; Fig. 6b). The unequal-variance test is required because the slope variance at 27 °C exceeded that at 15 °C roughly threefold. That excess variance is not a property of one plate: the solvent controls scatter far more at 27 °C than at 15 °C on the SHAM plate (coefficient of variation 30% against 1%) and independently on the n-propyl gallate plate (58% against 5%), so supra-optimal cultures are genuinely more variable between biological replicates. Growth rate is estimated from the curvature of the oxygen decline, so a trace that is effectively linear carries no growth signal however well the model fits it; four curves, all at 27 °C and all at 0.1 mM or above, fall in that regime and are marked as open symbols in Fig. 6a.</w:t>
+        <w:t xml:space="preserve">The two temperatures responded in opposite directions (Fig. 6a). Within each culture we regressed growth rate on log₁₀ SHAM concentration and treated the three resulting slopes as replicates, so that the comparison is made at the level of the biological replicate rather than the well. At 15 °C the slope was not distinguishable from zero (mean +0.0038 h⁻¹ per tenfold increase in dose, n = 3 cultures, P = 0.14) and the doses produced no ordered response. At 27 °C every culture declined (mean −0.0132 h⁻¹ per tenfold, P = 0.037), with growth at 0.2 mM about 60% of the untreated rate. The difference between temperatures was −0.0170 h⁻¹ per tenfold (95% CI −0.0263 to −0.0077; Welch’s t on the six culture-level slopes, P = 0.009; Fig. 6b). The unequal-variance test is required because the slope variance at 27 °C exceeded that at 15 °C roughly threefold, and that excess is a property of supra-optimal cultures rather than of one plate: the solvent controls scattered far more at 27 °C than at 15 °C on the SHAM plate (coefficient of variation 30% against 1%) and independently on the n-propyl gallate plate (58% against 5%). Growth rate is identified from the curvature of the oxygen decline, so a trace that is effectively linear carries no growth signal however well the model fits it; one curve (27 °C, 0.1 mM) falls in that regime and is drawn open in Fig. 6a.</w:t>
       </w:r>
     </w:p>
     <w:p>
@@ -1509,7 +1509,7 @@
         <w:pStyle w:val="BodyText"/>
       </w:pPr>
       <w:r>
-        <w:t xml:space="preserve">Because estimated rates depend on the interval of the oxygen trace over which the model is fitted, the analysis was repeated under seven alternative rules, four fixed absolute windows and three anchored to fixed fractions of each trace’s oxygen drawdown; the 27 °C slope was steeper than the 15 °C slope under every one of them, with the temperature difference ranging from −0.011 to −0.023 h⁻¹ per tenfold against −0.0170 for the hand-selected windows reported above (Fig. S12). The 27 °C plate also carries a periodic component of incubator origin that is common to every well (Fig. S16); the primary analysis removes it with a 12 h moving average on the 27 °C curves, and refitting the same intervals with no smoothing at all gives a temperature contrast of −0.0218 h⁻¹ per tenfold (P = 0.019) against −0.0185 with smoothing (P = 0.017), so the contrast is not a product of that noise and not a product of removing it either. The highest dose tested (0.35 mM) was excluded because at 27 °C all three wells consumed too little oxygen for a rate to be identifiable at all; the exclusion is made on estimability grounds and is conservative, since those wells lie in the direction of the reported effect. A planned specificity check with a second, chemically unrelated alternative-oxidase inhibitor did not resolve the question. The complementary experiment with n-propyl gallate (nPG; maximum concentration 0.1 mM, set by the solubility of the ethanol master stock) yielded an imprecise temperature contrast in growth-rate dose-response slopes (27 °C minus 15 °C: +0.0009 h⁻¹ per tenfold concentration increase; 95% CI −0.0452 to +0.0470; two-sided Welch’s t test, P = 0.96), compatible with both zero and the estimated SHAM contrast and therefore inconclusive regarding temperature-dependent inhibitor sensitivity (Fig. S15). No consistent dose response was present at either temperature: the cultures disagreed in sign at both, and at each temperature the mean slope was set by a single divergent culture, excluding which leaves +0.00006 h⁻¹ per tenfold at 15 °C and +0.0031 at 27 °C. This contrasts with SHAM, where all three cultures declined at 27 °C and none did at 15 °C. Because target engagement was not measured for either compound, the two concentration ranges cannot be equated as degrees of AOX inhibition. Four features of the design bound the inference. The two temperatures were run as separate plates in dedicated incubators, so temperature is confounded with plate and run; dose is assigned to plate column, so a within-plate positional gradient would enter the dose axis, although the solvent controls argue against one, scattering as much when column is held fixed (nPG plate) as when it varies (SHAM plate). SHAM is not selective for the alternative oxidase. And no fungicide was present in either inhibitor experiment, so they speak to the contribution of the alternative route to growth under supra-optimal heat, not to its mediation of the drug–temperature interaction.</w:t>
+        <w:t xml:space="preserve">The result does not depend on analytical choices. Refitting every well under seven alternative interval rules, four fixed windows and three anchored to each trace’s own oxygen drawdown, left the 27 °C slope steeper than the 15 °C slope under every rule, with the temperature difference ranging from −0.011 to −0.023 h⁻¹ per tenfold (Fig. S12). The 27 °C plate carries a periodic component of incubator origin that is common to every well (Fig. S16); the primary analysis removes it with a moving average on the 27 °C curves, and fitting the same intervals with no smoothing gives −0.0218 h⁻¹ per tenfold (P = 0.019) and with a uniform 12 h average −0.0185 (P = 0.017), so the contrast is produced neither by that noise nor by its removal. The highest dose tested (0.35 mM) was excluded because at 27 °C all three wells consumed too little oxygen for a rate to be identifiable; the exclusion is conservative, since those wells lie in the direction of the effect. A planned check with a second inhibitor, n-propyl gallate, was inconclusive: solubility limited its range to 0.1 mM and the temperature contrast in slopes was +0.0009 h⁻¹ per tenfold (95% CI −0.0452 to +0.0470, P = 0.96), compatible with zero and with the SHAM contrast alike (Fig. S15). Two constraints on this experiment are taken up in the Discussion: each temperature was run as one plate in a dedicated incubator, so temperature is confounded with plate and run, and no fungicide was present, so the experiment speaks to the alternative route’s contribution to growth under heat rather than to its role in the drug interaction.</w:t>
       </w:r>
     </w:p>
     <w:p>
@@ -1517,7 +1517,7 @@
         <w:pStyle w:val="BodyText"/>
       </w:pPr>
       <w:r>
-        <w:t xml:space="preserve">Neither inhibitor experiment contained the fungicide, so they establish a contribution of the alternative route to growth under heat rather than a role in the drug interaction itself. We therefore ran the two agents together. Three independent cultures were split between 15 and 27 °C on the same day, and each plate carried the vehicle, SHAM at 0.2 mM, prothioconazole at 2 and 4 mg L⁻¹, and the two combinations, with 0.4% DMSO and 0.2% ethanol throughout and two cell-free wells per plate. The two nominal fungicide concentrations produced indistinguishable inhibition at both temperatures, as expected once exposure saturates, so 2 mg L⁻¹ is reported as the primary arm and 4 mg L⁻¹ as a secondary one. The 4 mg L⁻¹ wells were in fact marginally less inhibited than the 2 mg L⁻¹ wells at both temperatures, and at 27 °C they left growth at 0.92 of the vehicle where the dose-response experiment estimated 0.53. That earlier estimate rests on two vials, the only cell in that design with fewer than three, and it is the sole point on the 27 °C dose-response curve at which measurable inhibition occurred, so it determines the shape of that curve. Both estimates are consistent with exposure saturating below 4 mg L⁻¹, and the EC₅₀ reported for 27 °C should be read as a lower bound on the loss of potency rather than as a point estimate. Because every quantity is referenced to the vehicle on the same plate, the comparison is insensitive to differences in absolute rate between culture batches.</w:t>
+        <w:t xml:space="preserve">We therefore ran the two agents together. Three independent cultures were each split between a 15 °C and a 27 °C plate on the same day, and every plate carried the vehicle, SHAM at 0.2 mM, prothioconazole at 2 and 4 mg L⁻¹ and the two combinations, with 0.4% DMSO and 0.2% ethanol throughout and two cell-free wells per plate. Because every quantity is referenced to the vehicle on the same plate, the comparison is insensitive to differences in absolute rate between culture batches. The two nominal fungicide concentrations produced indistinguishable inhibition at both temperatures, as expected once exposure saturates, so 2 mg L⁻¹ is reported as the primary arm and 4 mg L⁻¹ as a secondary one. At 27 °C the 4 mg L⁻¹ wells left growth at 0.92 of the vehicle where the dose-response experiment had estimated 0.53 from two vials; both values are consistent with exposure saturating below 4 mg L⁻¹, which is why the 27 °C EC₅₀ above is reported as a bound.</w:t>
       </w:r>
     </w:p>
     <w:p>
@@ -1525,7 +1525,7 @@
         <w:pStyle w:val="BodyText"/>
       </w:pPr>
       <w:r>
-        <w:t xml:space="preserve">The single agents behaved as the earlier experiments predict. SHAM alone left growth at 0.90, 1.01 and 0.99 of the vehicle at 15 °C and reduced it to 0.70, 0.67 and 0.72 at 27 °C, reproducing the temperature selectivity of Fig. 6a on independent cultures. The drug-alone arms also reproduce the dose-response model out of sample: the Hill fits of Fig. 2 predict relative growth of 0.431 at 15 °C and 0.859 at 27 °C at 2 mg L⁻¹, and these independent cultures gave 0.437 and 0.865. The same model predicts 0.353 and 0.608 at 4 mg L⁻¹, which these cultures did not reproduce, for the reasons set out below.</w:t>
+        <w:t xml:space="preserve">The single agents behaved as the earlier experiments predict. SHAM alone left growth at 0.90, 1.01 and 0.99 of the vehicle at 15 °C and reduced it to 0.70, 0.67 and 0.72 at 27 °C, reproducing the temperature selectivity of Fig. 6a on independent cultures. The drug-alone arms reproduced the dose-response model out of sample: the Hill fits of Fig. 2 predict relative growth of 0.431 at 15 °C and 0.859 at 27 °C at 2 mg L⁻¹, and these cultures gave 0.437 and 0.865. The same model predicts 0.353 and 0.608 at 4 mg L⁻¹, which the saturated exposure did not reproduce.</w:t>
       </w:r>
     </w:p>
     <w:p>
@@ -1533,7 +1533,7 @@
         <w:pStyle w:val="BodyText"/>
       </w:pPr>
       <w:r>
-        <w:t xml:space="preserve">The clearest way to read the combination is as the effect of the fungicide measured against its own background, that is relative to the vehicle when it is given alone and relative to SHAM when it is given with SHAM. At 15 °C the drug inhibited growth by 56% alone and by 60% on a SHAM background, so blocking the alternative oxidase changed nothing. At 27 °C it inhibited by 14% alone and by 66% on a SHAM background. Blocking the alternative oxidase therefore restored the fungicide at 27 °C to an effect slightly larger than it achieves at 15 °C, where it works best. The same pattern holds at 4 mg L⁻¹, 51% against 59% at 15 °C and 8% against 68% at 27 °C. The combination is where the two temperatures part company (Fig. 6d,e). If the two agents acted independently on log growth rate, the combination should leave the product of the two single-agent fractions. At 15 °C that is what happened, with observed values of 0.35, 0.37 and 0.45 against predictions of 0.38, 0.47 and 0.42. At 27 °C the combination fell far below independence, to 0.24, 0.29 and 0.18 against predictions of 0.61, 0.63 and 0.57, so adding SHAM made the fungicide roughly two and a half times more inhibitory than independent action allows.</w:t>
+        <w:t xml:space="preserve">The clearest way to read the combination is as the effect of the fungicide measured against its own background, that is relative to the vehicle when given alone and relative to SHAM when given with SHAM. At 15 °C the drug inhibited growth by 56% alone and by 60% on a SHAM background, so blocking the alternative oxidase changed nothing. At 27 °C it inhibited by 14% alone and by 66% on a SHAM background: blocking the alternative oxidase restored the fungicide at 27 °C to an effect slightly larger than it achieves at 15 °C, where it works best. The same pattern holds at 4 mg L⁻¹ (51% against 59% at 15 °C; 8% against 68% at 27 °C). The combination is where the two temperatures part company (Fig. 6d,e). If the two agents acted independently on log growth rate, the combination should leave the product of the two single-agent fractions. At 15 °C that is what happened, with observed values of 0.35, 0.37 and 0.45 against predictions of 0.38, 0.47 and 0.42. At 27 °C the combination fell far below independence, to 0.24, 0.29 and 0.18 against predictions of 0.61, 0.63 and 0.57, so adding SHAM made the fungicide roughly two and a half times more inhibitory than independent action allows.</w:t>
       </w:r>
     </w:p>
     <w:p>
@@ -1651,7 +1651,7 @@
         <w:t xml:space="preserve">I</w:t>
       </w:r>
       <w:r>
-        <w:t xml:space="preserve">₁₅ was −0.88 (95% CI −1.76 to 0.00, P = 0.050) at 2 mg L⁻¹ and −0.98 (P = 0.16) at 4 mg L⁻¹, with all three cultures negative at both concentrations. The contrast is constructed so that every term is measured on the same plate and the drug and drug-plus-SHAM wells occupy the same plate columns, so a plate-level offset or a positional gradient cancels. With three cultures the difference is estimated imprecisely, and its interval reaches zero at 2 mg L⁻¹; the direction, however, was the same in every culture and at both concentrations, and refitting all 132 curves under eleven alternative interval rules that make no reference to the result left the contrast negative under eight of them, including every rule whose intervals span 30 h or more (Fig. S19). Because the growth rate is identified from the curvature of the oxygen decline, and a moving average attenuates curvature most in the fastest wells, the denoising applied to the 27 °C traces could in principle generate a negative contrast on its own. It does not: holding the intervals fixed and varying the moving average from none to 12 h moves</w:t>
+        <w:t xml:space="preserve">₁₅ was −0.88 (95% CI −1.76 to 0.00, P = 0.050) at 2 mg L⁻¹ and −0.98 (P = 0.16) at 4 mg L⁻¹, with all three cultures negative at both concentrations. The contrast is constructed so that every term is measured on the same plate and the drug and drug-plus-SHAM wells occupy the same plate columns, so a plate-level offset or a positional gradient cancels. With three cultures the difference is estimated imprecisely and its interval reaches zero at 2 mg L⁻¹; the direction, however, was the same in every culture and at both concentrations, and refitting all 132 curves under eleven alternative interval rules that make no reference to the result left the contrast negative under eight of them, including every rule whose intervals span 30 h or more (Fig. S19). Because a moving average attenuates curvature most in the fastest wells, the denoising applied to the 27 °C traces could in principle generate a negative contrast on its own. It does not: holding the intervals fixed and varying the moving average from none to 12 h moves</w:t>
       </w:r>
       <w:r>
         <w:t xml:space="preserve"> </w:t>
@@ -1664,7 +1664,7 @@
         <w:t xml:space="preserve">I</w:t>
       </w:r>
       <w:r>
-        <w:t xml:space="preserve">₂₇ from −1.12 to −0.96, so the effect is largest when no smoothing is applied at all and the reported analysis is the most conservative of those tested, and applying the same 12 h average to the 15 °C traces leaves</w:t>
+        <w:t xml:space="preserve">₂₇ from −1.12 to −0.96, so the reported analysis is the most conservative of those tested, and applying the same 12 h average to the 15 °C traces leaves</w:t>
       </w:r>
       <w:r>
         <w:t xml:space="preserve"> </w:t>
@@ -1752,7 +1752,7 @@
         <w:t xml:space="preserve">a</w:t>
       </w:r>
       <w:r>
-        <w:t xml:space="preserve">) Growth rate against SHAM concentration at 15 °C (blue circles) and 27 °C (red triangles), with the solvent controls shown separately at left (ctrl). Faint points are the three independent cultures and thin lines their within-culture regressions; symbols and bars are the mean ± s.d. across cultures and thick lines the mean of the three culture-level slopes. Dashed horizontal lines mark the solvent-control mean at each temperature. Open symbols mark concentrations at which the oxygen trace was indistinguishable from a straight line, so the growth rate is not identifiable there (the curved model improves on a linear fit by less than 0.005 in R²); these points are retained in all analyses but should not be read as precise. n = 3 cultures per concentration per temperature. (</w:t>
+        <w:t xml:space="preserve">) Growth rate against SHAM concentration at 15 °C (blue circles) and 27 °C (red triangles), with the solvent controls shown separately at left (ctrl). Faint points are the three independent cultures and thin lines their within-culture regressions; symbols and bars are the mean ± s.d. across cultures and thick lines the mean of the three culture-level slopes. Dashed horizontal lines mark the solvent-control mean at each temperature. Open symbols mark curves whose oxygen trace was indistinguishable from a straight line, so the growth rate is not identifiable there (the curved model improves on a linear fit by less than 0.005 in R²); such points are retained in all analyses but should not be read as precise. n = 3 cultures per concentration per temperature. (</w:t>
       </w:r>
       <w:r>
         <w:rPr>
@@ -1990,7 +1990,7 @@
         <w:t xml:space="preserve"> </w:t>
       </w:r>
       <w:r>
-        <w:t xml:space="preserve">from the prothioconazole × SHAM factorial; these are separate culture batches, so every quantity is expressed relative to the control or vehicle on its own plate and absolute rates are not compared between the two halves. Fitting intervals for every curve were set in the interactive trim-selection tool and are listed in tables/aox/sham/manual_fit_windows.csv and tables/aox/ptc_sham/manual_fit_windows.csv; robustness of the factorial result to the choice of interval is in Fig. S19 and of the SHAM result in Fig. S12. All traces are shown in Figs S16 (SHAM), S17 (azide) and S18 (factorial).</w:t>
+        <w:t xml:space="preserve">from the prothioconazole × SHAM factorial; these are separate culture batches, so every quantity is expressed relative to the control or vehicle on its own plate and absolute rates are not compared between the two halves. Fitting intervals for every curve were set with the interactive trim-selection tool and are deposited with the analysis code (Methods); robustness of the factorial result to the choice of interval is in Fig. S19 and of the SHAM result in Fig. S12. All traces are shown in Figs S16 (SHAM), S17 (azide) and S18 (factorial).</w:t>
       </w:r>
     </w:p>
     <w:bookmarkEnd w:id="34"/>
@@ -2025,7 +2025,7 @@
         <w:t xml:space="preserve"> </w:t>
       </w:r>
       <w:r>
-        <w:t xml:space="preserve">but an active determinant of it. Prothioconazole drives cells into a costly, energetically inefficient stress state (repression of growth-associated programmes, reduced canonical respiratory investment, induction of the alternative oxidase, and metabolic reorganisation consistent with increased maintenance and storage allocation) that provides a coherent account of reduced growth, elevated respiration and reduced carbon-use efficiency. An overlapping programme is engaged by supra-optimal temperature, and where heat has already activated it, prothioconazole produces a reduced incremental effect. This offers a coherent molecular account of the temperature-dependent efficacy seen physiologically: synergy under cool conditions and antagonism under supra-optimal heat. Critically, inhibiting the alternative oxidase pharmacologically cost the fungus growth at supra-optimal temperature but not in the cool range, showing that the respiratory route engaged in the heat-associated state is not merely a transcriptional marker of it, but carries a measurable share of performance in exactly the thermal regime where the interaction reverses.</w:t>
+        <w:t xml:space="preserve">but an active determinant of it. Prothioconazole drives cells into a costly, energetically inefficient stress state (repression of growth-associated programmes, reduced canonical respiratory investment, induction of the alternative oxidase, and metabolic reorganisation consistent with increased maintenance and storage allocation) that provides a coherent account of reduced growth, elevated respiration and reduced carbon-use efficiency. An overlapping programme is engaged by supra-optimal temperature, and where heat has already activated it, prothioconazole produces a reduced incremental effect. This offers a coherent molecular account of the temperature-dependent efficacy seen physiologically: synergy under cool conditions and antagonism under supra-optimal heat. Critically, inhibiting the alternative oxidase pharmacologically cost the fungus growth at supra-optimal temperature but not in the cool range, and inhibiting it alongside the fungicide restored the drug’s effect at 27 °C while leaving it unchanged at 15 °C: the respiratory route engaged in the heat-associated state is not merely a transcriptional marker of it, but carries a measurable share of performance, and shields the fungus from the drug, in exactly the thermal regime where the interaction reverses.</w:t>
       </w:r>
     </w:p>
     <w:p>
@@ -2053,7 +2053,7 @@
         <w:t xml:space="preserve">)</w:t>
       </w:r>
       <w:r>
-        <w:t xml:space="preserve">. It is also an established modulator of fungicide sensitivity: by bypassing the cytochrome bc1 complex, AOX can sustain respiration when quinone-outside inhibitor (QoI/strobilurin) fungicides inhibit the canonical chain, including in</w:t>
+        <w:t xml:space="preserve">, and an established modulator of fungicide sensitivity: by bypassing the cytochrome bc1 complex it sustains respiration when quinone-outside inhibitor (QoI/strobilurin) fungicides block the canonical chain, including in</w:t>
       </w:r>
       <w:r>
         <w:t xml:space="preserve"> </w:t>
@@ -2097,7 +2097,7 @@
         <w:t xml:space="preserve">)</w:t>
       </w:r>
       <w:r>
-        <w:t xml:space="preserve">. Our results extend the relevance of AOX beyond respiratory-targeting fungicides by showing strong AOX induction during exposure to an azole that acts primarily on sterol biosynthesis. This induction could reconcile the otherwise paradoxical pairing of increased respiration with decreased growth and CUE: oxygen consumption can increase through a non-phosphorylating route without a corresponding increase in biomass production. Pharmacological inhibition puts this on a causal footing at one end of the thermal range. SHAM had no measurable effect on growth at 15 °C at any dose up to 0.2 mM, but suppressed growth steeply, and in every culture, at 27 °C: the temperature at which AOX transcript abundance is highest and the physiology least efficient. The reading we favour is that in the cool range the cytochrome route carries essentially all respiratory flux, so removing the alternative branch costs nothing, whereas at supra-optimal temperature an appreciable share of flux passes through AOX and its removal is paid for in growth. This is a functional result rather than a transcriptional correlation, and it is the one direct intervention in the study, but its limits are substantial. The SHAM response is consistent with an AOX contribution to growth at supra-optimal temperature, yet it does not establish AOX dependence, because SHAM also inhibits other enzymes including peroxidases and lipoxygenases; the complementary n-propyl gallate experiment was inconclusive at the precision achieved and did not resolve that specificity limitation. Temperature was confounded with plate and run in both inhibitor dose-response experiments. That both prothioconazole and heat induce AOX suggests that it forms part of a broader stress programme and may contribute to cross-protection, whereby prior exposure to one stress alters tolerance to another</w:t>
+        <w:t xml:space="preserve">. Our results extend its relevance beyond respiratory-targeting fungicides by showing strong AOX induction during exposure to an azole that acts on sterol biosynthesis. This induction reconciles the otherwise paradoxical pairing of increased respiration with decreased growth and CUE: oxygen consumption can rise through a non-phosphorylating route without a matching rise in biomass. Pharmacological inhibition puts this on a functional footing. SHAM had no measurable effect on growth at 15 °C at any dose up to 0.2 mM but suppressed growth steeply, and in every culture, at 27 °C, the temperature at which AOX transcript abundance is highest and the physiology least efficient. The reading we favour is that in the cool range the cytochrome route carries essentially all respiratory flux, so removing the alternative branch costs nothing, whereas at supra-optimal temperature an appreciable share passes through AOX and its removal is paid for in growth. That both prothioconazole and heat induce AOX suggests it forms part of a broader stress programme that may contribute to cross-protection, whereby exposure to one stress alters tolerance to another</w:t>
       </w:r>
       <w:r>
         <w:t xml:space="preserve"> </w:t>
@@ -2117,7 +2117,15 @@
         <w:t xml:space="preserve">)</w:t>
       </w:r>
       <w:r>
-        <w:t xml:space="preserve">. A cell already shifted toward this state under heat stress may experience a smaller incremental metabolic impact when exposed to prothioconazole; the drug–warming overlap is, moreover, transcriptome-wide, with AOX itself contributing only ~0.1% of the shared-programme convergence signal (Methods), so AOX is best read as one functional component of a much broader shared response rather than its sole mediator. The factorial experiment was designed to test exactly that prediction: if AOX activity is what blunts the drug at 27 °C, then blocking it should restore potency there and leave it unchanged at 15 °C. That is what we observed. Adding SHAM to prothioconazole left growth where independent action predicts at 15 °C and drove it far below that prediction at 27 °C, in all three cultures and at both nominal concentrations, giving a within-culture difference in the interaction contrast of −0.88 at 2 mg L⁻¹. The interpretation we favour is that at supra-optimal temperature a share of respiratory flux runs through the alternative route, which the fungicide does not touch, and that removing that route reinstates the cost of the drug. Three qualifications stand. The specificity limit carries over from the dose-response experiments, because the intervention is again pharmacological and SHAM is not selective, although the azide result places SHAM’s action on the azide-resistant component of respiration rather than on respiration in general. With three cultures the contrast is imprecise and its confidence interval reaches zero. And the factorial used cultures carried for several generations from the same stock, which grew faster than those behind the dose-response and transcriptomic experiments, so absolute potency is not comparable across experiments even though the interaction, referenced to the vehicle on each plate, is unaffected by that difference. Independent replication of the temperature manipulation, and a genetic rather than pharmacological block on AOX, remain the tests that would settle the mechanism.</w:t>
+        <w:t xml:space="preserve">. The drug–warming overlap is transcriptome-wide, with AOX itself contributing only ~0.1% of the convergence signal (Methods), so AOX is one functional component of a much broader shared response rather than its sole mediator.</w:t>
+      </w:r>
+    </w:p>
+    <w:p>
+      <w:pPr>
+        <w:pStyle w:val="BodyText"/>
+      </w:pPr>
+      <w:r>
+        <w:t xml:space="preserve">The factorial experiment tested the prediction that follows: if AOX activity is what blunts the drug at 27 °C, then blocking it should restore potency there and change nothing at 15 °C. That is what we observed. Adding SHAM to prothioconazole left growth where independent action predicts at 15 °C and drove it far below that prediction at 27 °C, in all three cultures and at both nominal concentrations, a within-culture difference in the interaction contrast of −0.88 at 2 mg L⁻¹. Our interpretation is that at supra-optimal temperature a share of respiratory flux runs through the alternative route, which the fungicide does not touch, and that removing that route reinstates the cost of the drug. Three qualifications stand. SHAM is not selective for the alternative oxidase, so the attribution to AOX rests on the prediction being specific to that branch and on the azide result, which places SHAM’s action on the azide-resistant component of respiration; the n-propyl gallate experiment was too imprecise to add independent support. In the inhibitor dose-response experiments each temperature was a single plate in a dedicated incubator, so temperature was confounded with run, although the factorial reproduced the SHAM selectivity on new cultures split between temperatures on the same day. And with three cultures the interaction contrast is imprecise and its confidence interval reaches zero, although its direction was the same in every culture, at both concentrations and under most fitting rules. The factorial cultures also grew faster than those behind the dose-response and transcriptomic experiments, so absolute potency is not comparable across experiments even though the interaction, referenced to the vehicle on each plate, is unaffected by that difference. A genetic rather than pharmacological block on AOX remains the test that would settle the mechanism.</w:t>
       </w:r>
     </w:p>
     <w:p>
@@ -2211,7 +2219,7 @@
         <w:t xml:space="preserve"> </w:t>
       </w:r>
       <w:r>
-        <w:t xml:space="preserve">declined approximately 4.5-fold from 15 °C to 27 °C, and the transcriptional response to prothioconazole was strongly attenuated at 27 °C. Because fungicide sensitivity is routinely assayed at a single near-optimal temperature, standard testing may overestimate activity whenever infections or treated populations experience supra-optimal temperatures. As cropping climates warm and pathogen distributions shift polewards</w:t>
+        <w:t xml:space="preserve">declined at least 3.6-fold from 15 °C to 27 °C. Because fungicide sensitivity is routinely assayed at a single near-optimal temperature, standard testing may overestimate activity whenever infections or treated populations experience supra-optimal temperatures, and both thermal regimes identified here fall within the range that European wheat crops experience during the fungicide-application window, so the sign of the interaction is not fixed across the conditions under which chemical control is applied. As cropping climates warm and pathogen distributions shift polewards</w:t>
       </w:r>
       <w:r>
         <w:t xml:space="preserve"> </w:t>
@@ -2231,7 +2239,7 @@
         <w:t xml:space="preserve">)</w:t>
       </w:r>
       <w:r>
-        <w:t xml:space="preserve">, this temperature dependence could become increasingly relevant to field efficacy. Both thermal regimes identified here fall within the range that European wheat crops experience during the fungicide-application window, so the sign of the interaction is not fixed across the conditions under which chemical control is actually applied. Temperature-resolved efficacy testing, and disease models that treat fungicide performance as temperature-dependent, are therefore warranted. The antagonism we observe is not explained by CYP51 transcriptional up-regulation, suggesting an environmentally mediated route to reduced control that conventional resistance monitoring could miss: this loss of potency is distinct from heritable resistance, yet single-temperature sensitivity assays could confound or overlook the distinction. Resistance to single-site fungicides, including azoles, has repeatedly evolved in</w:t>
+        <w:t xml:space="preserve">, temperature-resolved efficacy testing, and disease models that treat fungicide performance as temperature-dependent, are warranted. The antagonism we observe is not explained by CYP51 up-regulation, so it is an environmentally mediated loss of control distinct from heritable resistance, which single-temperature sensitivity assays could confound with it. Resistance to azoles has repeatedly evolved in</w:t>
       </w:r>
       <w:r>
         <w:t xml:space="preserve"> </w:t>
@@ -2247,12 +2255,6 @@
         <w:t xml:space="preserve"> </w:t>
       </w:r>
       <w:r>
-        <w:t xml:space="preserve">and remains central to resistance management</w:t>
-      </w:r>
-      <w:r>
-        <w:t xml:space="preserve"> </w:t>
-      </w:r>
-      <w:r>
         <w:t xml:space="preserve">(</w:t>
       </w:r>
       <w:hyperlink w:anchor="ref-lucas2015">
@@ -2267,7 +2269,10 @@
         <w:t xml:space="preserve">)</w:t>
       </w:r>
       <w:r>
-        <w:t xml:space="preserve">, and shifting azole sensitivity has already been linked to reduced field performance across Europe</w:t>
+        <w:t xml:space="preserve"> </w:t>
+      </w:r>
+      <w:r>
+        <w:t xml:space="preserve">and shifting sensitivity has already been linked to reduced field performance across Europe</w:t>
       </w:r>
       <w:r>
         <w:t xml:space="preserve"> </w:t>
@@ -2287,7 +2292,7 @@
         <w:t xml:space="preserve">)</w:t>
       </w:r>
       <w:r>
-        <w:t xml:space="preserve">; our results add an orthogonal environmental axis of variation in efficacy that can arise without detectable target-overexpression compensation.</w:t>
+        <w:t xml:space="preserve">; our results add an orthogonal, environmental axis of variation in efficacy.</w:t>
       </w:r>
     </w:p>
     <w:p>
@@ -2295,7 +2300,7 @@
         <w:pStyle w:val="BodyText"/>
       </w:pPr>
       <w:r>
-        <w:t xml:space="preserve">Several limitations temper these conclusions. The transcriptome–physiology link is correlative; further functional tests (sterol profiling, efflux assays, and AOX perturbation in the presence of the fungicide) are needed to establish causality. Consistent with this, a ribosome-expression model calibrated on the untreated conditions alone did not quantitatively predict growth under the drug (overpredicting it at 15 °C), so translational capacity indexes, but does not by itself quantitatively determine, the growth response. The RNA-seq sampled a single dose at three temperatures, and a fraction of the prothioconazole-responsive genes are uncharacterised</w:t>
+        <w:t xml:space="preserve">Several limitations temper these conclusions. The transcriptome–physiology link is correlative, and a ribosome-expression model calibrated on the untreated conditions alone did not quantitatively predict growth under the drug (overpredicting it at 15 °C), so translational capacity indexes, but does not by itself determine, the growth response; sterol profiling and efflux assays would complete the causal picture. The RNA-seq sampled a single dose at three temperatures, and a fraction of the prothioconazole-responsive genes are uncharacterised</w:t>
       </w:r>
       <w:r>
         <w:t xml:space="preserve"> </w:t>
@@ -2311,7 +2316,7 @@
         <w:t xml:space="preserve"> </w:t>
       </w:r>
       <w:r>
-        <w:t xml:space="preserve">genes whose roles remain unknown and provide candidates for follow-up. RNA yield varied among treatments, but normalisation and sensitivity analyses indicated that this did not drive the main conclusions. The inhibitor experiment carries its own constraints. SHAM is not selective for the alternative oxidase, so the growth cost at 27 °C is attributable to that branch only in so far as no comparably heat-dependent secondary target is involved. The two temperatures were run as separate plates in separate incubators, so a run effect cannot be formally excluded, although a run effect reproducing a dose-dependent decline in all three cultures at one temperature and not the other would be unusual. The effect was measured with no fungicide present, so it establishes a contribution of the alternative route to growth under heat rather than a role in the drug interaction itself. With three cultures per temperature the slopes are imprecisely estimated, so the magnitude of the difference should be treated as provisional, even though its direction was reproduced under every fitting rule tested; the fitting-rule analysis addresses sensitivity to interval selection, not independent replication of the temperature manipulation. Because each temperature was run as a single plate, the three cultures replicate the biological response within a run rather than replicating the temperature treatment itself, and a plate-specific distortion of the dose response would not be separable from a temperature effect; establishing the contrast causally would require independent runs with temperature assignments crossed between incubators and dose positions balanced. Two design constraints also warrant note: each temperature was maintained in a dedicated incubator, so temperature and incubator effects cannot be formally separated (the smooth, unimodal response across seven temperatures and the concordance of physiology, transcriptomics and modelling argue against a simple incubator artefact, but do not exclude it), and because cultures were harvested at a comparable physiological stage rather than a fixed clock time, elapsed culture age co-varied with temperature. Intracellular prothioconazole and its desthio metabolite were not quantified, so temperature-dependent changes in uptake, metabolism or effective intracellular exposure cannot be separated from changes in cellular sensitivity. Finally, results from a single isolate under controlled conditions require validation across genetic backgrounds and in planta, where host physiology, fluctuating temperature and the latent phase of infection may modulate the interaction.</w:t>
+        <w:t xml:space="preserve">genes whose roles remain unknown and provide candidates for follow-up. RNA yield varied among treatments, but normalisation and sensitivity analyses indicated that this did not drive the main conclusions. Throughout, each temperature was maintained in a dedicated incubator, so temperature and incubator effects cannot be formally separated; the smooth, unimodal response across seven temperatures and the concordance of physiology, transcriptomics and inhibitor results argue against an incubator artefact but do not exclude it, and because cultures were harvested at a comparable physiological stage rather than a fixed clock time, elapsed culture age co-varied with temperature. Intracellular prothioconazole and its desthio metabolite were not quantified, so temperature-dependent changes in uptake, metabolism or effective intracellular exposure cannot be separated from changes in cellular sensitivity. Finally, results from a single isolate under controlled conditions require validation across genetic backgrounds and in planta, where host physiology, fluctuating temperature and the latent phase of infection may modulate the interaction.</w:t>
       </w:r>
     </w:p>
     <w:bookmarkEnd w:id="36"/>
@@ -3412,7 +3417,7 @@
         <w:t xml:space="preserve"> </w:t>
       </w:r>
       <w:r>
-        <w:t xml:space="preserve">estimated per temperature, yielding temperature-specific EC₅₀; potency is also reported as pEC₅₀, the negative base-10 logarithm of the EC₅₀ expressed in mol L⁻¹ (converted from mg L⁻¹ using the prothioconazole molar mass of 344.26 g mol⁻¹); respiration dose–response was modelled by log-linear regression, and the dose effect is reported as the percentage change per mg L⁻¹, 100 × (exp(β_T) − 1), from the temperature-specific posterior slopes. Because the fitted EC₅₀ exceeds the tested dose range at some temperatures, the posterior probability P(EC₅₀ &gt; 4 mg L⁻¹) was computed per temperature from the Hill posterior draws as an explicit extrapolation diagnostic. The anomalously flat respiration dose response at 26 °C was checked by an observation-level jackknife of the ordinary-least-squares slope (no sign changes across all 23 single-observation deletions; maximum leverage 0.27), so it is not driven by a single influential vial. Carbon-use efficiency was modelled as a Boltzmann–Arrhenius function with a shared thermal sensitivity E and dose-specific intercepts. All rate models used a Gaussian likelihood with weakly informative priors. For the Sharpe–Schoolfield model the activation energy was given</w:t>
+        <w:t xml:space="preserve">estimated per temperature, yielding temperature-specific EC₅₀; potency is also reported as pEC₅₀, the negative base-10 logarithm of the EC₅₀ expressed in mol L⁻¹ (converted from mg L⁻¹ using the prothioconazole molar mass of 344.26 g mol⁻¹); respiration dose–response was modelled by log-linear regression, and the dose effect is reported as the percentage change per mg L⁻¹, 100 × (exp(β_T) − 1), from the temperature-specific posterior slopes. Because the fitted EC₅₀ exceeds the tested dose range at some temperatures, the posterior probability P(EC₅₀ &gt; 4 mg L⁻¹) was computed per temperature from the Hill posterior draws as an explicit extrapolation diagnostic; where that probability was high (27 °C), the EC₅₀ is reported in the text as a bound at the highest tested concentration rather than as the fitted value, and the fold change in potency as a minimum. The anomalously flat respiration dose response at 26 °C was checked by an observation-level jackknife of the ordinary-least-squares slope (no sign changes across all 23 single-observation deletions; maximum leverage 0.27), so it is not driven by a single influential vial. Carbon-use efficiency was modelled as a Boltzmann–Arrhenius function with a shared thermal sensitivity E and dose-specific intercepts. All rate models used a Gaussian likelihood with weakly informative priors. For the Sharpe–Schoolfield model the activation energy was given</w:t>
       </w:r>
       <w:r>
         <w:t xml:space="preserve"> </w:t>
@@ -5464,7 +5469,7 @@
         <w:pStyle w:val="BodyText"/>
       </w:pPr>
       <w:r>
-        <w:t xml:space="preserve">The contribution of the alternative oxidase to growth was tested pharmacologically with salicylhydroxamic acid (SHAM), prepared as a 250 mM master stock in absolute ethanol and diluted in ethanol to working stocks at 500× the intended final dose, so that 10 µL added to each 5 mL vial gave final concentrations of 0.0125, 0.025, 0.05, 0.1, 0.2 and 0.35 mM at a constant 0.2% (v/v) ethanol in every vial, solvent controls included. Three independent cultures were grown as described above, harvested in exponential phase, adjusted to a common starting density and dispensed into PreSens SensorDish vials; one plate was run per temperature (15 and 27 °C), with cultures assigned to rows and doses to columns. Dissolved oxygen was logged for 68.6 h and growth rates were estimated with the same oxygen-consumption model, fitting-interval selection and quality criteria used throughout. The 0.35 mM dose was excluded from analysis because at 27 °C all three wells consumed too little oxygen for the model to return an identifiable rate; this exclusion is made on estimability grounds and is conservative with respect to the contrast reported, since the excluded wells lie in the direction of the reported effect.</w:t>
+        <w:t xml:space="preserve">The contribution of the alternative oxidase to growth was tested pharmacologically with salicylhydroxamic acid (SHAM), prepared as a 250 mM master stock in absolute ethanol and diluted in ethanol to working stocks at 500× the intended final dose, so that 10 µL added to each 5 mL vial gave final concentrations of 0.0125, 0.025, 0.05, 0.1, 0.2 and 0.35 mM at a constant 0.2% (v/v) ethanol in every vial, solvent controls included. Three independent cultures were grown as described above, harvested in exponential phase, adjusted to a common starting density and dispensed into PreSens SensorDish vials; one plate was run per temperature (15 and 27 °C), with cultures assigned to rows and doses to columns. Dissolved oxygen was logged for 68.6 h and growth rates were estimated with the same oxygen-consumption model, fitting-interval selection and quality criteria used throughout; the 27 °C traces, which carry a periodic component of incubator origin (Fig. S16), were smoothed with a centred moving average (12 h, or 4 h where the component was weaker) before fitting, and the sensitivity of the result to this step is reported in Results. The 0.35 mM dose was excluded from analysis because at 27 °C all three wells consumed too little oxygen for the model to return an identifiable rate; this exclusion is made on estimability grounds and is conservative with respect to the contrast reported, since the excluded wells lie in the direction of the reported effect.</w:t>
       </w:r>
     </w:p>
     <w:p>
@@ -5480,7 +5485,7 @@
         <w:pStyle w:val="BodyText"/>
       </w:pPr>
       <w:r>
-        <w:t xml:space="preserve">Because dose varies within culture, the dose response was analysed at the level of the biological replicate. Within each culture the estimated growth rate was regressed on log₁₀ SHAM concentration across the five retained doses, and the three resulting slopes were treated as independent observations at each temperature; a one-sample t test against zero was used within each temperature, and the two temperatures were compared with Welch’s unequal-variance t test on the six culture-level slopes. The unequal-variance form is required because the variance of the slopes at 27 °C exceeded that at 15 °C roughly threefold. Sensitivity to the choice of fitting interval was assessed by repeating the whole analysis under seven alternative window rules: four fixed absolute windows and three anchored to fixed fractions of each trace’s oxygen drawdown (Fig. S12). A parallel plate set was run with n-propyl gallate (0.0125 to 0.1 mM in ethanol), an alternative-oxidase inhibitor of a different chemotype, over a dose range reaching only 0.1 mM; those traces have not been through the same manual fitting-interval selection and are not reported here. Two features of the design constrain interpretation and are carried into the Discussion: each temperature was run as a single plate in a dedicated incubator, so temperature is confounded with plate and run, and SHAM is not selective for the alternative oxidase.</w:t>
+        <w:t xml:space="preserve">Because dose varies within culture, the dose response was analysed at the level of the biological replicate. Within each culture the estimated growth rate was regressed on log₁₀ SHAM concentration across the five retained doses, and the three resulting slopes were treated as independent observations at each temperature; a one-sample t test against zero was used within each temperature, and the two temperatures were compared with Welch’s unequal-variance t test on the six culture-level slopes. The unequal-variance form is required because the variance of the slopes at 27 °C exceeded that at 15 °C roughly threefold. Sensitivity to the choice of fitting interval was assessed by repeating the whole analysis under seven alternative window rules: four fixed absolute windows and three anchored to fixed fractions of each trace’s oxygen drawdown (Fig. S12). A parallel plate set was run with n-propyl gallate (0.0125 to 0.1 mM in ethanol, the range set by the solubility of the master stock), an alternative-oxidase inhibitor of a different chemotype, and analysed identically (Fig. S15). Each temperature was run as a single plate in a dedicated incubator, so temperature is confounded with plate and run in these two experiments.</w:t>
       </w:r>
     </w:p>
     <w:p>
@@ -7937,7 +7942,7 @@
         <w:pStyle w:val="FirstParagraph"/>
       </w:pPr>
       <w:r>
-        <w:t xml:space="preserve">Supplementary Figures S1–S14 and Supplementary Table S1 are provided in the separate Supplementary Materials document.</w:t>
+        <w:t xml:space="preserve">Supplementary Figures S1–S20 and Supplementary Tables S1 and S2 are provided in the separate Supplementary Materials document.</w:t>
       </w:r>
     </w:p>
     <w:bookmarkEnd w:id="145"/>

</xml_diff>